<commit_message>
feat: setup twilio and integrate for voice call to employee
</commit_message>
<xml_diff>
--- a/knowledge/data_karyawan.docx
+++ b/knowledge/data_karyawan.docx
@@ -1,6 +1,6 @@
 
 <file path=word/document.xml><?xml version="1.0" encoding="utf-8"?>
-<w:document xmlns:wpc="http://schemas.microsoft.com/office/word/2010/wordprocessingCanvas" xmlns:cx="http://schemas.microsoft.com/office/drawing/2014/chartex" xmlns:cx1="http://schemas.microsoft.com/office/drawing/2015/9/8/chartex" xmlns:cx2="http://schemas.microsoft.com/office/drawing/2015/10/21/chartex" xmlns:cx3="http://schemas.microsoft.com/office/drawing/2016/5/9/chartex" xmlns:cx4="http://schemas.microsoft.com/office/drawing/2016/5/10/chartex" xmlns:cx5="http://schemas.microsoft.com/office/drawing/2016/5/11/chartex" xmlns:cx6="http://schemas.microsoft.com/office/drawing/2016/5/12/chartex" xmlns:cx7="http://schemas.microsoft.com/office/drawing/2016/5/13/chartex" xmlns:cx8="http://schemas.microsoft.com/office/drawing/2016/5/14/chartex" xmlns:mc="http://schemas.openxmlformats.org/markup-compatibility/2006" xmlns:aink="http://schemas.microsoft.com/office/drawing/2016/ink" xmlns:am3d="http://schemas.microsoft.com/office/drawing/2017/model3d" xmlns:o="urn:schemas-microsoft-com:office:office" xmlns:oel="http://schemas.microsoft.com/office/2019/extlst" xmlns:r="http://schemas.openxmlformats.org/officeDocument/2006/relationships" xmlns:m="http://schemas.openxmlformats.org/officeDocument/2006/math" xmlns:v="urn:schemas-microsoft-com:vml" xmlns:wp14="http://schemas.microsoft.com/office/word/2010/wordprocessingDrawing" xmlns:wp="http://schemas.openxmlformats.org/drawingml/2006/wordprocessingDrawing" xmlns:w10="urn:schemas-microsoft-com:office:word" xmlns:w="http://schemas.openxmlformats.org/wordprocessingml/2006/main" xmlns:w14="http://schemas.microsoft.com/office/word/2010/wordml" xmlns:w15="http://schemas.microsoft.com/office/word/2012/wordml" xmlns:w16cex="http://schemas.microsoft.com/office/word/2018/wordml/cex" xmlns:w16cid="http://schemas.microsoft.com/office/word/2016/wordml/cid" xmlns:w16="http://schemas.microsoft.com/office/word/2018/wordml" xmlns:w16du="http://schemas.microsoft.com/office/word/2023/wordml/word16du" xmlns:w16sdtdh="http://schemas.microsoft.com/office/word/2020/wordml/sdtdatahash" xmlns:w16sdtfl="http://schemas.microsoft.com/office/word/2024/wordml/sdtformatlock" xmlns:w16se="http://schemas.microsoft.com/office/word/2015/wordml/symex" xmlns:wpg="http://schemas.microsoft.com/office/word/2010/wordprocessingGroup" xmlns:wpi="http://schemas.microsoft.com/office/word/2010/wordprocessingInk" xmlns:wne="http://schemas.microsoft.com/office/word/2006/wordml" xmlns:wps="http://schemas.microsoft.com/office/word/2010/wordprocessingShape" mc:Ignorable="w14 w15 w16se w16cid w16 w16cex w16sdtdh w16sdtfl w16du wp14">
+<w:document xmlns:wpc="http://schemas.microsoft.com/office/word/2010/wordprocessingCanvas" xmlns:mc="http://schemas.openxmlformats.org/markup-compatibility/2006" xmlns:o="urn:schemas-microsoft-com:office:office" xmlns:r="http://schemas.openxmlformats.org/officeDocument/2006/relationships" xmlns:m="http://schemas.openxmlformats.org/officeDocument/2006/math" xmlns:v="urn:schemas-microsoft-com:vml" xmlns:wp14="http://schemas.microsoft.com/office/word/2010/wordprocessingDrawing" xmlns:wp="http://schemas.openxmlformats.org/drawingml/2006/wordprocessingDrawing" xmlns:w10="urn:schemas-microsoft-com:office:word" xmlns:w="http://schemas.openxmlformats.org/wordprocessingml/2006/main" xmlns:w14="http://schemas.microsoft.com/office/word/2010/wordml" xmlns:w15="http://schemas.microsoft.com/office/word/2012/wordml" xmlns:wpg="http://schemas.microsoft.com/office/word/2010/wordprocessingGroup" xmlns:wpi="http://schemas.microsoft.com/office/word/2010/wordprocessingInk" xmlns:wne="http://schemas.microsoft.com/office/word/2006/wordml" xmlns:wps="http://schemas.microsoft.com/office/word/2010/wordprocessingShape" mc:Ignorable="w14 w15 wp14">
   <w:body>
     <w:p>
       <w:pPr>
@@ -51,16 +51,80 @@
           <w:sz w:val="20"/>
           <w:szCs w:val="20"/>
         </w:rPr>
-        <w:t>Per 15 April 2025  •  Total Karyawan: 15  •  Divisi: 6</w:t>
+        <w:t xml:space="preserve">Per 15 April </w:t>
+      </w:r>
+      <w:proofErr w:type="gramStart"/>
+      <w:r>
+        <w:rPr>
+          <w:color w:val="888888"/>
+          <w:sz w:val="20"/>
+          <w:szCs w:val="20"/>
+        </w:rPr>
+        <w:t>2025  •</w:t>
+      </w:r>
+      <w:proofErr w:type="gramEnd"/>
+      <w:r>
+        <w:rPr>
+          <w:color w:val="888888"/>
+          <w:sz w:val="20"/>
+          <w:szCs w:val="20"/>
+        </w:rPr>
+        <w:t xml:space="preserve">  Total </w:t>
+      </w:r>
+      <w:proofErr w:type="spellStart"/>
+      <w:r>
+        <w:rPr>
+          <w:color w:val="888888"/>
+          <w:sz w:val="20"/>
+          <w:szCs w:val="20"/>
+        </w:rPr>
+        <w:t>Karyawan</w:t>
+      </w:r>
+      <w:proofErr w:type="spellEnd"/>
+      <w:r>
+        <w:rPr>
+          <w:color w:val="888888"/>
+          <w:sz w:val="20"/>
+          <w:szCs w:val="20"/>
+        </w:rPr>
+        <w:t xml:space="preserve">: 15  •  </w:t>
+      </w:r>
+      <w:proofErr w:type="spellStart"/>
+      <w:r>
+        <w:rPr>
+          <w:color w:val="888888"/>
+          <w:sz w:val="20"/>
+          <w:szCs w:val="20"/>
+        </w:rPr>
+        <w:t>Divisi</w:t>
+      </w:r>
+      <w:proofErr w:type="spellEnd"/>
+      <w:r>
+        <w:rPr>
+          <w:color w:val="888888"/>
+          <w:sz w:val="20"/>
+          <w:szCs w:val="20"/>
+        </w:rPr>
+        <w:t>: 6</w:t>
       </w:r>
     </w:p>
     <w:p>
       <w:pPr>
         <w:pStyle w:val="Heading2"/>
       </w:pPr>
+      <w:proofErr w:type="spellStart"/>
       <w:r>
-        <w:t>Daftar Karyawan</w:t>
+        <w:t>Daftar</w:t>
       </w:r>
+      <w:proofErr w:type="spellEnd"/>
+      <w:r>
+        <w:t xml:space="preserve"> </w:t>
+      </w:r>
+      <w:proofErr w:type="spellStart"/>
+      <w:r>
+        <w:t>Karyawan</w:t>
+      </w:r>
+      <w:proofErr w:type="spellEnd"/>
     </w:p>
     <w:tbl>
       <w:tblPr>
@@ -80,14 +144,14 @@
         <w:tblLook w:val="0000" w:firstRow="0" w:lastRow="0" w:firstColumn="0" w:lastColumn="0" w:noHBand="0" w:noVBand="0"/>
       </w:tblPr>
       <w:tblGrid>
-        <w:gridCol w:w="581"/>
-        <w:gridCol w:w="1503"/>
-        <w:gridCol w:w="1559"/>
-        <w:gridCol w:w="1602"/>
+        <w:gridCol w:w="577"/>
+        <w:gridCol w:w="1485"/>
+        <w:gridCol w:w="1532"/>
+        <w:gridCol w:w="1565"/>
         <w:gridCol w:w="2902"/>
-        <w:gridCol w:w="1376"/>
-        <w:gridCol w:w="1383"/>
-        <w:gridCol w:w="863"/>
+        <w:gridCol w:w="1491"/>
+        <w:gridCol w:w="1361"/>
+        <w:gridCol w:w="856"/>
         <w:gridCol w:w="1191"/>
       </w:tblGrid>
       <w:tr>
@@ -158,8 +222,20 @@
                 <w:sz w:val="18"/>
                 <w:szCs w:val="18"/>
               </w:rPr>
-              <w:t>Nama Lengkap</w:t>
-            </w:r>
+              <w:t xml:space="preserve">Nama </w:t>
+            </w:r>
+            <w:proofErr w:type="spellStart"/>
+            <w:r>
+              <w:rPr>
+                <w:b/>
+                <w:bCs/>
+                <w:color w:val="FFFFFF"/>
+                <w:sz w:val="18"/>
+                <w:szCs w:val="18"/>
+              </w:rPr>
+              <w:t>Lengkap</w:t>
+            </w:r>
+            <w:proofErr w:type="spellEnd"/>
           </w:p>
         </w:tc>
         <w:tc>
@@ -184,6 +260,7 @@
             <w:pPr>
               <w:jc w:val="center"/>
             </w:pPr>
+            <w:proofErr w:type="spellStart"/>
             <w:r>
               <w:rPr>
                 <w:b/>
@@ -194,6 +271,7 @@
               </w:rPr>
               <w:t>Departemen</w:t>
             </w:r>
+            <w:proofErr w:type="spellEnd"/>
           </w:p>
         </w:tc>
         <w:tc>
@@ -218,6 +296,7 @@
             <w:pPr>
               <w:jc w:val="center"/>
             </w:pPr>
+            <w:proofErr w:type="spellStart"/>
             <w:r>
               <w:rPr>
                 <w:b/>
@@ -228,6 +307,7 @@
               </w:rPr>
               <w:t>Jabatan</w:t>
             </w:r>
+            <w:proofErr w:type="spellEnd"/>
           </w:p>
         </w:tc>
         <w:tc>
@@ -294,8 +374,20 @@
                 <w:sz w:val="18"/>
                 <w:szCs w:val="18"/>
               </w:rPr>
-              <w:t>No. Telepon</w:t>
-            </w:r>
+              <w:t xml:space="preserve">No. </w:t>
+            </w:r>
+            <w:proofErr w:type="spellStart"/>
+            <w:r>
+              <w:rPr>
+                <w:b/>
+                <w:bCs/>
+                <w:color w:val="FFFFFF"/>
+                <w:sz w:val="18"/>
+                <w:szCs w:val="18"/>
+              </w:rPr>
+              <w:t>Telepon</w:t>
+            </w:r>
+            <w:proofErr w:type="spellEnd"/>
           </w:p>
         </w:tc>
         <w:tc>
@@ -320,6 +412,7 @@
             <w:pPr>
               <w:jc w:val="center"/>
             </w:pPr>
+            <w:proofErr w:type="spellStart"/>
             <w:r>
               <w:rPr>
                 <w:b/>
@@ -330,6 +423,7 @@
               </w:rPr>
               <w:t>Lokasi</w:t>
             </w:r>
+            <w:proofErr w:type="spellEnd"/>
           </w:p>
         </w:tc>
         <w:tc>
@@ -388,6 +482,7 @@
             <w:pPr>
               <w:jc w:val="center"/>
             </w:pPr>
+            <w:proofErr w:type="spellStart"/>
             <w:r>
               <w:rPr>
                 <w:b/>
@@ -396,8 +491,31 @@
                 <w:sz w:val="18"/>
                 <w:szCs w:val="18"/>
               </w:rPr>
-              <w:t>Tgl. Bergabung</w:t>
-            </w:r>
+              <w:t>Tgl</w:t>
+            </w:r>
+            <w:proofErr w:type="spellEnd"/>
+            <w:r>
+              <w:rPr>
+                <w:b/>
+                <w:bCs/>
+                <w:color w:val="FFFFFF"/>
+                <w:sz w:val="18"/>
+                <w:szCs w:val="18"/>
+              </w:rPr>
+              <w:t xml:space="preserve">. </w:t>
+            </w:r>
+            <w:proofErr w:type="spellStart"/>
+            <w:r>
+              <w:rPr>
+                <w:b/>
+                <w:bCs/>
+                <w:color w:val="FFFFFF"/>
+                <w:sz w:val="18"/>
+                <w:szCs w:val="18"/>
+              </w:rPr>
+              <w:t>Bergabung</w:t>
+            </w:r>
+            <w:proofErr w:type="spellEnd"/>
           </w:p>
         </w:tc>
       </w:tr>
@@ -461,8 +579,20 @@
                 <w:sz w:val="18"/>
                 <w:szCs w:val="18"/>
               </w:rPr>
-              <w:t>Budi Santoso</w:t>
-            </w:r>
+              <w:t xml:space="preserve">Budi </w:t>
+            </w:r>
+            <w:proofErr w:type="spellStart"/>
+            <w:r>
+              <w:rPr>
+                <w:b/>
+                <w:bCs/>
+                <w:color w:val="333333"/>
+                <w:sz w:val="18"/>
+                <w:szCs w:val="18"/>
+              </w:rPr>
+              <w:t>Santoso</w:t>
+            </w:r>
+            <w:proofErr w:type="spellEnd"/>
           </w:p>
         </w:tc>
         <w:tc>
@@ -484,14 +614,34 @@
             <w:vAlign w:val="center"/>
           </w:tcPr>
           <w:p>
-            <w:r>
-              <w:rPr>
-                <w:color w:val="333333"/>
-                <w:sz w:val="18"/>
-                <w:szCs w:val="18"/>
-              </w:rPr>
-              <w:t>Teknologi Informasi</w:t>
-            </w:r>
+            <w:proofErr w:type="spellStart"/>
+            <w:r>
+              <w:rPr>
+                <w:color w:val="333333"/>
+                <w:sz w:val="18"/>
+                <w:szCs w:val="18"/>
+              </w:rPr>
+              <w:t>Teknologi</w:t>
+            </w:r>
+            <w:proofErr w:type="spellEnd"/>
+            <w:r>
+              <w:rPr>
+                <w:color w:val="333333"/>
+                <w:sz w:val="18"/>
+                <w:szCs w:val="18"/>
+              </w:rPr>
+              <w:t xml:space="preserve"> </w:t>
+            </w:r>
+            <w:proofErr w:type="spellStart"/>
+            <w:r>
+              <w:rPr>
+                <w:color w:val="333333"/>
+                <w:sz w:val="18"/>
+                <w:szCs w:val="18"/>
+              </w:rPr>
+              <w:t>Informasi</w:t>
+            </w:r>
+            <w:proofErr w:type="spellEnd"/>
           </w:p>
         </w:tc>
         <w:tc>
@@ -632,6 +782,7 @@
             <w:pPr>
               <w:jc w:val="center"/>
             </w:pPr>
+            <w:proofErr w:type="spellStart"/>
             <w:r>
               <w:rPr>
                 <w:b/>
@@ -642,6 +793,7 @@
               </w:rPr>
               <w:t>Aktif</w:t>
             </w:r>
+            <w:proofErr w:type="spellEnd"/>
           </w:p>
         </w:tc>
         <w:tc>
@@ -729,16 +881,40 @@
             <w:vAlign w:val="center"/>
           </w:tcPr>
           <w:p>
-            <w:r>
-              <w:rPr>
-                <w:b/>
-                <w:bCs/>
-                <w:color w:val="333333"/>
-                <w:sz w:val="18"/>
-                <w:szCs w:val="18"/>
-              </w:rPr>
-              <w:t>Siti Rahayu</w:t>
-            </w:r>
+            <w:proofErr w:type="spellStart"/>
+            <w:r>
+              <w:rPr>
+                <w:b/>
+                <w:bCs/>
+                <w:color w:val="333333"/>
+                <w:sz w:val="18"/>
+                <w:szCs w:val="18"/>
+              </w:rPr>
+              <w:t>Siti</w:t>
+            </w:r>
+            <w:proofErr w:type="spellEnd"/>
+            <w:r>
+              <w:rPr>
+                <w:b/>
+                <w:bCs/>
+                <w:color w:val="333333"/>
+                <w:sz w:val="18"/>
+                <w:szCs w:val="18"/>
+              </w:rPr>
+              <w:t xml:space="preserve"> </w:t>
+            </w:r>
+            <w:proofErr w:type="spellStart"/>
+            <w:r>
+              <w:rPr>
+                <w:b/>
+                <w:bCs/>
+                <w:color w:val="333333"/>
+                <w:sz w:val="18"/>
+                <w:szCs w:val="18"/>
+              </w:rPr>
+              <w:t>Rahayu</w:t>
+            </w:r>
+            <w:proofErr w:type="spellEnd"/>
           </w:p>
         </w:tc>
         <w:tc>
@@ -760,14 +936,52 @@
             <w:vAlign w:val="center"/>
           </w:tcPr>
           <w:p>
-            <w:r>
-              <w:rPr>
-                <w:color w:val="333333"/>
-                <w:sz w:val="18"/>
-                <w:szCs w:val="18"/>
-              </w:rPr>
-              <w:t>Sumber Daya Manusia</w:t>
-            </w:r>
+            <w:proofErr w:type="spellStart"/>
+            <w:r>
+              <w:rPr>
+                <w:color w:val="333333"/>
+                <w:sz w:val="18"/>
+                <w:szCs w:val="18"/>
+              </w:rPr>
+              <w:t>Sumber</w:t>
+            </w:r>
+            <w:proofErr w:type="spellEnd"/>
+            <w:r>
+              <w:rPr>
+                <w:color w:val="333333"/>
+                <w:sz w:val="18"/>
+                <w:szCs w:val="18"/>
+              </w:rPr>
+              <w:t xml:space="preserve"> </w:t>
+            </w:r>
+            <w:proofErr w:type="spellStart"/>
+            <w:r>
+              <w:rPr>
+                <w:color w:val="333333"/>
+                <w:sz w:val="18"/>
+                <w:szCs w:val="18"/>
+              </w:rPr>
+              <w:t>Daya</w:t>
+            </w:r>
+            <w:proofErr w:type="spellEnd"/>
+            <w:r>
+              <w:rPr>
+                <w:color w:val="333333"/>
+                <w:sz w:val="18"/>
+                <w:szCs w:val="18"/>
+              </w:rPr>
+              <w:t xml:space="preserve"> </w:t>
+            </w:r>
+            <w:proofErr w:type="spellStart"/>
+            <w:r>
+              <w:rPr>
+                <w:color w:val="333333"/>
+                <w:sz w:val="18"/>
+                <w:szCs w:val="18"/>
+              </w:rPr>
+              <w:t>Manusia</w:t>
+            </w:r>
+            <w:proofErr w:type="spellEnd"/>
           </w:p>
         </w:tc>
         <w:tc>
@@ -882,8 +1096,18 @@
                 <w:sz w:val="18"/>
                 <w:szCs w:val="18"/>
               </w:rPr>
-              <w:t>Jakarta Pusat</w:t>
-            </w:r>
+              <w:t xml:space="preserve">Jakarta </w:t>
+            </w:r>
+            <w:proofErr w:type="spellStart"/>
+            <w:r>
+              <w:rPr>
+                <w:color w:val="333333"/>
+                <w:sz w:val="18"/>
+                <w:szCs w:val="18"/>
+              </w:rPr>
+              <w:t>Pusat</w:t>
+            </w:r>
+            <w:proofErr w:type="spellEnd"/>
           </w:p>
         </w:tc>
         <w:tc>
@@ -908,6 +1132,7 @@
             <w:pPr>
               <w:jc w:val="center"/>
             </w:pPr>
+            <w:proofErr w:type="spellStart"/>
             <w:r>
               <w:rPr>
                 <w:b/>
@@ -918,6 +1143,7 @@
               </w:rPr>
               <w:t>Aktif</w:t>
             </w:r>
+            <w:proofErr w:type="spellEnd"/>
           </w:p>
         </w:tc>
         <w:tc>
@@ -1005,16 +1231,40 @@
             <w:vAlign w:val="center"/>
           </w:tcPr>
           <w:p>
-            <w:r>
-              <w:rPr>
-                <w:b/>
-                <w:bCs/>
-                <w:color w:val="333333"/>
-                <w:sz w:val="18"/>
-                <w:szCs w:val="18"/>
-              </w:rPr>
-              <w:t>Agus Prasetyo</w:t>
-            </w:r>
+            <w:proofErr w:type="spellStart"/>
+            <w:r>
+              <w:rPr>
+                <w:b/>
+                <w:bCs/>
+                <w:color w:val="333333"/>
+                <w:sz w:val="18"/>
+                <w:szCs w:val="18"/>
+              </w:rPr>
+              <w:t>Agus</w:t>
+            </w:r>
+            <w:proofErr w:type="spellEnd"/>
+            <w:r>
+              <w:rPr>
+                <w:b/>
+                <w:bCs/>
+                <w:color w:val="333333"/>
+                <w:sz w:val="18"/>
+                <w:szCs w:val="18"/>
+              </w:rPr>
+              <w:t xml:space="preserve"> </w:t>
+            </w:r>
+            <w:proofErr w:type="spellStart"/>
+            <w:r>
+              <w:rPr>
+                <w:b/>
+                <w:bCs/>
+                <w:color w:val="333333"/>
+                <w:sz w:val="18"/>
+                <w:szCs w:val="18"/>
+              </w:rPr>
+              <w:t>Prasetyo</w:t>
+            </w:r>
+            <w:proofErr w:type="spellEnd"/>
           </w:p>
         </w:tc>
         <w:tc>
@@ -1036,6 +1286,7 @@
             <w:vAlign w:val="center"/>
           </w:tcPr>
           <w:p>
+            <w:proofErr w:type="spellStart"/>
             <w:r>
               <w:rPr>
                 <w:color w:val="333333"/>
@@ -1044,6 +1295,7 @@
               </w:rPr>
               <w:t>Keuangan</w:t>
             </w:r>
+            <w:proofErr w:type="spellEnd"/>
           </w:p>
         </w:tc>
         <w:tc>
@@ -1184,6 +1436,7 @@
             <w:pPr>
               <w:jc w:val="center"/>
             </w:pPr>
+            <w:proofErr w:type="spellStart"/>
             <w:r>
               <w:rPr>
                 <w:b/>
@@ -1194,6 +1447,7 @@
               </w:rPr>
               <w:t>Aktif</w:t>
             </w:r>
+            <w:proofErr w:type="spellEnd"/>
           </w:p>
         </w:tc>
         <w:tc>
@@ -1281,16 +1535,40 @@
             <w:vAlign w:val="center"/>
           </w:tcPr>
           <w:p>
-            <w:r>
-              <w:rPr>
-                <w:b/>
-                <w:bCs/>
-                <w:color w:val="333333"/>
-                <w:sz w:val="18"/>
-                <w:szCs w:val="18"/>
-              </w:rPr>
-              <w:t>Dewi Anggraini</w:t>
-            </w:r>
+            <w:proofErr w:type="spellStart"/>
+            <w:r>
+              <w:rPr>
+                <w:b/>
+                <w:bCs/>
+                <w:color w:val="333333"/>
+                <w:sz w:val="18"/>
+                <w:szCs w:val="18"/>
+              </w:rPr>
+              <w:t>Dewi</w:t>
+            </w:r>
+            <w:proofErr w:type="spellEnd"/>
+            <w:r>
+              <w:rPr>
+                <w:b/>
+                <w:bCs/>
+                <w:color w:val="333333"/>
+                <w:sz w:val="18"/>
+                <w:szCs w:val="18"/>
+              </w:rPr>
+              <w:t xml:space="preserve"> </w:t>
+            </w:r>
+            <w:proofErr w:type="spellStart"/>
+            <w:r>
+              <w:rPr>
+                <w:b/>
+                <w:bCs/>
+                <w:color w:val="333333"/>
+                <w:sz w:val="18"/>
+                <w:szCs w:val="18"/>
+              </w:rPr>
+              <w:t>Anggraini</w:t>
+            </w:r>
+            <w:proofErr w:type="spellEnd"/>
           </w:p>
         </w:tc>
         <w:tc>
@@ -1312,6 +1590,7 @@
             <w:vAlign w:val="center"/>
           </w:tcPr>
           <w:p>
+            <w:proofErr w:type="spellStart"/>
             <w:r>
               <w:rPr>
                 <w:color w:val="333333"/>
@@ -1320,6 +1599,7 @@
               </w:rPr>
               <w:t>Pemasaran</w:t>
             </w:r>
+            <w:proofErr w:type="spellEnd"/>
           </w:p>
         </w:tc>
         <w:tc>
@@ -1460,6 +1740,7 @@
             <w:pPr>
               <w:jc w:val="center"/>
             </w:pPr>
+            <w:proofErr w:type="spellStart"/>
             <w:r>
               <w:rPr>
                 <w:b/>
@@ -1470,6 +1751,7 @@
               </w:rPr>
               <w:t>Aktif</w:t>
             </w:r>
+            <w:proofErr w:type="spellEnd"/>
           </w:p>
         </w:tc>
         <w:tc>
@@ -1557,16 +1839,40 @@
             <w:vAlign w:val="center"/>
           </w:tcPr>
           <w:p>
-            <w:r>
-              <w:rPr>
-                <w:b/>
-                <w:bCs/>
-                <w:color w:val="333333"/>
-                <w:sz w:val="18"/>
-                <w:szCs w:val="18"/>
-              </w:rPr>
-              <w:t>Rizky Firmansyah</w:t>
-            </w:r>
+            <w:proofErr w:type="spellStart"/>
+            <w:r>
+              <w:rPr>
+                <w:b/>
+                <w:bCs/>
+                <w:color w:val="333333"/>
+                <w:sz w:val="18"/>
+                <w:szCs w:val="18"/>
+              </w:rPr>
+              <w:t>Rizky</w:t>
+            </w:r>
+            <w:proofErr w:type="spellEnd"/>
+            <w:r>
+              <w:rPr>
+                <w:b/>
+                <w:bCs/>
+                <w:color w:val="333333"/>
+                <w:sz w:val="18"/>
+                <w:szCs w:val="18"/>
+              </w:rPr>
+              <w:t xml:space="preserve"> </w:t>
+            </w:r>
+            <w:proofErr w:type="spellStart"/>
+            <w:r>
+              <w:rPr>
+                <w:b/>
+                <w:bCs/>
+                <w:color w:val="333333"/>
+                <w:sz w:val="18"/>
+                <w:szCs w:val="18"/>
+              </w:rPr>
+              <w:t>Firmansyah</w:t>
+            </w:r>
+            <w:proofErr w:type="spellEnd"/>
           </w:p>
         </w:tc>
         <w:tc>
@@ -1588,14 +1894,34 @@
             <w:vAlign w:val="center"/>
           </w:tcPr>
           <w:p>
-            <w:r>
-              <w:rPr>
-                <w:color w:val="333333"/>
-                <w:sz w:val="18"/>
-                <w:szCs w:val="18"/>
-              </w:rPr>
-              <w:t>Teknologi Informasi</w:t>
-            </w:r>
+            <w:proofErr w:type="spellStart"/>
+            <w:r>
+              <w:rPr>
+                <w:color w:val="333333"/>
+                <w:sz w:val="18"/>
+                <w:szCs w:val="18"/>
+              </w:rPr>
+              <w:t>Teknologi</w:t>
+            </w:r>
+            <w:proofErr w:type="spellEnd"/>
+            <w:r>
+              <w:rPr>
+                <w:color w:val="333333"/>
+                <w:sz w:val="18"/>
+                <w:szCs w:val="18"/>
+              </w:rPr>
+              <w:t xml:space="preserve"> </w:t>
+            </w:r>
+            <w:proofErr w:type="spellStart"/>
+            <w:r>
+              <w:rPr>
+                <w:color w:val="333333"/>
+                <w:sz w:val="18"/>
+                <w:szCs w:val="18"/>
+              </w:rPr>
+              <w:t>Informasi</w:t>
+            </w:r>
+            <w:proofErr w:type="spellEnd"/>
           </w:p>
         </w:tc>
         <w:tc>
@@ -1736,6 +2062,7 @@
             <w:pPr>
               <w:jc w:val="center"/>
             </w:pPr>
+            <w:proofErr w:type="spellStart"/>
             <w:r>
               <w:rPr>
                 <w:b/>
@@ -1746,6 +2073,7 @@
               </w:rPr>
               <w:t>Aktif</w:t>
             </w:r>
+            <w:proofErr w:type="spellEnd"/>
           </w:p>
         </w:tc>
         <w:tc>
@@ -1833,16 +2161,40 @@
             <w:vAlign w:val="center"/>
           </w:tcPr>
           <w:p>
-            <w:r>
-              <w:rPr>
-                <w:b/>
-                <w:bCs/>
-                <w:color w:val="333333"/>
-                <w:sz w:val="18"/>
-                <w:szCs w:val="18"/>
-              </w:rPr>
-              <w:t>Nurul Hidayah</w:t>
-            </w:r>
+            <w:proofErr w:type="spellStart"/>
+            <w:r>
+              <w:rPr>
+                <w:b/>
+                <w:bCs/>
+                <w:color w:val="333333"/>
+                <w:sz w:val="18"/>
+                <w:szCs w:val="18"/>
+              </w:rPr>
+              <w:t>Nurul</w:t>
+            </w:r>
+            <w:proofErr w:type="spellEnd"/>
+            <w:r>
+              <w:rPr>
+                <w:b/>
+                <w:bCs/>
+                <w:color w:val="333333"/>
+                <w:sz w:val="18"/>
+                <w:szCs w:val="18"/>
+              </w:rPr>
+              <w:t xml:space="preserve"> </w:t>
+            </w:r>
+            <w:proofErr w:type="spellStart"/>
+            <w:r>
+              <w:rPr>
+                <w:b/>
+                <w:bCs/>
+                <w:color w:val="333333"/>
+                <w:sz w:val="18"/>
+                <w:szCs w:val="18"/>
+              </w:rPr>
+              <w:t>Hidayah</w:t>
+            </w:r>
+            <w:proofErr w:type="spellEnd"/>
           </w:p>
         </w:tc>
         <w:tc>
@@ -1864,6 +2216,7 @@
             <w:vAlign w:val="center"/>
           </w:tcPr>
           <w:p>
+            <w:proofErr w:type="spellStart"/>
             <w:r>
               <w:rPr>
                 <w:color w:val="333333"/>
@@ -1872,6 +2225,7 @@
               </w:rPr>
               <w:t>Operasional</w:t>
             </w:r>
+            <w:proofErr w:type="spellEnd"/>
           </w:p>
         </w:tc>
         <w:tc>
@@ -2012,6 +2366,7 @@
             <w:pPr>
               <w:jc w:val="center"/>
             </w:pPr>
+            <w:proofErr w:type="spellStart"/>
             <w:r>
               <w:rPr>
                 <w:b/>
@@ -2022,6 +2377,7 @@
               </w:rPr>
               <w:t>Aktif</w:t>
             </w:r>
+            <w:proofErr w:type="spellEnd"/>
           </w:p>
         </w:tc>
         <w:tc>
@@ -2117,8 +2473,20 @@
                 <w:sz w:val="18"/>
                 <w:szCs w:val="18"/>
               </w:rPr>
-              <w:t>Hendra Kurniawan</w:t>
-            </w:r>
+              <w:t xml:space="preserve">Hendra </w:t>
+            </w:r>
+            <w:proofErr w:type="spellStart"/>
+            <w:r>
+              <w:rPr>
+                <w:b/>
+                <w:bCs/>
+                <w:color w:val="333333"/>
+                <w:sz w:val="18"/>
+                <w:szCs w:val="18"/>
+              </w:rPr>
+              <w:t>Kurniawan</w:t>
+            </w:r>
+            <w:proofErr w:type="spellEnd"/>
           </w:p>
         </w:tc>
         <w:tc>
@@ -2140,6 +2508,7 @@
             <w:vAlign w:val="center"/>
           </w:tcPr>
           <w:p>
+            <w:proofErr w:type="spellStart"/>
             <w:r>
               <w:rPr>
                 <w:color w:val="333333"/>
@@ -2148,6 +2517,7 @@
               </w:rPr>
               <w:t>Penjualan</w:t>
             </w:r>
+            <w:proofErr w:type="spellEnd"/>
           </w:p>
         </w:tc>
         <w:tc>
@@ -2288,6 +2658,7 @@
             <w:pPr>
               <w:jc w:val="center"/>
             </w:pPr>
+            <w:proofErr w:type="spellStart"/>
             <w:r>
               <w:rPr>
                 <w:b/>
@@ -2298,6 +2669,7 @@
               </w:rPr>
               <w:t>Aktif</w:t>
             </w:r>
+            <w:proofErr w:type="spellEnd"/>
           </w:p>
         </w:tc>
         <w:tc>
@@ -2385,16 +2757,40 @@
             <w:vAlign w:val="center"/>
           </w:tcPr>
           <w:p>
-            <w:r>
-              <w:rPr>
-                <w:b/>
-                <w:bCs/>
-                <w:color w:val="333333"/>
-                <w:sz w:val="18"/>
-                <w:szCs w:val="18"/>
-              </w:rPr>
-              <w:t>Fitri Wulandari</w:t>
-            </w:r>
+            <w:proofErr w:type="spellStart"/>
+            <w:r>
+              <w:rPr>
+                <w:b/>
+                <w:bCs/>
+                <w:color w:val="333333"/>
+                <w:sz w:val="18"/>
+                <w:szCs w:val="18"/>
+              </w:rPr>
+              <w:t>Fitri</w:t>
+            </w:r>
+            <w:proofErr w:type="spellEnd"/>
+            <w:r>
+              <w:rPr>
+                <w:b/>
+                <w:bCs/>
+                <w:color w:val="333333"/>
+                <w:sz w:val="18"/>
+                <w:szCs w:val="18"/>
+              </w:rPr>
+              <w:t xml:space="preserve"> </w:t>
+            </w:r>
+            <w:proofErr w:type="spellStart"/>
+            <w:r>
+              <w:rPr>
+                <w:b/>
+                <w:bCs/>
+                <w:color w:val="333333"/>
+                <w:sz w:val="18"/>
+                <w:szCs w:val="18"/>
+              </w:rPr>
+              <w:t>Wulandari</w:t>
+            </w:r>
+            <w:proofErr w:type="spellEnd"/>
           </w:p>
         </w:tc>
         <w:tc>
@@ -2416,6 +2812,7 @@
             <w:vAlign w:val="center"/>
           </w:tcPr>
           <w:p>
+            <w:proofErr w:type="spellStart"/>
             <w:r>
               <w:rPr>
                 <w:color w:val="333333"/>
@@ -2424,6 +2821,7 @@
               </w:rPr>
               <w:t>Pemasaran</w:t>
             </w:r>
+            <w:proofErr w:type="spellEnd"/>
           </w:p>
         </w:tc>
         <w:tc>
@@ -2538,8 +2936,18 @@
                 <w:sz w:val="18"/>
                 <w:szCs w:val="18"/>
               </w:rPr>
-              <w:t>Jakarta Timur</w:t>
-            </w:r>
+              <w:t xml:space="preserve">Jakarta </w:t>
+            </w:r>
+            <w:proofErr w:type="spellStart"/>
+            <w:r>
+              <w:rPr>
+                <w:color w:val="333333"/>
+                <w:sz w:val="18"/>
+                <w:szCs w:val="18"/>
+              </w:rPr>
+              <w:t>Timur</w:t>
+            </w:r>
+            <w:proofErr w:type="spellEnd"/>
           </w:p>
         </w:tc>
         <w:tc>
@@ -2564,6 +2972,7 @@
             <w:pPr>
               <w:jc w:val="center"/>
             </w:pPr>
+            <w:proofErr w:type="spellStart"/>
             <w:r>
               <w:rPr>
                 <w:b/>
@@ -2574,6 +2983,7 @@
               </w:rPr>
               <w:t>Cuti</w:t>
             </w:r>
+            <w:proofErr w:type="spellEnd"/>
           </w:p>
         </w:tc>
         <w:tc>
@@ -2669,8 +3079,20 @@
                 <w:sz w:val="18"/>
                 <w:szCs w:val="18"/>
               </w:rPr>
-              <w:t>Dimas Ardiansyah</w:t>
-            </w:r>
+              <w:t xml:space="preserve">Dimas </w:t>
+            </w:r>
+            <w:proofErr w:type="spellStart"/>
+            <w:r>
+              <w:rPr>
+                <w:b/>
+                <w:bCs/>
+                <w:color w:val="333333"/>
+                <w:sz w:val="18"/>
+                <w:szCs w:val="18"/>
+              </w:rPr>
+              <w:t>Ardiansyah</w:t>
+            </w:r>
+            <w:proofErr w:type="spellEnd"/>
           </w:p>
         </w:tc>
         <w:tc>
@@ -2692,6 +3114,7 @@
             <w:vAlign w:val="center"/>
           </w:tcPr>
           <w:p>
+            <w:proofErr w:type="spellStart"/>
             <w:r>
               <w:rPr>
                 <w:color w:val="333333"/>
@@ -2700,6 +3123,7 @@
               </w:rPr>
               <w:t>Keuangan</w:t>
             </w:r>
+            <w:proofErr w:type="spellEnd"/>
           </w:p>
         </w:tc>
         <w:tc>
@@ -2840,6 +3264,7 @@
             <w:pPr>
               <w:jc w:val="center"/>
             </w:pPr>
+            <w:proofErr w:type="spellStart"/>
             <w:r>
               <w:rPr>
                 <w:b/>
@@ -2850,6 +3275,7 @@
               </w:rPr>
               <w:t>Aktif</w:t>
             </w:r>
+            <w:proofErr w:type="spellEnd"/>
           </w:p>
         </w:tc>
         <w:tc>
@@ -2945,8 +3371,20 @@
                 <w:sz w:val="18"/>
                 <w:szCs w:val="18"/>
               </w:rPr>
-              <w:t>Rina Kusumawati</w:t>
-            </w:r>
+              <w:t xml:space="preserve">Rina </w:t>
+            </w:r>
+            <w:proofErr w:type="spellStart"/>
+            <w:r>
+              <w:rPr>
+                <w:b/>
+                <w:bCs/>
+                <w:color w:val="333333"/>
+                <w:sz w:val="18"/>
+                <w:szCs w:val="18"/>
+              </w:rPr>
+              <w:t>Kusumawati</w:t>
+            </w:r>
+            <w:proofErr w:type="spellEnd"/>
           </w:p>
         </w:tc>
         <w:tc>
@@ -2968,14 +3406,52 @@
             <w:vAlign w:val="center"/>
           </w:tcPr>
           <w:p>
-            <w:r>
-              <w:rPr>
-                <w:color w:val="333333"/>
-                <w:sz w:val="18"/>
-                <w:szCs w:val="18"/>
-              </w:rPr>
-              <w:t>Sumber Daya Manusia</w:t>
-            </w:r>
+            <w:proofErr w:type="spellStart"/>
+            <w:r>
+              <w:rPr>
+                <w:color w:val="333333"/>
+                <w:sz w:val="18"/>
+                <w:szCs w:val="18"/>
+              </w:rPr>
+              <w:t>Sumber</w:t>
+            </w:r>
+            <w:proofErr w:type="spellEnd"/>
+            <w:r>
+              <w:rPr>
+                <w:color w:val="333333"/>
+                <w:sz w:val="18"/>
+                <w:szCs w:val="18"/>
+              </w:rPr>
+              <w:t xml:space="preserve"> </w:t>
+            </w:r>
+            <w:proofErr w:type="spellStart"/>
+            <w:r>
+              <w:rPr>
+                <w:color w:val="333333"/>
+                <w:sz w:val="18"/>
+                <w:szCs w:val="18"/>
+              </w:rPr>
+              <w:t>Daya</w:t>
+            </w:r>
+            <w:proofErr w:type="spellEnd"/>
+            <w:r>
+              <w:rPr>
+                <w:color w:val="333333"/>
+                <w:sz w:val="18"/>
+                <w:szCs w:val="18"/>
+              </w:rPr>
+              <w:t xml:space="preserve"> </w:t>
+            </w:r>
+            <w:proofErr w:type="spellStart"/>
+            <w:r>
+              <w:rPr>
+                <w:color w:val="333333"/>
+                <w:sz w:val="18"/>
+                <w:szCs w:val="18"/>
+              </w:rPr>
+              <w:t>Manusia</w:t>
+            </w:r>
+            <w:proofErr w:type="spellEnd"/>
           </w:p>
         </w:tc>
         <w:tc>
@@ -3090,8 +3566,18 @@
                 <w:sz w:val="18"/>
                 <w:szCs w:val="18"/>
               </w:rPr>
-              <w:t>Jakarta Pusat</w:t>
-            </w:r>
+              <w:t xml:space="preserve">Jakarta </w:t>
+            </w:r>
+            <w:proofErr w:type="spellStart"/>
+            <w:r>
+              <w:rPr>
+                <w:color w:val="333333"/>
+                <w:sz w:val="18"/>
+                <w:szCs w:val="18"/>
+              </w:rPr>
+              <w:t>Pusat</w:t>
+            </w:r>
+            <w:proofErr w:type="spellEnd"/>
           </w:p>
         </w:tc>
         <w:tc>
@@ -3116,6 +3602,7 @@
             <w:pPr>
               <w:jc w:val="center"/>
             </w:pPr>
+            <w:proofErr w:type="spellStart"/>
             <w:r>
               <w:rPr>
                 <w:b/>
@@ -3126,6 +3613,7 @@
               </w:rPr>
               <w:t>Aktif</w:t>
             </w:r>
+            <w:proofErr w:type="spellEnd"/>
           </w:p>
         </w:tc>
         <w:tc>
@@ -3213,16 +3701,40 @@
             <w:vAlign w:val="center"/>
           </w:tcPr>
           <w:p>
-            <w:r>
-              <w:rPr>
-                <w:b/>
-                <w:bCs/>
-                <w:color w:val="333333"/>
-                <w:sz w:val="18"/>
-                <w:szCs w:val="18"/>
-              </w:rPr>
-              <w:t>Fajar Hidayatullah</w:t>
-            </w:r>
+            <w:proofErr w:type="spellStart"/>
+            <w:r>
+              <w:rPr>
+                <w:b/>
+                <w:bCs/>
+                <w:color w:val="333333"/>
+                <w:sz w:val="18"/>
+                <w:szCs w:val="18"/>
+              </w:rPr>
+              <w:t>Fajar</w:t>
+            </w:r>
+            <w:proofErr w:type="spellEnd"/>
+            <w:r>
+              <w:rPr>
+                <w:b/>
+                <w:bCs/>
+                <w:color w:val="333333"/>
+                <w:sz w:val="18"/>
+                <w:szCs w:val="18"/>
+              </w:rPr>
+              <w:t xml:space="preserve"> </w:t>
+            </w:r>
+            <w:proofErr w:type="spellStart"/>
+            <w:r>
+              <w:rPr>
+                <w:b/>
+                <w:bCs/>
+                <w:color w:val="333333"/>
+                <w:sz w:val="18"/>
+                <w:szCs w:val="18"/>
+              </w:rPr>
+              <w:t>Hidayatullah</w:t>
+            </w:r>
+            <w:proofErr w:type="spellEnd"/>
           </w:p>
         </w:tc>
         <w:tc>
@@ -3244,14 +3756,34 @@
             <w:vAlign w:val="center"/>
           </w:tcPr>
           <w:p>
-            <w:r>
-              <w:rPr>
-                <w:color w:val="333333"/>
-                <w:sz w:val="18"/>
-                <w:szCs w:val="18"/>
-              </w:rPr>
-              <w:t>Teknologi Informasi</w:t>
-            </w:r>
+            <w:proofErr w:type="spellStart"/>
+            <w:r>
+              <w:rPr>
+                <w:color w:val="333333"/>
+                <w:sz w:val="18"/>
+                <w:szCs w:val="18"/>
+              </w:rPr>
+              <w:t>Teknologi</w:t>
+            </w:r>
+            <w:proofErr w:type="spellEnd"/>
+            <w:r>
+              <w:rPr>
+                <w:color w:val="333333"/>
+                <w:sz w:val="18"/>
+                <w:szCs w:val="18"/>
+              </w:rPr>
+              <w:t xml:space="preserve"> </w:t>
+            </w:r>
+            <w:proofErr w:type="spellStart"/>
+            <w:r>
+              <w:rPr>
+                <w:color w:val="333333"/>
+                <w:sz w:val="18"/>
+                <w:szCs w:val="18"/>
+              </w:rPr>
+              <w:t>Informasi</w:t>
+            </w:r>
+            <w:proofErr w:type="spellEnd"/>
           </w:p>
         </w:tc>
         <w:tc>
@@ -3392,6 +3924,7 @@
             <w:pPr>
               <w:jc w:val="center"/>
             </w:pPr>
+            <w:proofErr w:type="spellStart"/>
             <w:r>
               <w:rPr>
                 <w:b/>
@@ -3402,6 +3935,7 @@
               </w:rPr>
               <w:t>Aktif</w:t>
             </w:r>
+            <w:proofErr w:type="spellEnd"/>
           </w:p>
         </w:tc>
         <w:tc>
@@ -3497,8 +4031,20 @@
                 <w:sz w:val="18"/>
                 <w:szCs w:val="18"/>
               </w:rPr>
-              <w:t>Lestari Ningrum</w:t>
-            </w:r>
+              <w:t xml:space="preserve">Lestari </w:t>
+            </w:r>
+            <w:proofErr w:type="spellStart"/>
+            <w:r>
+              <w:rPr>
+                <w:b/>
+                <w:bCs/>
+                <w:color w:val="333333"/>
+                <w:sz w:val="18"/>
+                <w:szCs w:val="18"/>
+              </w:rPr>
+              <w:t>Ningrum</w:t>
+            </w:r>
+            <w:proofErr w:type="spellEnd"/>
           </w:p>
         </w:tc>
         <w:tc>
@@ -3520,6 +4066,7 @@
             <w:vAlign w:val="center"/>
           </w:tcPr>
           <w:p>
+            <w:proofErr w:type="spellStart"/>
             <w:r>
               <w:rPr>
                 <w:color w:val="333333"/>
@@ -3528,6 +4075,7 @@
               </w:rPr>
               <w:t>Operasional</w:t>
             </w:r>
+            <w:proofErr w:type="spellEnd"/>
           </w:p>
         </w:tc>
         <w:tc>
@@ -3668,6 +4216,7 @@
             <w:pPr>
               <w:jc w:val="center"/>
             </w:pPr>
+            <w:proofErr w:type="spellStart"/>
             <w:r>
               <w:rPr>
                 <w:b/>
@@ -3678,6 +4227,7 @@
               </w:rPr>
               <w:t>Aktif</w:t>
             </w:r>
+            <w:proofErr w:type="spellEnd"/>
           </w:p>
         </w:tc>
         <w:tc>
@@ -3766,16 +4316,40 @@
             <w:vAlign w:val="center"/>
           </w:tcPr>
           <w:p>
-            <w:r>
-              <w:rPr>
-                <w:b/>
-                <w:bCs/>
-                <w:color w:val="333333"/>
-                <w:sz w:val="18"/>
-                <w:szCs w:val="18"/>
-              </w:rPr>
-              <w:t>Wahyu Setiawan</w:t>
-            </w:r>
+            <w:proofErr w:type="spellStart"/>
+            <w:r>
+              <w:rPr>
+                <w:b/>
+                <w:bCs/>
+                <w:color w:val="333333"/>
+                <w:sz w:val="18"/>
+                <w:szCs w:val="18"/>
+              </w:rPr>
+              <w:t>Wahyu</w:t>
+            </w:r>
+            <w:proofErr w:type="spellEnd"/>
+            <w:r>
+              <w:rPr>
+                <w:b/>
+                <w:bCs/>
+                <w:color w:val="333333"/>
+                <w:sz w:val="18"/>
+                <w:szCs w:val="18"/>
+              </w:rPr>
+              <w:t xml:space="preserve"> </w:t>
+            </w:r>
+            <w:proofErr w:type="spellStart"/>
+            <w:r>
+              <w:rPr>
+                <w:b/>
+                <w:bCs/>
+                <w:color w:val="333333"/>
+                <w:sz w:val="18"/>
+                <w:szCs w:val="18"/>
+              </w:rPr>
+              <w:t>Setiawan</w:t>
+            </w:r>
+            <w:proofErr w:type="spellEnd"/>
           </w:p>
         </w:tc>
         <w:tc>
@@ -3797,6 +4371,7 @@
             <w:vAlign w:val="center"/>
           </w:tcPr>
           <w:p>
+            <w:proofErr w:type="spellStart"/>
             <w:r>
               <w:rPr>
                 <w:color w:val="333333"/>
@@ -3805,6 +4380,7 @@
               </w:rPr>
               <w:t>Penjualan</w:t>
             </w:r>
+            <w:proofErr w:type="spellEnd"/>
           </w:p>
         </w:tc>
         <w:tc>
@@ -3945,6 +4521,7 @@
             <w:pPr>
               <w:jc w:val="center"/>
             </w:pPr>
+            <w:proofErr w:type="spellStart"/>
             <w:r>
               <w:rPr>
                 <w:b/>
@@ -3955,6 +4532,7 @@
               </w:rPr>
               <w:t>Aktif</w:t>
             </w:r>
+            <w:proofErr w:type="spellEnd"/>
           </w:p>
         </w:tc>
         <w:tc>
@@ -4073,14 +4651,34 @@
             <w:vAlign w:val="center"/>
           </w:tcPr>
           <w:p>
-            <w:r>
-              <w:rPr>
-                <w:color w:val="333333"/>
-                <w:sz w:val="18"/>
-                <w:szCs w:val="18"/>
-              </w:rPr>
-              <w:t>Hukum &amp; Kepatuhan</w:t>
-            </w:r>
+            <w:proofErr w:type="spellStart"/>
+            <w:r>
+              <w:rPr>
+                <w:color w:val="333333"/>
+                <w:sz w:val="18"/>
+                <w:szCs w:val="18"/>
+              </w:rPr>
+              <w:t>Hukum</w:t>
+            </w:r>
+            <w:proofErr w:type="spellEnd"/>
+            <w:r>
+              <w:rPr>
+                <w:color w:val="333333"/>
+                <w:sz w:val="18"/>
+                <w:szCs w:val="18"/>
+              </w:rPr>
+              <w:t xml:space="preserve"> &amp; </w:t>
+            </w:r>
+            <w:proofErr w:type="spellStart"/>
+            <w:r>
+              <w:rPr>
+                <w:color w:val="333333"/>
+                <w:sz w:val="18"/>
+                <w:szCs w:val="18"/>
+              </w:rPr>
+              <w:t>Kepatuhan</w:t>
+            </w:r>
+            <w:proofErr w:type="spellEnd"/>
           </w:p>
         </w:tc>
         <w:tc>
@@ -4221,6 +4819,7 @@
             <w:pPr>
               <w:jc w:val="center"/>
             </w:pPr>
+            <w:proofErr w:type="spellStart"/>
             <w:r>
               <w:rPr>
                 <w:b/>
@@ -4231,6 +4830,7 @@
               </w:rPr>
               <w:t>Aktif</w:t>
             </w:r>
+            <w:proofErr w:type="spellEnd"/>
           </w:p>
         </w:tc>
         <w:tc>
@@ -4326,8 +4926,20 @@
                 <w:sz w:val="18"/>
                 <w:szCs w:val="18"/>
               </w:rPr>
-              <w:t>Yoga Pratama</w:t>
-            </w:r>
+              <w:t xml:space="preserve">Yoga </w:t>
+            </w:r>
+            <w:proofErr w:type="spellStart"/>
+            <w:r>
+              <w:rPr>
+                <w:b/>
+                <w:bCs/>
+                <w:color w:val="333333"/>
+                <w:sz w:val="18"/>
+                <w:szCs w:val="18"/>
+              </w:rPr>
+              <w:t>Pratama</w:t>
+            </w:r>
+            <w:proofErr w:type="spellEnd"/>
           </w:p>
         </w:tc>
         <w:tc>
@@ -4349,14 +4961,34 @@
             <w:vAlign w:val="center"/>
           </w:tcPr>
           <w:p>
-            <w:r>
-              <w:rPr>
-                <w:color w:val="333333"/>
-                <w:sz w:val="18"/>
-                <w:szCs w:val="18"/>
-              </w:rPr>
-              <w:t>Teknologi Informasi</w:t>
-            </w:r>
+            <w:proofErr w:type="spellStart"/>
+            <w:r>
+              <w:rPr>
+                <w:color w:val="333333"/>
+                <w:sz w:val="18"/>
+                <w:szCs w:val="18"/>
+              </w:rPr>
+              <w:t>Teknologi</w:t>
+            </w:r>
+            <w:proofErr w:type="spellEnd"/>
+            <w:r>
+              <w:rPr>
+                <w:color w:val="333333"/>
+                <w:sz w:val="18"/>
+                <w:szCs w:val="18"/>
+              </w:rPr>
+              <w:t xml:space="preserve"> </w:t>
+            </w:r>
+            <w:proofErr w:type="spellStart"/>
+            <w:r>
+              <w:rPr>
+                <w:color w:val="333333"/>
+                <w:sz w:val="18"/>
+                <w:szCs w:val="18"/>
+              </w:rPr>
+              <w:t>Informasi</w:t>
+            </w:r>
+            <w:proofErr w:type="spellEnd"/>
           </w:p>
         </w:tc>
         <w:tc>
@@ -4497,6 +5129,7 @@
             <w:pPr>
               <w:jc w:val="center"/>
             </w:pPr>
+            <w:proofErr w:type="spellStart"/>
             <w:r>
               <w:rPr>
                 <w:b/>
@@ -4507,6 +5140,7 @@
               </w:rPr>
               <w:t>Aktif</w:t>
             </w:r>
+            <w:proofErr w:type="spellEnd"/>
           </w:p>
         </w:tc>
         <w:tc>
@@ -4608,16 +5242,40 @@
                 <w:szCs w:val="18"/>
               </w:rPr>
             </w:pPr>
-            <w:r>
-              <w:rPr>
-                <w:b/>
-                <w:bCs/>
-                <w:color w:val="333333"/>
-                <w:sz w:val="18"/>
-                <w:szCs w:val="18"/>
-              </w:rPr>
-              <w:t>Ibnu Setiawan</w:t>
-            </w:r>
+            <w:proofErr w:type="spellStart"/>
+            <w:r>
+              <w:rPr>
+                <w:b/>
+                <w:bCs/>
+                <w:color w:val="333333"/>
+                <w:sz w:val="18"/>
+                <w:szCs w:val="18"/>
+              </w:rPr>
+              <w:t>Ibnu</w:t>
+            </w:r>
+            <w:proofErr w:type="spellEnd"/>
+            <w:r>
+              <w:rPr>
+                <w:b/>
+                <w:bCs/>
+                <w:color w:val="333333"/>
+                <w:sz w:val="18"/>
+                <w:szCs w:val="18"/>
+              </w:rPr>
+              <w:t xml:space="preserve"> </w:t>
+            </w:r>
+            <w:proofErr w:type="spellStart"/>
+            <w:r>
+              <w:rPr>
+                <w:b/>
+                <w:bCs/>
+                <w:color w:val="333333"/>
+                <w:sz w:val="18"/>
+                <w:szCs w:val="18"/>
+              </w:rPr>
+              <w:t>Setiawan</w:t>
+            </w:r>
+            <w:proofErr w:type="spellEnd"/>
           </w:p>
         </w:tc>
         <w:tc>
@@ -4646,14 +5304,34 @@
                 <w:szCs w:val="18"/>
               </w:rPr>
             </w:pPr>
-            <w:r>
-              <w:rPr>
-                <w:color w:val="333333"/>
-                <w:sz w:val="18"/>
-                <w:szCs w:val="18"/>
-              </w:rPr>
-              <w:t>Teknologi Informasi</w:t>
-            </w:r>
+            <w:proofErr w:type="spellStart"/>
+            <w:r>
+              <w:rPr>
+                <w:color w:val="333333"/>
+                <w:sz w:val="18"/>
+                <w:szCs w:val="18"/>
+              </w:rPr>
+              <w:t>Teknologi</w:t>
+            </w:r>
+            <w:proofErr w:type="spellEnd"/>
+            <w:r>
+              <w:rPr>
+                <w:color w:val="333333"/>
+                <w:sz w:val="18"/>
+                <w:szCs w:val="18"/>
+              </w:rPr>
+              <w:t xml:space="preserve"> </w:t>
+            </w:r>
+            <w:proofErr w:type="spellStart"/>
+            <w:r>
+              <w:rPr>
+                <w:color w:val="333333"/>
+                <w:sz w:val="18"/>
+                <w:szCs w:val="18"/>
+              </w:rPr>
+              <w:t>Informasi</w:t>
+            </w:r>
+            <w:proofErr w:type="spellEnd"/>
           </w:p>
         </w:tc>
         <w:tc>
@@ -4682,6 +5360,7 @@
                 <w:szCs w:val="18"/>
               </w:rPr>
             </w:pPr>
+            <w:proofErr w:type="spellStart"/>
             <w:r>
               <w:rPr>
                 <w:color w:val="333333"/>
@@ -4690,6 +5369,7 @@
               </w:rPr>
               <w:t>Magang</w:t>
             </w:r>
+            <w:proofErr w:type="spellEnd"/>
           </w:p>
         </w:tc>
         <w:tc>
@@ -4762,7 +5442,23 @@
                 <w:sz w:val="16"/>
                 <w:szCs w:val="16"/>
               </w:rPr>
-              <w:t>081284782973</w:t>
+              <w:t>+</w:t>
+            </w:r>
+            <w:r>
+              <w:rPr>
+                <w:color w:val="333333"/>
+                <w:sz w:val="16"/>
+                <w:szCs w:val="16"/>
+              </w:rPr>
+              <w:t>62</w:t>
+            </w:r>
+            <w:r>
+              <w:rPr>
+                <w:color w:val="333333"/>
+                <w:sz w:val="16"/>
+                <w:szCs w:val="16"/>
+              </w:rPr>
+              <w:t>8974436868</w:t>
             </w:r>
           </w:p>
         </w:tc>
@@ -4792,6 +5488,7 @@
                 <w:szCs w:val="18"/>
               </w:rPr>
             </w:pPr>
+            <w:proofErr w:type="spellStart"/>
             <w:r>
               <w:rPr>
                 <w:color w:val="333333"/>
@@ -4800,6 +5497,7 @@
               </w:rPr>
               <w:t>Portegal</w:t>
             </w:r>
+            <w:proofErr w:type="spellEnd"/>
           </w:p>
         </w:tc>
         <w:tc>
@@ -4831,6 +5529,7 @@
                 <w:szCs w:val="16"/>
               </w:rPr>
             </w:pPr>
+            <w:proofErr w:type="spellStart"/>
             <w:r>
               <w:rPr>
                 <w:b/>
@@ -4841,6 +5540,7 @@
               </w:rPr>
               <w:t>Aktif</w:t>
             </w:r>
+            <w:proofErr w:type="spellEnd"/>
           </w:p>
         </w:tc>
         <w:tc>
@@ -4876,7 +5576,25 @@
                 <w:sz w:val="16"/>
                 <w:szCs w:val="16"/>
               </w:rPr>
-              <w:t>20 jan 2026</w:t>
+              <w:t xml:space="preserve">20 </w:t>
+            </w:r>
+            <w:proofErr w:type="spellStart"/>
+            <w:r>
+              <w:rPr>
+                <w:color w:val="333333"/>
+                <w:sz w:val="16"/>
+                <w:szCs w:val="16"/>
+              </w:rPr>
+              <w:t>jan</w:t>
+            </w:r>
+            <w:proofErr w:type="spellEnd"/>
+            <w:r>
+              <w:rPr>
+                <w:color w:val="333333"/>
+                <w:sz w:val="16"/>
+                <w:szCs w:val="16"/>
+              </w:rPr>
+              <w:t xml:space="preserve"> 2026</w:t>
             </w:r>
           </w:p>
         </w:tc>
@@ -4985,14 +5703,34 @@
                 <w:szCs w:val="18"/>
               </w:rPr>
             </w:pPr>
-            <w:r>
-              <w:rPr>
-                <w:color w:val="333333"/>
-                <w:sz w:val="18"/>
-                <w:szCs w:val="18"/>
-              </w:rPr>
-              <w:t>Teknologi Informasi</w:t>
-            </w:r>
+            <w:proofErr w:type="spellStart"/>
+            <w:r>
+              <w:rPr>
+                <w:color w:val="333333"/>
+                <w:sz w:val="18"/>
+                <w:szCs w:val="18"/>
+              </w:rPr>
+              <w:t>Teknologi</w:t>
+            </w:r>
+            <w:proofErr w:type="spellEnd"/>
+            <w:r>
+              <w:rPr>
+                <w:color w:val="333333"/>
+                <w:sz w:val="18"/>
+                <w:szCs w:val="18"/>
+              </w:rPr>
+              <w:t xml:space="preserve"> </w:t>
+            </w:r>
+            <w:proofErr w:type="spellStart"/>
+            <w:r>
+              <w:rPr>
+                <w:color w:val="333333"/>
+                <w:sz w:val="18"/>
+                <w:szCs w:val="18"/>
+              </w:rPr>
+              <w:t>Informasi</w:t>
+            </w:r>
+            <w:proofErr w:type="spellEnd"/>
           </w:p>
         </w:tc>
         <w:tc>
@@ -5021,13 +5759,23 @@
                 <w:szCs w:val="18"/>
               </w:rPr>
             </w:pPr>
-            <w:r>
-              <w:rPr>
-                <w:color w:val="333333"/>
-                <w:sz w:val="18"/>
-                <w:szCs w:val="18"/>
-              </w:rPr>
-              <w:t xml:space="preserve">Dosen </w:t>
+            <w:proofErr w:type="spellStart"/>
+            <w:r>
+              <w:rPr>
+                <w:color w:val="333333"/>
+                <w:sz w:val="18"/>
+                <w:szCs w:val="18"/>
+              </w:rPr>
+              <w:t>Dosen</w:t>
+            </w:r>
+            <w:proofErr w:type="spellEnd"/>
+            <w:r>
+              <w:rPr>
+                <w:color w:val="333333"/>
+                <w:sz w:val="18"/>
+                <w:szCs w:val="18"/>
+              </w:rPr>
+              <w:t xml:space="preserve"> </w:t>
             </w:r>
           </w:p>
         </w:tc>
@@ -5101,7 +5849,15 @@
                 <w:sz w:val="16"/>
                 <w:szCs w:val="16"/>
               </w:rPr>
-              <w:t>081233568922</w:t>
+              <w:t>+628211178</w:t>
+            </w:r>
+            <w:r>
+              <w:rPr>
+                <w:color w:val="333333"/>
+                <w:sz w:val="16"/>
+                <w:szCs w:val="16"/>
+              </w:rPr>
+              <w:t>4160</w:t>
             </w:r>
           </w:p>
         </w:tc>
@@ -5170,6 +5926,7 @@
                 <w:szCs w:val="16"/>
               </w:rPr>
             </w:pPr>
+            <w:proofErr w:type="spellStart"/>
             <w:r>
               <w:rPr>
                 <w:b/>
@@ -5178,7 +5935,18 @@
                 <w:sz w:val="16"/>
                 <w:szCs w:val="16"/>
               </w:rPr>
-              <w:t xml:space="preserve">Aktif </w:t>
+              <w:t>Aktif</w:t>
+            </w:r>
+            <w:proofErr w:type="spellEnd"/>
+            <w:r>
+              <w:rPr>
+                <w:b/>
+                <w:bCs/>
+                <w:color w:val="155724"/>
+                <w:sz w:val="16"/>
+                <w:szCs w:val="16"/>
+              </w:rPr>
+              <w:t xml:space="preserve"> </w:t>
             </w:r>
           </w:p>
         </w:tc>
@@ -5215,7 +5983,25 @@
                 <w:sz w:val="16"/>
                 <w:szCs w:val="16"/>
               </w:rPr>
-              <w:t>20 jan 2026</w:t>
+              <w:t xml:space="preserve">20 </w:t>
+            </w:r>
+            <w:proofErr w:type="spellStart"/>
+            <w:r>
+              <w:rPr>
+                <w:color w:val="333333"/>
+                <w:sz w:val="16"/>
+                <w:szCs w:val="16"/>
+              </w:rPr>
+              <w:t>jan</w:t>
+            </w:r>
+            <w:proofErr w:type="spellEnd"/>
+            <w:r>
+              <w:rPr>
+                <w:color w:val="333333"/>
+                <w:sz w:val="16"/>
+                <w:szCs w:val="16"/>
+              </w:rPr>
+              <w:t xml:space="preserve"> 2026</w:t>
             </w:r>
           </w:p>
         </w:tc>
@@ -5324,14 +6110,34 @@
                 <w:szCs w:val="18"/>
               </w:rPr>
             </w:pPr>
-            <w:r>
-              <w:rPr>
-                <w:color w:val="333333"/>
-                <w:sz w:val="18"/>
-                <w:szCs w:val="18"/>
-              </w:rPr>
-              <w:t>Teknologi Informasi</w:t>
-            </w:r>
+            <w:proofErr w:type="spellStart"/>
+            <w:r>
+              <w:rPr>
+                <w:color w:val="333333"/>
+                <w:sz w:val="18"/>
+                <w:szCs w:val="18"/>
+              </w:rPr>
+              <w:t>Teknologi</w:t>
+            </w:r>
+            <w:proofErr w:type="spellEnd"/>
+            <w:r>
+              <w:rPr>
+                <w:color w:val="333333"/>
+                <w:sz w:val="18"/>
+                <w:szCs w:val="18"/>
+              </w:rPr>
+              <w:t xml:space="preserve"> </w:t>
+            </w:r>
+            <w:proofErr w:type="spellStart"/>
+            <w:r>
+              <w:rPr>
+                <w:color w:val="333333"/>
+                <w:sz w:val="18"/>
+                <w:szCs w:val="18"/>
+              </w:rPr>
+              <w:t>Informasi</w:t>
+            </w:r>
+            <w:proofErr w:type="spellEnd"/>
           </w:p>
         </w:tc>
         <w:tc>
@@ -5360,6 +6166,7 @@
                 <w:szCs w:val="18"/>
               </w:rPr>
             </w:pPr>
+            <w:proofErr w:type="spellStart"/>
             <w:r>
               <w:rPr>
                 <w:color w:val="333333"/>
@@ -5368,6 +6175,7 @@
               </w:rPr>
               <w:t>Magang</w:t>
             </w:r>
+            <w:proofErr w:type="spellEnd"/>
           </w:p>
         </w:tc>
         <w:tc>
@@ -5440,7 +6248,25 @@
                 <w:sz w:val="16"/>
                 <w:szCs w:val="16"/>
               </w:rPr>
-              <w:t>081167890076</w:t>
+              <w:t>+</w:t>
+            </w:r>
+            <w:r>
+              <w:rPr>
+                <w:color w:val="333333"/>
+                <w:sz w:val="16"/>
+                <w:szCs w:val="16"/>
+              </w:rPr>
+              <w:t>62</w:t>
+            </w:r>
+            <w:bookmarkStart w:id="0" w:name="_GoBack"/>
+            <w:bookmarkEnd w:id="0"/>
+            <w:r>
+              <w:rPr>
+                <w:color w:val="333333"/>
+                <w:sz w:val="16"/>
+                <w:szCs w:val="16"/>
+              </w:rPr>
+              <w:t>8974436868</w:t>
             </w:r>
           </w:p>
         </w:tc>
@@ -5509,6 +6335,7 @@
                 <w:szCs w:val="16"/>
               </w:rPr>
             </w:pPr>
+            <w:proofErr w:type="spellStart"/>
             <w:r>
               <w:rPr>
                 <w:b/>
@@ -5519,6 +6346,7 @@
               </w:rPr>
               <w:t>Aktif</w:t>
             </w:r>
+            <w:proofErr w:type="spellEnd"/>
           </w:p>
         </w:tc>
         <w:tc>
@@ -5554,7 +6382,25 @@
                 <w:sz w:val="16"/>
                 <w:szCs w:val="16"/>
               </w:rPr>
-              <w:t>19 feb 2026</w:t>
+              <w:t xml:space="preserve">19 </w:t>
+            </w:r>
+            <w:proofErr w:type="spellStart"/>
+            <w:r>
+              <w:rPr>
+                <w:color w:val="333333"/>
+                <w:sz w:val="16"/>
+                <w:szCs w:val="16"/>
+              </w:rPr>
+              <w:t>feb</w:t>
+            </w:r>
+            <w:proofErr w:type="spellEnd"/>
+            <w:r>
+              <w:rPr>
+                <w:color w:val="333333"/>
+                <w:sz w:val="16"/>
+                <w:szCs w:val="16"/>
+              </w:rPr>
+              <w:t xml:space="preserve"> 2026</w:t>
             </w:r>
           </w:p>
         </w:tc>
@@ -5593,15 +6439,7 @@
                 <w:sz w:val="18"/>
                 <w:szCs w:val="18"/>
               </w:rPr>
-              <w:t>01</w:t>
-            </w:r>
-            <w:r>
-              <w:rPr>
-                <w:color w:val="333333"/>
-                <w:sz w:val="18"/>
-                <w:szCs w:val="18"/>
-              </w:rPr>
-              <w:t>9</w:t>
+              <w:t>019</w:t>
             </w:r>
           </w:p>
         </w:tc>
@@ -5633,16 +6471,29 @@
                 <w:szCs w:val="18"/>
               </w:rPr>
             </w:pPr>
-            <w:r>
-              <w:rPr>
-                <w:b/>
-                <w:bCs/>
-                <w:color w:val="333333"/>
-                <w:sz w:val="18"/>
-                <w:szCs w:val="18"/>
-              </w:rPr>
-              <w:t xml:space="preserve">Ibnu </w:t>
-            </w:r>
+            <w:proofErr w:type="spellStart"/>
+            <w:r>
+              <w:rPr>
+                <w:b/>
+                <w:bCs/>
+                <w:color w:val="333333"/>
+                <w:sz w:val="18"/>
+                <w:szCs w:val="18"/>
+              </w:rPr>
+              <w:t>Ibnu</w:t>
+            </w:r>
+            <w:proofErr w:type="spellEnd"/>
+            <w:r>
+              <w:rPr>
+                <w:b/>
+                <w:bCs/>
+                <w:color w:val="333333"/>
+                <w:sz w:val="18"/>
+                <w:szCs w:val="18"/>
+              </w:rPr>
+              <w:t xml:space="preserve"> </w:t>
+            </w:r>
+            <w:proofErr w:type="spellStart"/>
             <w:r>
               <w:rPr>
                 <w:b/>
@@ -5653,6 +6504,7 @@
               </w:rPr>
               <w:t>Prasetyo</w:t>
             </w:r>
+            <w:proofErr w:type="spellEnd"/>
           </w:p>
         </w:tc>
         <w:tc>
@@ -5753,23 +6605,7 @@
                   <w:sz w:val="16"/>
                   <w:szCs w:val="16"/>
                 </w:rPr>
-                <w:t>ibnu.</w:t>
-              </w:r>
-              <w:r>
-                <w:rPr>
-                  <w:rStyle w:val="Hyperlink"/>
-                  <w:sz w:val="16"/>
-                  <w:szCs w:val="16"/>
-                </w:rPr>
-                <w:t>prasetyo</w:t>
-              </w:r>
-              <w:r>
-                <w:rPr>
-                  <w:rStyle w:val="Hyperlink"/>
-                  <w:sz w:val="16"/>
-                  <w:szCs w:val="16"/>
-                </w:rPr>
-                <w:t>@perusahaan.com</w:t>
+                <w:t>ibnu.prasetyo@perusahaan.com</w:t>
               </w:r>
             </w:hyperlink>
           </w:p>
@@ -5806,7 +6642,15 @@
                 <w:sz w:val="16"/>
                 <w:szCs w:val="16"/>
               </w:rPr>
-              <w:t>081212121221</w:t>
+              <w:t>+628211178</w:t>
+            </w:r>
+            <w:r>
+              <w:rPr>
+                <w:color w:val="333333"/>
+                <w:sz w:val="16"/>
+                <w:szCs w:val="16"/>
+              </w:rPr>
+              <w:t>4160</w:t>
             </w:r>
           </w:p>
         </w:tc>
@@ -5836,6 +6680,7 @@
                 <w:szCs w:val="18"/>
               </w:rPr>
             </w:pPr>
+            <w:proofErr w:type="spellStart"/>
             <w:r>
               <w:rPr>
                 <w:color w:val="333333"/>
@@ -5844,6 +6689,7 @@
               </w:rPr>
               <w:t>Belanda</w:t>
             </w:r>
+            <w:proofErr w:type="spellEnd"/>
           </w:p>
         </w:tc>
         <w:tc>
@@ -5875,6 +6721,7 @@
                 <w:szCs w:val="16"/>
               </w:rPr>
             </w:pPr>
+            <w:proofErr w:type="spellStart"/>
             <w:r>
               <w:rPr>
                 <w:b/>
@@ -5885,6 +6732,7 @@
               </w:rPr>
               <w:t>Aktif</w:t>
             </w:r>
+            <w:proofErr w:type="spellEnd"/>
           </w:p>
         </w:tc>
         <w:tc>
@@ -5920,7 +6768,25 @@
                 <w:sz w:val="16"/>
                 <w:szCs w:val="16"/>
               </w:rPr>
-              <w:t>20 jan 2026</w:t>
+              <w:t xml:space="preserve">20 </w:t>
+            </w:r>
+            <w:proofErr w:type="spellStart"/>
+            <w:r>
+              <w:rPr>
+                <w:color w:val="333333"/>
+                <w:sz w:val="16"/>
+                <w:szCs w:val="16"/>
+              </w:rPr>
+              <w:t>jan</w:t>
+            </w:r>
+            <w:proofErr w:type="spellEnd"/>
+            <w:r>
+              <w:rPr>
+                <w:color w:val="333333"/>
+                <w:sz w:val="16"/>
+                <w:szCs w:val="16"/>
+              </w:rPr>
+              <w:t xml:space="preserve"> 2026</w:t>
             </w:r>
           </w:p>
         </w:tc>
@@ -5935,9 +6801,19 @@
       <w:pPr>
         <w:pStyle w:val="Heading2"/>
       </w:pPr>
+      <w:proofErr w:type="spellStart"/>
       <w:r>
-        <w:t>Ringkasan per Departemen</w:t>
+        <w:t>Ringkasan</w:t>
       </w:r>
+      <w:proofErr w:type="spellEnd"/>
+      <w:r>
+        <w:t xml:space="preserve"> per </w:t>
+      </w:r>
+      <w:proofErr w:type="spellStart"/>
+      <w:r>
+        <w:t>Departemen</w:t>
+      </w:r>
+      <w:proofErr w:type="spellEnd"/>
     </w:p>
     <w:tbl>
       <w:tblPr>
@@ -5987,6 +6863,7 @@
             <w:pPr>
               <w:jc w:val="center"/>
             </w:pPr>
+            <w:proofErr w:type="spellStart"/>
             <w:r>
               <w:rPr>
                 <w:b/>
@@ -5997,6 +6874,7 @@
               </w:rPr>
               <w:t>Departemen</w:t>
             </w:r>
+            <w:proofErr w:type="spellEnd"/>
           </w:p>
         </w:tc>
         <w:tc>
@@ -6021,6 +6899,7 @@
             <w:pPr>
               <w:jc w:val="center"/>
             </w:pPr>
+            <w:proofErr w:type="spellStart"/>
             <w:r>
               <w:rPr>
                 <w:b/>
@@ -6029,8 +6908,31 @@
                 <w:sz w:val="18"/>
                 <w:szCs w:val="18"/>
               </w:rPr>
-              <w:t>Jumlah Karyawan</w:t>
-            </w:r>
+              <w:t>Jumlah</w:t>
+            </w:r>
+            <w:proofErr w:type="spellEnd"/>
+            <w:r>
+              <w:rPr>
+                <w:b/>
+                <w:bCs/>
+                <w:color w:val="FFFFFF"/>
+                <w:sz w:val="18"/>
+                <w:szCs w:val="18"/>
+              </w:rPr>
+              <w:t xml:space="preserve"> </w:t>
+            </w:r>
+            <w:proofErr w:type="spellStart"/>
+            <w:r>
+              <w:rPr>
+                <w:b/>
+                <w:bCs/>
+                <w:color w:val="FFFFFF"/>
+                <w:sz w:val="18"/>
+                <w:szCs w:val="18"/>
+              </w:rPr>
+              <w:t>Karyawan</w:t>
+            </w:r>
+            <w:proofErr w:type="spellEnd"/>
           </w:p>
         </w:tc>
         <w:tc>
@@ -6055,6 +6957,7 @@
             <w:pPr>
               <w:jc w:val="center"/>
             </w:pPr>
+            <w:proofErr w:type="spellStart"/>
             <w:r>
               <w:rPr>
                 <w:b/>
@@ -6065,6 +6968,7 @@
               </w:rPr>
               <w:t>Persentase</w:t>
             </w:r>
+            <w:proofErr w:type="spellEnd"/>
           </w:p>
         </w:tc>
       </w:tr>
@@ -6088,14 +6992,34 @@
             <w:vAlign w:val="center"/>
           </w:tcPr>
           <w:p>
-            <w:r>
-              <w:rPr>
-                <w:color w:val="333333"/>
-                <w:sz w:val="18"/>
-                <w:szCs w:val="18"/>
-              </w:rPr>
-              <w:t>Teknologi Informasi</w:t>
-            </w:r>
+            <w:proofErr w:type="spellStart"/>
+            <w:r>
+              <w:rPr>
+                <w:color w:val="333333"/>
+                <w:sz w:val="18"/>
+                <w:szCs w:val="18"/>
+              </w:rPr>
+              <w:t>Teknologi</w:t>
+            </w:r>
+            <w:proofErr w:type="spellEnd"/>
+            <w:r>
+              <w:rPr>
+                <w:color w:val="333333"/>
+                <w:sz w:val="18"/>
+                <w:szCs w:val="18"/>
+              </w:rPr>
+              <w:t xml:space="preserve"> </w:t>
+            </w:r>
+            <w:proofErr w:type="spellStart"/>
+            <w:r>
+              <w:rPr>
+                <w:color w:val="333333"/>
+                <w:sz w:val="18"/>
+                <w:szCs w:val="18"/>
+              </w:rPr>
+              <w:t>Informasi</w:t>
+            </w:r>
+            <w:proofErr w:type="spellEnd"/>
           </w:p>
         </w:tc>
         <w:tc>
@@ -6178,14 +7102,52 @@
             <w:vAlign w:val="center"/>
           </w:tcPr>
           <w:p>
-            <w:r>
-              <w:rPr>
-                <w:color w:val="333333"/>
-                <w:sz w:val="18"/>
-                <w:szCs w:val="18"/>
-              </w:rPr>
-              <w:t>Sumber Daya Manusia</w:t>
-            </w:r>
+            <w:proofErr w:type="spellStart"/>
+            <w:r>
+              <w:rPr>
+                <w:color w:val="333333"/>
+                <w:sz w:val="18"/>
+                <w:szCs w:val="18"/>
+              </w:rPr>
+              <w:t>Sumber</w:t>
+            </w:r>
+            <w:proofErr w:type="spellEnd"/>
+            <w:r>
+              <w:rPr>
+                <w:color w:val="333333"/>
+                <w:sz w:val="18"/>
+                <w:szCs w:val="18"/>
+              </w:rPr>
+              <w:t xml:space="preserve"> </w:t>
+            </w:r>
+            <w:proofErr w:type="spellStart"/>
+            <w:r>
+              <w:rPr>
+                <w:color w:val="333333"/>
+                <w:sz w:val="18"/>
+                <w:szCs w:val="18"/>
+              </w:rPr>
+              <w:t>Daya</w:t>
+            </w:r>
+            <w:proofErr w:type="spellEnd"/>
+            <w:r>
+              <w:rPr>
+                <w:color w:val="333333"/>
+                <w:sz w:val="18"/>
+                <w:szCs w:val="18"/>
+              </w:rPr>
+              <w:t xml:space="preserve"> </w:t>
+            </w:r>
+            <w:proofErr w:type="spellStart"/>
+            <w:r>
+              <w:rPr>
+                <w:color w:val="333333"/>
+                <w:sz w:val="18"/>
+                <w:szCs w:val="18"/>
+              </w:rPr>
+              <w:t>Manusia</w:t>
+            </w:r>
+            <w:proofErr w:type="spellEnd"/>
           </w:p>
         </w:tc>
         <w:tc>
@@ -6275,6 +7237,7 @@
             <w:vAlign w:val="center"/>
           </w:tcPr>
           <w:p>
+            <w:proofErr w:type="spellStart"/>
             <w:r>
               <w:rPr>
                 <w:color w:val="333333"/>
@@ -6283,6 +7246,7 @@
               </w:rPr>
               <w:t>Keuangan</w:t>
             </w:r>
+            <w:proofErr w:type="spellEnd"/>
           </w:p>
         </w:tc>
         <w:tc>
@@ -6372,6 +7336,7 @@
             <w:vAlign w:val="center"/>
           </w:tcPr>
           <w:p>
+            <w:proofErr w:type="spellStart"/>
             <w:r>
               <w:rPr>
                 <w:color w:val="333333"/>
@@ -6380,6 +7345,7 @@
               </w:rPr>
               <w:t>Pemasaran</w:t>
             </w:r>
+            <w:proofErr w:type="spellEnd"/>
           </w:p>
         </w:tc>
         <w:tc>
@@ -6469,6 +7435,7 @@
             <w:vAlign w:val="center"/>
           </w:tcPr>
           <w:p>
+            <w:proofErr w:type="spellStart"/>
             <w:r>
               <w:rPr>
                 <w:color w:val="333333"/>
@@ -6477,6 +7444,7 @@
               </w:rPr>
               <w:t>Operasional</w:t>
             </w:r>
+            <w:proofErr w:type="spellEnd"/>
           </w:p>
         </w:tc>
         <w:tc>
@@ -6566,6 +7534,7 @@
             <w:vAlign w:val="center"/>
           </w:tcPr>
           <w:p>
+            <w:proofErr w:type="spellStart"/>
             <w:r>
               <w:rPr>
                 <w:color w:val="333333"/>
@@ -6574,6 +7543,7 @@
               </w:rPr>
               <w:t>Penjualan</w:t>
             </w:r>
+            <w:proofErr w:type="spellEnd"/>
           </w:p>
         </w:tc>
         <w:tc>
@@ -6663,14 +7633,34 @@
             <w:vAlign w:val="center"/>
           </w:tcPr>
           <w:p>
-            <w:r>
-              <w:rPr>
-                <w:color w:val="333333"/>
-                <w:sz w:val="18"/>
-                <w:szCs w:val="18"/>
-              </w:rPr>
-              <w:t>Hukum &amp; Kepatuhan</w:t>
-            </w:r>
+            <w:proofErr w:type="spellStart"/>
+            <w:r>
+              <w:rPr>
+                <w:color w:val="333333"/>
+                <w:sz w:val="18"/>
+                <w:szCs w:val="18"/>
+              </w:rPr>
+              <w:t>Hukum</w:t>
+            </w:r>
+            <w:proofErr w:type="spellEnd"/>
+            <w:r>
+              <w:rPr>
+                <w:color w:val="333333"/>
+                <w:sz w:val="18"/>
+                <w:szCs w:val="18"/>
+              </w:rPr>
+              <w:t xml:space="preserve"> &amp; </w:t>
+            </w:r>
+            <w:proofErr w:type="spellStart"/>
+            <w:r>
+              <w:rPr>
+                <w:color w:val="333333"/>
+                <w:sz w:val="18"/>
+                <w:szCs w:val="18"/>
+              </w:rPr>
+              <w:t>Kepatuhan</w:t>
+            </w:r>
+            <w:proofErr w:type="spellEnd"/>
           </w:p>
         </w:tc>
         <w:tc>
@@ -6851,8 +7841,186 @@
       <w:pPr>
         <w:pStyle w:val="Heading2"/>
       </w:pPr>
+      <w:proofErr w:type="spellStart"/>
       <w:r>
         <w:t>Catatan</w:t>
+      </w:r>
+      <w:proofErr w:type="spellEnd"/>
+    </w:p>
+    <w:p>
+      <w:pPr>
+        <w:spacing w:after="120"/>
+      </w:pPr>
+      <w:r>
+        <w:rPr>
+          <w:color w:val="444444"/>
+          <w:sz w:val="20"/>
+          <w:szCs w:val="20"/>
+        </w:rPr>
+        <w:lastRenderedPageBreak/>
+        <w:t xml:space="preserve">1.  </w:t>
+      </w:r>
+      <w:proofErr w:type="spellStart"/>
+      <w:r>
+        <w:rPr>
+          <w:color w:val="444444"/>
+          <w:sz w:val="20"/>
+          <w:szCs w:val="20"/>
+        </w:rPr>
+        <w:t>Dokumen</w:t>
+      </w:r>
+      <w:proofErr w:type="spellEnd"/>
+      <w:r>
+        <w:rPr>
+          <w:color w:val="444444"/>
+          <w:sz w:val="20"/>
+          <w:szCs w:val="20"/>
+        </w:rPr>
+        <w:t xml:space="preserve"> </w:t>
+      </w:r>
+      <w:proofErr w:type="spellStart"/>
+      <w:r>
+        <w:rPr>
+          <w:color w:val="444444"/>
+          <w:sz w:val="20"/>
+          <w:szCs w:val="20"/>
+        </w:rPr>
+        <w:t>ini</w:t>
+      </w:r>
+      <w:proofErr w:type="spellEnd"/>
+      <w:r>
+        <w:rPr>
+          <w:color w:val="444444"/>
+          <w:sz w:val="20"/>
+          <w:szCs w:val="20"/>
+        </w:rPr>
+        <w:t xml:space="preserve"> </w:t>
+      </w:r>
+      <w:proofErr w:type="spellStart"/>
+      <w:r>
+        <w:rPr>
+          <w:color w:val="444444"/>
+          <w:sz w:val="20"/>
+          <w:szCs w:val="20"/>
+        </w:rPr>
+        <w:t>bersifat</w:t>
+      </w:r>
+      <w:proofErr w:type="spellEnd"/>
+      <w:r>
+        <w:rPr>
+          <w:color w:val="444444"/>
+          <w:sz w:val="20"/>
+          <w:szCs w:val="20"/>
+        </w:rPr>
+        <w:t xml:space="preserve"> </w:t>
+      </w:r>
+      <w:proofErr w:type="spellStart"/>
+      <w:r>
+        <w:rPr>
+          <w:color w:val="444444"/>
+          <w:sz w:val="20"/>
+          <w:szCs w:val="20"/>
+        </w:rPr>
+        <w:t>rahasia</w:t>
+      </w:r>
+      <w:proofErr w:type="spellEnd"/>
+      <w:r>
+        <w:rPr>
+          <w:color w:val="444444"/>
+          <w:sz w:val="20"/>
+          <w:szCs w:val="20"/>
+        </w:rPr>
+        <w:t xml:space="preserve"> </w:t>
+      </w:r>
+      <w:proofErr w:type="spellStart"/>
+      <w:r>
+        <w:rPr>
+          <w:color w:val="444444"/>
+          <w:sz w:val="20"/>
+          <w:szCs w:val="20"/>
+        </w:rPr>
+        <w:t>dan</w:t>
+      </w:r>
+      <w:proofErr w:type="spellEnd"/>
+      <w:r>
+        <w:rPr>
+          <w:color w:val="444444"/>
+          <w:sz w:val="20"/>
+          <w:szCs w:val="20"/>
+        </w:rPr>
+        <w:t xml:space="preserve"> </w:t>
+      </w:r>
+      <w:proofErr w:type="spellStart"/>
+      <w:r>
+        <w:rPr>
+          <w:color w:val="444444"/>
+          <w:sz w:val="20"/>
+          <w:szCs w:val="20"/>
+        </w:rPr>
+        <w:t>hanya</w:t>
+      </w:r>
+      <w:proofErr w:type="spellEnd"/>
+      <w:r>
+        <w:rPr>
+          <w:color w:val="444444"/>
+          <w:sz w:val="20"/>
+          <w:szCs w:val="20"/>
+        </w:rPr>
+        <w:t xml:space="preserve"> </w:t>
+      </w:r>
+      <w:proofErr w:type="spellStart"/>
+      <w:r>
+        <w:rPr>
+          <w:color w:val="444444"/>
+          <w:sz w:val="20"/>
+          <w:szCs w:val="20"/>
+        </w:rPr>
+        <w:t>untuk</w:t>
+      </w:r>
+      <w:proofErr w:type="spellEnd"/>
+      <w:r>
+        <w:rPr>
+          <w:color w:val="444444"/>
+          <w:sz w:val="20"/>
+          <w:szCs w:val="20"/>
+        </w:rPr>
+        <w:t xml:space="preserve"> </w:t>
+      </w:r>
+      <w:proofErr w:type="spellStart"/>
+      <w:r>
+        <w:rPr>
+          <w:color w:val="444444"/>
+          <w:sz w:val="20"/>
+          <w:szCs w:val="20"/>
+        </w:rPr>
+        <w:t>penggunaan</w:t>
+      </w:r>
+      <w:proofErr w:type="spellEnd"/>
+      <w:r>
+        <w:rPr>
+          <w:color w:val="444444"/>
+          <w:sz w:val="20"/>
+          <w:szCs w:val="20"/>
+        </w:rPr>
+        <w:t xml:space="preserve"> internal </w:t>
+      </w:r>
+      <w:proofErr w:type="spellStart"/>
+      <w:r>
+        <w:rPr>
+          <w:color w:val="444444"/>
+          <w:sz w:val="20"/>
+          <w:szCs w:val="20"/>
+        </w:rPr>
+        <w:t>perusahaan</w:t>
+      </w:r>
+      <w:proofErr w:type="spellEnd"/>
+      <w:r>
+        <w:rPr>
+          <w:color w:val="444444"/>
+          <w:sz w:val="20"/>
+          <w:szCs w:val="20"/>
+        </w:rPr>
+        <w:t>.</w:t>
       </w:r>
     </w:p>
     <w:p>
@@ -6865,8 +8033,169 @@
           <w:sz w:val="20"/>
           <w:szCs w:val="20"/>
         </w:rPr>
-        <w:lastRenderedPageBreak/>
-        <w:t>1.  Dokumen ini bersifat rahasia dan hanya untuk penggunaan internal perusahaan.</w:t>
+        <w:t xml:space="preserve">2.  Data </w:t>
+      </w:r>
+      <w:proofErr w:type="spellStart"/>
+      <w:r>
+        <w:rPr>
+          <w:color w:val="444444"/>
+          <w:sz w:val="20"/>
+          <w:szCs w:val="20"/>
+        </w:rPr>
+        <w:t>karyawan</w:t>
+      </w:r>
+      <w:proofErr w:type="spellEnd"/>
+      <w:r>
+        <w:rPr>
+          <w:color w:val="444444"/>
+          <w:sz w:val="20"/>
+          <w:szCs w:val="20"/>
+        </w:rPr>
+        <w:t xml:space="preserve"> </w:t>
+      </w:r>
+      <w:proofErr w:type="spellStart"/>
+      <w:r>
+        <w:rPr>
+          <w:color w:val="444444"/>
+          <w:sz w:val="20"/>
+          <w:szCs w:val="20"/>
+        </w:rPr>
+        <w:t>diperbarui</w:t>
+      </w:r>
+      <w:proofErr w:type="spellEnd"/>
+      <w:r>
+        <w:rPr>
+          <w:color w:val="444444"/>
+          <w:sz w:val="20"/>
+          <w:szCs w:val="20"/>
+        </w:rPr>
+        <w:t xml:space="preserve"> </w:t>
+      </w:r>
+      <w:proofErr w:type="spellStart"/>
+      <w:r>
+        <w:rPr>
+          <w:color w:val="444444"/>
+          <w:sz w:val="20"/>
+          <w:szCs w:val="20"/>
+        </w:rPr>
+        <w:t>secara</w:t>
+      </w:r>
+      <w:proofErr w:type="spellEnd"/>
+      <w:r>
+        <w:rPr>
+          <w:color w:val="444444"/>
+          <w:sz w:val="20"/>
+          <w:szCs w:val="20"/>
+        </w:rPr>
+        <w:t xml:space="preserve"> </w:t>
+      </w:r>
+      <w:proofErr w:type="spellStart"/>
+      <w:r>
+        <w:rPr>
+          <w:color w:val="444444"/>
+          <w:sz w:val="20"/>
+          <w:szCs w:val="20"/>
+        </w:rPr>
+        <w:t>berkala</w:t>
+      </w:r>
+      <w:proofErr w:type="spellEnd"/>
+      <w:r>
+        <w:rPr>
+          <w:color w:val="444444"/>
+          <w:sz w:val="20"/>
+          <w:szCs w:val="20"/>
+        </w:rPr>
+        <w:t xml:space="preserve"> </w:t>
+      </w:r>
+      <w:proofErr w:type="spellStart"/>
+      <w:r>
+        <w:rPr>
+          <w:color w:val="444444"/>
+          <w:sz w:val="20"/>
+          <w:szCs w:val="20"/>
+        </w:rPr>
+        <w:t>oleh</w:t>
+      </w:r>
+      <w:proofErr w:type="spellEnd"/>
+      <w:r>
+        <w:rPr>
+          <w:color w:val="444444"/>
+          <w:sz w:val="20"/>
+          <w:szCs w:val="20"/>
+        </w:rPr>
+        <w:t xml:space="preserve"> </w:t>
+      </w:r>
+      <w:proofErr w:type="spellStart"/>
+      <w:r>
+        <w:rPr>
+          <w:color w:val="444444"/>
+          <w:sz w:val="20"/>
+          <w:szCs w:val="20"/>
+        </w:rPr>
+        <w:t>Divisi</w:t>
+      </w:r>
+      <w:proofErr w:type="spellEnd"/>
+      <w:r>
+        <w:rPr>
+          <w:color w:val="444444"/>
+          <w:sz w:val="20"/>
+          <w:szCs w:val="20"/>
+        </w:rPr>
+        <w:t xml:space="preserve"> </w:t>
+      </w:r>
+      <w:proofErr w:type="spellStart"/>
+      <w:r>
+        <w:rPr>
+          <w:color w:val="444444"/>
+          <w:sz w:val="20"/>
+          <w:szCs w:val="20"/>
+        </w:rPr>
+        <w:t>Sumber</w:t>
+      </w:r>
+      <w:proofErr w:type="spellEnd"/>
+      <w:r>
+        <w:rPr>
+          <w:color w:val="444444"/>
+          <w:sz w:val="20"/>
+          <w:szCs w:val="20"/>
+        </w:rPr>
+        <w:t xml:space="preserve"> </w:t>
+      </w:r>
+      <w:proofErr w:type="spellStart"/>
+      <w:r>
+        <w:rPr>
+          <w:color w:val="444444"/>
+          <w:sz w:val="20"/>
+          <w:szCs w:val="20"/>
+        </w:rPr>
+        <w:t>Daya</w:t>
+      </w:r>
+      <w:proofErr w:type="spellEnd"/>
+      <w:r>
+        <w:rPr>
+          <w:color w:val="444444"/>
+          <w:sz w:val="20"/>
+          <w:szCs w:val="20"/>
+        </w:rPr>
+        <w:t xml:space="preserve"> </w:t>
+      </w:r>
+      <w:proofErr w:type="spellStart"/>
+      <w:r>
+        <w:rPr>
+          <w:color w:val="444444"/>
+          <w:sz w:val="20"/>
+          <w:szCs w:val="20"/>
+        </w:rPr>
+        <w:t>Manusia</w:t>
+      </w:r>
+      <w:proofErr w:type="spellEnd"/>
+      <w:r>
+        <w:rPr>
+          <w:color w:val="444444"/>
+          <w:sz w:val="20"/>
+          <w:szCs w:val="20"/>
+        </w:rPr>
+        <w:t>.</w:t>
       </w:r>
     </w:p>
     <w:p>
@@ -6879,7 +8208,133 @@
           <w:sz w:val="20"/>
           <w:szCs w:val="20"/>
         </w:rPr>
-        <w:t>2.  Data karyawan diperbarui secara berkala oleh Divisi Sumber Daya Manusia.</w:t>
+        <w:t>3.  Status "</w:t>
+      </w:r>
+      <w:proofErr w:type="spellStart"/>
+      <w:r>
+        <w:rPr>
+          <w:color w:val="444444"/>
+          <w:sz w:val="20"/>
+          <w:szCs w:val="20"/>
+        </w:rPr>
+        <w:t>Cuti</w:t>
+      </w:r>
+      <w:proofErr w:type="spellEnd"/>
+      <w:r>
+        <w:rPr>
+          <w:color w:val="444444"/>
+          <w:sz w:val="20"/>
+          <w:szCs w:val="20"/>
+        </w:rPr>
+        <w:t xml:space="preserve">" </w:t>
+      </w:r>
+      <w:proofErr w:type="spellStart"/>
+      <w:r>
+        <w:rPr>
+          <w:color w:val="444444"/>
+          <w:sz w:val="20"/>
+          <w:szCs w:val="20"/>
+        </w:rPr>
+        <w:t>menandakan</w:t>
+      </w:r>
+      <w:proofErr w:type="spellEnd"/>
+      <w:r>
+        <w:rPr>
+          <w:color w:val="444444"/>
+          <w:sz w:val="20"/>
+          <w:szCs w:val="20"/>
+        </w:rPr>
+        <w:t xml:space="preserve"> </w:t>
+      </w:r>
+      <w:proofErr w:type="spellStart"/>
+      <w:r>
+        <w:rPr>
+          <w:color w:val="444444"/>
+          <w:sz w:val="20"/>
+          <w:szCs w:val="20"/>
+        </w:rPr>
+        <w:t>karyawan</w:t>
+      </w:r>
+      <w:proofErr w:type="spellEnd"/>
+      <w:r>
+        <w:rPr>
+          <w:color w:val="444444"/>
+          <w:sz w:val="20"/>
+          <w:szCs w:val="20"/>
+        </w:rPr>
+        <w:t xml:space="preserve"> </w:t>
+      </w:r>
+      <w:proofErr w:type="spellStart"/>
+      <w:r>
+        <w:rPr>
+          <w:color w:val="444444"/>
+          <w:sz w:val="20"/>
+          <w:szCs w:val="20"/>
+        </w:rPr>
+        <w:t>sedang</w:t>
+      </w:r>
+      <w:proofErr w:type="spellEnd"/>
+      <w:r>
+        <w:rPr>
+          <w:color w:val="444444"/>
+          <w:sz w:val="20"/>
+          <w:szCs w:val="20"/>
+        </w:rPr>
+        <w:t xml:space="preserve"> </w:t>
+      </w:r>
+      <w:proofErr w:type="spellStart"/>
+      <w:r>
+        <w:rPr>
+          <w:color w:val="444444"/>
+          <w:sz w:val="20"/>
+          <w:szCs w:val="20"/>
+        </w:rPr>
+        <w:t>dalam</w:t>
+      </w:r>
+      <w:proofErr w:type="spellEnd"/>
+      <w:r>
+        <w:rPr>
+          <w:color w:val="444444"/>
+          <w:sz w:val="20"/>
+          <w:szCs w:val="20"/>
+        </w:rPr>
+        <w:t xml:space="preserve"> masa </w:t>
+      </w:r>
+      <w:proofErr w:type="spellStart"/>
+      <w:r>
+        <w:rPr>
+          <w:color w:val="444444"/>
+          <w:sz w:val="20"/>
+          <w:szCs w:val="20"/>
+        </w:rPr>
+        <w:t>cuti</w:t>
+      </w:r>
+      <w:proofErr w:type="spellEnd"/>
+      <w:r>
+        <w:rPr>
+          <w:color w:val="444444"/>
+          <w:sz w:val="20"/>
+          <w:szCs w:val="20"/>
+        </w:rPr>
+        <w:t xml:space="preserve"> </w:t>
+      </w:r>
+      <w:proofErr w:type="spellStart"/>
+      <w:r>
+        <w:rPr>
+          <w:color w:val="444444"/>
+          <w:sz w:val="20"/>
+          <w:szCs w:val="20"/>
+        </w:rPr>
+        <w:t>resmi</w:t>
+      </w:r>
+      <w:proofErr w:type="spellEnd"/>
+      <w:r>
+        <w:rPr>
+          <w:color w:val="444444"/>
+          <w:sz w:val="20"/>
+          <w:szCs w:val="20"/>
+        </w:rPr>
+        <w:t>.</w:t>
       </w:r>
     </w:p>
     <w:p>
@@ -6892,20 +8347,115 @@
           <w:sz w:val="20"/>
           <w:szCs w:val="20"/>
         </w:rPr>
-        <w:t>3.  Status "Cuti" menandakan karyawan sedang dalam masa cuti resmi.</w:t>
+        <w:t xml:space="preserve">4.  </w:t>
       </w:r>
-    </w:p>
-    <w:p>
-      <w:pPr>
-        <w:spacing w:after="120"/>
-      </w:pPr>
+      <w:proofErr w:type="spellStart"/>
       <w:r>
         <w:rPr>
           <w:color w:val="444444"/>
           <w:sz w:val="20"/>
           <w:szCs w:val="20"/>
         </w:rPr>
-        <w:t>4.  Untuk informasi lebih lanjut, hubungi Departemen SDM di: sdm@perusahaan.co.id</w:t>
+        <w:t>Untuk</w:t>
+      </w:r>
+      <w:proofErr w:type="spellEnd"/>
+      <w:r>
+        <w:rPr>
+          <w:color w:val="444444"/>
+          <w:sz w:val="20"/>
+          <w:szCs w:val="20"/>
+        </w:rPr>
+        <w:t xml:space="preserve"> </w:t>
+      </w:r>
+      <w:proofErr w:type="spellStart"/>
+      <w:r>
+        <w:rPr>
+          <w:color w:val="444444"/>
+          <w:sz w:val="20"/>
+          <w:szCs w:val="20"/>
+        </w:rPr>
+        <w:t>informasi</w:t>
+      </w:r>
+      <w:proofErr w:type="spellEnd"/>
+      <w:r>
+        <w:rPr>
+          <w:color w:val="444444"/>
+          <w:sz w:val="20"/>
+          <w:szCs w:val="20"/>
+        </w:rPr>
+        <w:t xml:space="preserve"> </w:t>
+      </w:r>
+      <w:proofErr w:type="spellStart"/>
+      <w:r>
+        <w:rPr>
+          <w:color w:val="444444"/>
+          <w:sz w:val="20"/>
+          <w:szCs w:val="20"/>
+        </w:rPr>
+        <w:t>lebih</w:t>
+      </w:r>
+      <w:proofErr w:type="spellEnd"/>
+      <w:r>
+        <w:rPr>
+          <w:color w:val="444444"/>
+          <w:sz w:val="20"/>
+          <w:szCs w:val="20"/>
+        </w:rPr>
+        <w:t xml:space="preserve"> </w:t>
+      </w:r>
+      <w:proofErr w:type="spellStart"/>
+      <w:r>
+        <w:rPr>
+          <w:color w:val="444444"/>
+          <w:sz w:val="20"/>
+          <w:szCs w:val="20"/>
+        </w:rPr>
+        <w:t>lanjut</w:t>
+      </w:r>
+      <w:proofErr w:type="spellEnd"/>
+      <w:r>
+        <w:rPr>
+          <w:color w:val="444444"/>
+          <w:sz w:val="20"/>
+          <w:szCs w:val="20"/>
+        </w:rPr>
+        <w:t xml:space="preserve">, </w:t>
+      </w:r>
+      <w:proofErr w:type="spellStart"/>
+      <w:r>
+        <w:rPr>
+          <w:color w:val="444444"/>
+          <w:sz w:val="20"/>
+          <w:szCs w:val="20"/>
+        </w:rPr>
+        <w:t>hubungi</w:t>
+      </w:r>
+      <w:proofErr w:type="spellEnd"/>
+      <w:r>
+        <w:rPr>
+          <w:color w:val="444444"/>
+          <w:sz w:val="20"/>
+          <w:szCs w:val="20"/>
+        </w:rPr>
+        <w:t xml:space="preserve"> </w:t>
+      </w:r>
+      <w:proofErr w:type="spellStart"/>
+      <w:r>
+        <w:rPr>
+          <w:color w:val="444444"/>
+          <w:sz w:val="20"/>
+          <w:szCs w:val="20"/>
+        </w:rPr>
+        <w:t>Departemen</w:t>
+      </w:r>
+      <w:proofErr w:type="spellEnd"/>
+      <w:r>
+        <w:rPr>
+          <w:color w:val="444444"/>
+          <w:sz w:val="20"/>
+          <w:szCs w:val="20"/>
+        </w:rPr>
+        <w:t xml:space="preserve"> SDM di: sdm@perusahaan.co.id</w:t>
       </w:r>
     </w:p>
     <w:sectPr>
@@ -6921,7 +8471,7 @@
 </file>
 
 <file path=word/endnotes.xml><?xml version="1.0" encoding="utf-8"?>
-<w:endnotes xmlns:wpc="http://schemas.microsoft.com/office/word/2010/wordprocessingCanvas" xmlns:cx="http://schemas.microsoft.com/office/drawing/2014/chartex" xmlns:cx1="http://schemas.microsoft.com/office/drawing/2015/9/8/chartex" xmlns:cx2="http://schemas.microsoft.com/office/drawing/2015/10/21/chartex" xmlns:cx3="http://schemas.microsoft.com/office/drawing/2016/5/9/chartex" xmlns:cx4="http://schemas.microsoft.com/office/drawing/2016/5/10/chartex" xmlns:cx5="http://schemas.microsoft.com/office/drawing/2016/5/11/chartex" xmlns:cx6="http://schemas.microsoft.com/office/drawing/2016/5/12/chartex" xmlns:cx7="http://schemas.microsoft.com/office/drawing/2016/5/13/chartex" xmlns:cx8="http://schemas.microsoft.com/office/drawing/2016/5/14/chartex" xmlns:mc="http://schemas.openxmlformats.org/markup-compatibility/2006" xmlns:aink="http://schemas.microsoft.com/office/drawing/2016/ink" xmlns:am3d="http://schemas.microsoft.com/office/drawing/2017/model3d" xmlns:o="urn:schemas-microsoft-com:office:office" xmlns:oel="http://schemas.microsoft.com/office/2019/extlst" xmlns:r="http://schemas.openxmlformats.org/officeDocument/2006/relationships" xmlns:m="http://schemas.openxmlformats.org/officeDocument/2006/math" xmlns:v="urn:schemas-microsoft-com:vml" xmlns:wp14="http://schemas.microsoft.com/office/word/2010/wordprocessingDrawing" xmlns:wp="http://schemas.openxmlformats.org/drawingml/2006/wordprocessingDrawing" xmlns:w10="urn:schemas-microsoft-com:office:word" xmlns:w="http://schemas.openxmlformats.org/wordprocessingml/2006/main" xmlns:w14="http://schemas.microsoft.com/office/word/2010/wordml" xmlns:w15="http://schemas.microsoft.com/office/word/2012/wordml" xmlns:w16cex="http://schemas.microsoft.com/office/word/2018/wordml/cex" xmlns:w16cid="http://schemas.microsoft.com/office/word/2016/wordml/cid" xmlns:w16="http://schemas.microsoft.com/office/word/2018/wordml" xmlns:w16du="http://schemas.microsoft.com/office/word/2023/wordml/word16du" xmlns:w16sdtdh="http://schemas.microsoft.com/office/word/2020/wordml/sdtdatahash" xmlns:w16sdtfl="http://schemas.microsoft.com/office/word/2024/wordml/sdtformatlock" xmlns:w16se="http://schemas.microsoft.com/office/word/2015/wordml/symex" xmlns:wpg="http://schemas.microsoft.com/office/word/2010/wordprocessingGroup" xmlns:wpi="http://schemas.microsoft.com/office/word/2010/wordprocessingInk" xmlns:wne="http://schemas.microsoft.com/office/word/2006/wordml" xmlns:wps="http://schemas.microsoft.com/office/word/2010/wordprocessingShape" mc:Ignorable="w14 w15 w16se w16cid w16 w16cex w16sdtdh w16sdtfl w16du wp14">
+<w:endnotes xmlns:wpc="http://schemas.microsoft.com/office/word/2010/wordprocessingCanvas" xmlns:mc="http://schemas.openxmlformats.org/markup-compatibility/2006" xmlns:o="urn:schemas-microsoft-com:office:office" xmlns:r="http://schemas.openxmlformats.org/officeDocument/2006/relationships" xmlns:m="http://schemas.openxmlformats.org/officeDocument/2006/math" xmlns:v="urn:schemas-microsoft-com:vml" xmlns:wp14="http://schemas.microsoft.com/office/word/2010/wordprocessingDrawing" xmlns:wp="http://schemas.openxmlformats.org/drawingml/2006/wordprocessingDrawing" xmlns:w10="urn:schemas-microsoft-com:office:word" xmlns:w="http://schemas.openxmlformats.org/wordprocessingml/2006/main" xmlns:w14="http://schemas.microsoft.com/office/word/2010/wordml" xmlns:w15="http://schemas.microsoft.com/office/word/2012/wordml" xmlns:wpg="http://schemas.microsoft.com/office/word/2010/wordprocessingGroup" xmlns:wpi="http://schemas.microsoft.com/office/word/2010/wordprocessingInk" xmlns:wne="http://schemas.microsoft.com/office/word/2006/wordml" xmlns:wps="http://schemas.microsoft.com/office/word/2010/wordprocessingShape" mc:Ignorable="w14 w15 wp14">
   <w:endnote w:type="separator" w:id="-1">
     <w:p>
       <w:r>
@@ -6940,7 +8490,7 @@
 </file>
 
 <file path=word/footer1.xml><?xml version="1.0" encoding="utf-8"?>
-<w:ftr xmlns:wpc="http://schemas.microsoft.com/office/word/2010/wordprocessingCanvas" xmlns:cx="http://schemas.microsoft.com/office/drawing/2014/chartex" xmlns:cx1="http://schemas.microsoft.com/office/drawing/2015/9/8/chartex" xmlns:cx2="http://schemas.microsoft.com/office/drawing/2015/10/21/chartex" xmlns:cx3="http://schemas.microsoft.com/office/drawing/2016/5/9/chartex" xmlns:cx4="http://schemas.microsoft.com/office/drawing/2016/5/10/chartex" xmlns:cx5="http://schemas.microsoft.com/office/drawing/2016/5/11/chartex" xmlns:cx6="http://schemas.microsoft.com/office/drawing/2016/5/12/chartex" xmlns:cx7="http://schemas.microsoft.com/office/drawing/2016/5/13/chartex" xmlns:cx8="http://schemas.microsoft.com/office/drawing/2016/5/14/chartex" xmlns:mc="http://schemas.openxmlformats.org/markup-compatibility/2006" xmlns:aink="http://schemas.microsoft.com/office/drawing/2016/ink" xmlns:am3d="http://schemas.microsoft.com/office/drawing/2017/model3d" xmlns:o="urn:schemas-microsoft-com:office:office" xmlns:oel="http://schemas.microsoft.com/office/2019/extlst" xmlns:r="http://schemas.openxmlformats.org/officeDocument/2006/relationships" xmlns:m="http://schemas.openxmlformats.org/officeDocument/2006/math" xmlns:v="urn:schemas-microsoft-com:vml" xmlns:wp14="http://schemas.microsoft.com/office/word/2010/wordprocessingDrawing" xmlns:wp="http://schemas.openxmlformats.org/drawingml/2006/wordprocessingDrawing" xmlns:w10="urn:schemas-microsoft-com:office:word" xmlns:w="http://schemas.openxmlformats.org/wordprocessingml/2006/main" xmlns:w14="http://schemas.microsoft.com/office/word/2010/wordml" xmlns:w15="http://schemas.microsoft.com/office/word/2012/wordml" xmlns:w16cex="http://schemas.microsoft.com/office/word/2018/wordml/cex" xmlns:w16cid="http://schemas.microsoft.com/office/word/2016/wordml/cid" xmlns:w16="http://schemas.microsoft.com/office/word/2018/wordml" xmlns:w16du="http://schemas.microsoft.com/office/word/2023/wordml/word16du" xmlns:w16sdtdh="http://schemas.microsoft.com/office/word/2020/wordml/sdtdatahash" xmlns:w16sdtfl="http://schemas.microsoft.com/office/word/2024/wordml/sdtformatlock" xmlns:w16se="http://schemas.microsoft.com/office/word/2015/wordml/symex" xmlns:wpg="http://schemas.microsoft.com/office/word/2010/wordprocessingGroup" xmlns:wpi="http://schemas.microsoft.com/office/word/2010/wordprocessingInk" xmlns:wne="http://schemas.microsoft.com/office/word/2006/wordml" xmlns:wps="http://schemas.microsoft.com/office/word/2010/wordprocessingShape" mc:Ignorable="w14 w15 w16se w16cid w16 w16cex w16sdtdh w16sdtfl w16du wp14">
+<w:ftr xmlns:wpc="http://schemas.microsoft.com/office/word/2010/wordprocessingCanvas" xmlns:mc="http://schemas.openxmlformats.org/markup-compatibility/2006" xmlns:o="urn:schemas-microsoft-com:office:office" xmlns:r="http://schemas.openxmlformats.org/officeDocument/2006/relationships" xmlns:m="http://schemas.openxmlformats.org/officeDocument/2006/math" xmlns:v="urn:schemas-microsoft-com:vml" xmlns:wp14="http://schemas.microsoft.com/office/word/2010/wordprocessingDrawing" xmlns:wp="http://schemas.openxmlformats.org/drawingml/2006/wordprocessingDrawing" xmlns:w10="urn:schemas-microsoft-com:office:word" xmlns:w="http://schemas.openxmlformats.org/wordprocessingml/2006/main" xmlns:w14="http://schemas.microsoft.com/office/word/2010/wordml" xmlns:w15="http://schemas.microsoft.com/office/word/2012/wordml" xmlns:wpg="http://schemas.microsoft.com/office/word/2010/wordprocessingGroup" xmlns:wpi="http://schemas.microsoft.com/office/word/2010/wordprocessingInk" xmlns:wne="http://schemas.microsoft.com/office/word/2006/wordml" xmlns:wps="http://schemas.microsoft.com/office/word/2010/wordprocessingShape" mc:Ignorable="w14 w15 wp14">
   <w:p>
     <w:pPr>
       <w:pBdr>
@@ -6957,7 +8507,115 @@
         <w:sz w:val="16"/>
         <w:szCs w:val="16"/>
       </w:rPr>
-      <w:t>© 2025 PT. Maju Bersama Indonesia. Dokumen ini bersifat rahasia.</w:t>
+      <w:t xml:space="preserve">© 2025 PT. </w:t>
+    </w:r>
+    <w:proofErr w:type="spellStart"/>
+    <w:r>
+      <w:rPr>
+        <w:color w:val="888888"/>
+        <w:sz w:val="16"/>
+        <w:szCs w:val="16"/>
+      </w:rPr>
+      <w:t>Maju</w:t>
+    </w:r>
+    <w:proofErr w:type="spellEnd"/>
+    <w:r>
+      <w:rPr>
+        <w:color w:val="888888"/>
+        <w:sz w:val="16"/>
+        <w:szCs w:val="16"/>
+      </w:rPr>
+      <w:t xml:space="preserve"> </w:t>
+    </w:r>
+    <w:proofErr w:type="spellStart"/>
+    <w:r>
+      <w:rPr>
+        <w:color w:val="888888"/>
+        <w:sz w:val="16"/>
+        <w:szCs w:val="16"/>
+      </w:rPr>
+      <w:t>Bersama</w:t>
+    </w:r>
+    <w:proofErr w:type="spellEnd"/>
+    <w:r>
+      <w:rPr>
+        <w:color w:val="888888"/>
+        <w:sz w:val="16"/>
+        <w:szCs w:val="16"/>
+      </w:rPr>
+      <w:t xml:space="preserve"> Indonesia. </w:t>
+    </w:r>
+    <w:proofErr w:type="spellStart"/>
+    <w:r>
+      <w:rPr>
+        <w:color w:val="888888"/>
+        <w:sz w:val="16"/>
+        <w:szCs w:val="16"/>
+      </w:rPr>
+      <w:t>Dokumen</w:t>
+    </w:r>
+    <w:proofErr w:type="spellEnd"/>
+    <w:r>
+      <w:rPr>
+        <w:color w:val="888888"/>
+        <w:sz w:val="16"/>
+        <w:szCs w:val="16"/>
+      </w:rPr>
+      <w:t xml:space="preserve"> </w:t>
+    </w:r>
+    <w:proofErr w:type="spellStart"/>
+    <w:r>
+      <w:rPr>
+        <w:color w:val="888888"/>
+        <w:sz w:val="16"/>
+        <w:szCs w:val="16"/>
+      </w:rPr>
+      <w:t>ini</w:t>
+    </w:r>
+    <w:proofErr w:type="spellEnd"/>
+    <w:r>
+      <w:rPr>
+        <w:color w:val="888888"/>
+        <w:sz w:val="16"/>
+        <w:szCs w:val="16"/>
+      </w:rPr>
+      <w:t xml:space="preserve"> </w:t>
+    </w:r>
+    <w:proofErr w:type="spellStart"/>
+    <w:r>
+      <w:rPr>
+        <w:color w:val="888888"/>
+        <w:sz w:val="16"/>
+        <w:szCs w:val="16"/>
+      </w:rPr>
+      <w:t>bersifat</w:t>
+    </w:r>
+    <w:proofErr w:type="spellEnd"/>
+    <w:r>
+      <w:rPr>
+        <w:color w:val="888888"/>
+        <w:sz w:val="16"/>
+        <w:szCs w:val="16"/>
+      </w:rPr>
+      <w:t xml:space="preserve"> </w:t>
+    </w:r>
+    <w:proofErr w:type="spellStart"/>
+    <w:r>
+      <w:rPr>
+        <w:color w:val="888888"/>
+        <w:sz w:val="16"/>
+        <w:szCs w:val="16"/>
+      </w:rPr>
+      <w:t>rahasia</w:t>
+    </w:r>
+    <w:proofErr w:type="spellEnd"/>
+    <w:r>
+      <w:rPr>
+        <w:color w:val="888888"/>
+        <w:sz w:val="16"/>
+        <w:szCs w:val="16"/>
+      </w:rPr>
+      <w:t>.</w:t>
     </w:r>
     <w:r>
       <w:rPr>
@@ -6966,7 +8624,24 @@
         <w:szCs w:val="16"/>
       </w:rPr>
       <w:tab/>
-      <w:t xml:space="preserve">Halaman </w:t>
+    </w:r>
+    <w:proofErr w:type="spellStart"/>
+    <w:r>
+      <w:rPr>
+        <w:color w:val="888888"/>
+        <w:sz w:val="16"/>
+        <w:szCs w:val="16"/>
+      </w:rPr>
+      <w:t>Halaman</w:t>
+    </w:r>
+    <w:proofErr w:type="spellEnd"/>
+    <w:r>
+      <w:rPr>
+        <w:color w:val="888888"/>
+        <w:sz w:val="16"/>
+        <w:szCs w:val="16"/>
+      </w:rPr>
+      <w:t xml:space="preserve"> </w:t>
     </w:r>
     <w:r>
       <w:rPr>
@@ -6999,7 +8674,7 @@
         <w:sz w:val="16"/>
         <w:szCs w:val="16"/>
       </w:rPr>
-      <w:t>1</w:t>
+      <w:t>2</w:t>
     </w:r>
     <w:r>
       <w:rPr>
@@ -7014,7 +8689,7 @@
 </file>
 
 <file path=word/footnotes.xml><?xml version="1.0" encoding="utf-8"?>
-<w:footnotes xmlns:wpc="http://schemas.microsoft.com/office/word/2010/wordprocessingCanvas" xmlns:cx="http://schemas.microsoft.com/office/drawing/2014/chartex" xmlns:cx1="http://schemas.microsoft.com/office/drawing/2015/9/8/chartex" xmlns:cx2="http://schemas.microsoft.com/office/drawing/2015/10/21/chartex" xmlns:cx3="http://schemas.microsoft.com/office/drawing/2016/5/9/chartex" xmlns:cx4="http://schemas.microsoft.com/office/drawing/2016/5/10/chartex" xmlns:cx5="http://schemas.microsoft.com/office/drawing/2016/5/11/chartex" xmlns:cx6="http://schemas.microsoft.com/office/drawing/2016/5/12/chartex" xmlns:cx7="http://schemas.microsoft.com/office/drawing/2016/5/13/chartex" xmlns:cx8="http://schemas.microsoft.com/office/drawing/2016/5/14/chartex" xmlns:mc="http://schemas.openxmlformats.org/markup-compatibility/2006" xmlns:aink="http://schemas.microsoft.com/office/drawing/2016/ink" xmlns:am3d="http://schemas.microsoft.com/office/drawing/2017/model3d" xmlns:o="urn:schemas-microsoft-com:office:office" xmlns:oel="http://schemas.microsoft.com/office/2019/extlst" xmlns:r="http://schemas.openxmlformats.org/officeDocument/2006/relationships" xmlns:m="http://schemas.openxmlformats.org/officeDocument/2006/math" xmlns:v="urn:schemas-microsoft-com:vml" xmlns:wp14="http://schemas.microsoft.com/office/word/2010/wordprocessingDrawing" xmlns:wp="http://schemas.openxmlformats.org/drawingml/2006/wordprocessingDrawing" xmlns:w10="urn:schemas-microsoft-com:office:word" xmlns:w="http://schemas.openxmlformats.org/wordprocessingml/2006/main" xmlns:w14="http://schemas.microsoft.com/office/word/2010/wordml" xmlns:w15="http://schemas.microsoft.com/office/word/2012/wordml" xmlns:w16cex="http://schemas.microsoft.com/office/word/2018/wordml/cex" xmlns:w16cid="http://schemas.microsoft.com/office/word/2016/wordml/cid" xmlns:w16="http://schemas.microsoft.com/office/word/2018/wordml" xmlns:w16du="http://schemas.microsoft.com/office/word/2023/wordml/word16du" xmlns:w16sdtdh="http://schemas.microsoft.com/office/word/2020/wordml/sdtdatahash" xmlns:w16sdtfl="http://schemas.microsoft.com/office/word/2024/wordml/sdtformatlock" xmlns:w16se="http://schemas.microsoft.com/office/word/2015/wordml/symex" xmlns:wpg="http://schemas.microsoft.com/office/word/2010/wordprocessingGroup" xmlns:wpi="http://schemas.microsoft.com/office/word/2010/wordprocessingInk" xmlns:wne="http://schemas.microsoft.com/office/word/2006/wordml" xmlns:wps="http://schemas.microsoft.com/office/word/2010/wordprocessingShape" mc:Ignorable="w14 w15 w16se w16cid w16 w16cex w16sdtdh w16sdtfl w16du wp14">
+<w:footnotes xmlns:wpc="http://schemas.microsoft.com/office/word/2010/wordprocessingCanvas" xmlns:mc="http://schemas.openxmlformats.org/markup-compatibility/2006" xmlns:o="urn:schemas-microsoft-com:office:office" xmlns:r="http://schemas.openxmlformats.org/officeDocument/2006/relationships" xmlns:m="http://schemas.openxmlformats.org/officeDocument/2006/math" xmlns:v="urn:schemas-microsoft-com:vml" xmlns:wp14="http://schemas.microsoft.com/office/word/2010/wordprocessingDrawing" xmlns:wp="http://schemas.openxmlformats.org/drawingml/2006/wordprocessingDrawing" xmlns:w10="urn:schemas-microsoft-com:office:word" xmlns:w="http://schemas.openxmlformats.org/wordprocessingml/2006/main" xmlns:w14="http://schemas.microsoft.com/office/word/2010/wordml" xmlns:w15="http://schemas.microsoft.com/office/word/2012/wordml" xmlns:wpg="http://schemas.microsoft.com/office/word/2010/wordprocessingGroup" xmlns:wpi="http://schemas.microsoft.com/office/word/2010/wordprocessingInk" xmlns:wne="http://schemas.microsoft.com/office/word/2006/wordml" xmlns:wps="http://schemas.microsoft.com/office/word/2010/wordprocessingShape" mc:Ignorable="w14 w15 wp14">
   <w:footnote w:type="separator" w:id="-1">
     <w:p>
       <w:r>
@@ -7033,7 +8708,7 @@
 </file>
 
 <file path=word/header1.xml><?xml version="1.0" encoding="utf-8"?>
-<w:hdr xmlns:wpc="http://schemas.microsoft.com/office/word/2010/wordprocessingCanvas" xmlns:cx="http://schemas.microsoft.com/office/drawing/2014/chartex" xmlns:cx1="http://schemas.microsoft.com/office/drawing/2015/9/8/chartex" xmlns:cx2="http://schemas.microsoft.com/office/drawing/2015/10/21/chartex" xmlns:cx3="http://schemas.microsoft.com/office/drawing/2016/5/9/chartex" xmlns:cx4="http://schemas.microsoft.com/office/drawing/2016/5/10/chartex" xmlns:cx5="http://schemas.microsoft.com/office/drawing/2016/5/11/chartex" xmlns:cx6="http://schemas.microsoft.com/office/drawing/2016/5/12/chartex" xmlns:cx7="http://schemas.microsoft.com/office/drawing/2016/5/13/chartex" xmlns:cx8="http://schemas.microsoft.com/office/drawing/2016/5/14/chartex" xmlns:mc="http://schemas.openxmlformats.org/markup-compatibility/2006" xmlns:aink="http://schemas.microsoft.com/office/drawing/2016/ink" xmlns:am3d="http://schemas.microsoft.com/office/drawing/2017/model3d" xmlns:o="urn:schemas-microsoft-com:office:office" xmlns:oel="http://schemas.microsoft.com/office/2019/extlst" xmlns:r="http://schemas.openxmlformats.org/officeDocument/2006/relationships" xmlns:m="http://schemas.openxmlformats.org/officeDocument/2006/math" xmlns:v="urn:schemas-microsoft-com:vml" xmlns:wp14="http://schemas.microsoft.com/office/word/2010/wordprocessingDrawing" xmlns:wp="http://schemas.openxmlformats.org/drawingml/2006/wordprocessingDrawing" xmlns:w10="urn:schemas-microsoft-com:office:word" xmlns:w="http://schemas.openxmlformats.org/wordprocessingml/2006/main" xmlns:w14="http://schemas.microsoft.com/office/word/2010/wordml" xmlns:w15="http://schemas.microsoft.com/office/word/2012/wordml" xmlns:w16cex="http://schemas.microsoft.com/office/word/2018/wordml/cex" xmlns:w16cid="http://schemas.microsoft.com/office/word/2016/wordml/cid" xmlns:w16="http://schemas.microsoft.com/office/word/2018/wordml" xmlns:w16du="http://schemas.microsoft.com/office/word/2023/wordml/word16du" xmlns:w16sdtdh="http://schemas.microsoft.com/office/word/2020/wordml/sdtdatahash" xmlns:w16sdtfl="http://schemas.microsoft.com/office/word/2024/wordml/sdtformatlock" xmlns:w16se="http://schemas.microsoft.com/office/word/2015/wordml/symex" xmlns:wpg="http://schemas.microsoft.com/office/word/2010/wordprocessingGroup" xmlns:wpi="http://schemas.microsoft.com/office/word/2010/wordprocessingInk" xmlns:wne="http://schemas.microsoft.com/office/word/2006/wordml" xmlns:wps="http://schemas.microsoft.com/office/word/2010/wordprocessingShape" mc:Ignorable="w14 w15 w16se w16cid w16 w16cex w16sdtdh w16sdtfl w16du wp14">
+<w:hdr xmlns:wpc="http://schemas.microsoft.com/office/word/2010/wordprocessingCanvas" xmlns:mc="http://schemas.openxmlformats.org/markup-compatibility/2006" xmlns:o="urn:schemas-microsoft-com:office:office" xmlns:r="http://schemas.openxmlformats.org/officeDocument/2006/relationships" xmlns:m="http://schemas.openxmlformats.org/officeDocument/2006/math" xmlns:v="urn:schemas-microsoft-com:vml" xmlns:wp14="http://schemas.microsoft.com/office/word/2010/wordprocessingDrawing" xmlns:wp="http://schemas.openxmlformats.org/drawingml/2006/wordprocessingDrawing" xmlns:w10="urn:schemas-microsoft-com:office:word" xmlns:w="http://schemas.openxmlformats.org/wordprocessingml/2006/main" xmlns:w14="http://schemas.microsoft.com/office/word/2010/wordml" xmlns:w15="http://schemas.microsoft.com/office/word/2012/wordml" xmlns:wpg="http://schemas.microsoft.com/office/word/2010/wordprocessingGroup" xmlns:wpi="http://schemas.microsoft.com/office/word/2010/wordprocessingInk" xmlns:wne="http://schemas.microsoft.com/office/word/2006/wordml" xmlns:wps="http://schemas.microsoft.com/office/word/2010/wordprocessingShape" mc:Ignorable="w14 w15 wp14">
   <w:p>
     <w:pPr>
       <w:pBdr>
@@ -7057,14 +8732,60 @@
         <w:sz w:val="18"/>
         <w:szCs w:val="18"/>
       </w:rPr>
-      <w:t xml:space="preserve">   |   Dokumen Data Karyawan   |   Konfidensial</w:t>
+      <w:t xml:space="preserve">   |   </w:t>
     </w:r>
+    <w:proofErr w:type="spellStart"/>
+    <w:r>
+      <w:rPr>
+        <w:color w:val="888888"/>
+        <w:sz w:val="18"/>
+        <w:szCs w:val="18"/>
+      </w:rPr>
+      <w:t>Dokumen</w:t>
+    </w:r>
+    <w:proofErr w:type="spellEnd"/>
+    <w:r>
+      <w:rPr>
+        <w:color w:val="888888"/>
+        <w:sz w:val="18"/>
+        <w:szCs w:val="18"/>
+      </w:rPr>
+      <w:t xml:space="preserve"> Data </w:t>
+    </w:r>
+    <w:proofErr w:type="spellStart"/>
+    <w:r>
+      <w:rPr>
+        <w:color w:val="888888"/>
+        <w:sz w:val="18"/>
+        <w:szCs w:val="18"/>
+      </w:rPr>
+      <w:t>Karyawan</w:t>
+    </w:r>
+    <w:proofErr w:type="spellEnd"/>
+    <w:r>
+      <w:rPr>
+        <w:color w:val="888888"/>
+        <w:sz w:val="18"/>
+        <w:szCs w:val="18"/>
+      </w:rPr>
+      <w:t xml:space="preserve">   |   </w:t>
+    </w:r>
+    <w:proofErr w:type="spellStart"/>
+    <w:r>
+      <w:rPr>
+        <w:color w:val="888888"/>
+        <w:sz w:val="18"/>
+        <w:szCs w:val="18"/>
+      </w:rPr>
+      <w:t>Konfidensial</w:t>
+    </w:r>
+    <w:proofErr w:type="spellEnd"/>
   </w:p>
 </w:hdr>
 </file>
 
 <file path=word/numbering.xml><?xml version="1.0" encoding="utf-8"?>
-<w:numbering xmlns:wpc="http://schemas.microsoft.com/office/word/2010/wordprocessingCanvas" xmlns:cx="http://schemas.microsoft.com/office/drawing/2014/chartex" xmlns:cx1="http://schemas.microsoft.com/office/drawing/2015/9/8/chartex" xmlns:cx2="http://schemas.microsoft.com/office/drawing/2015/10/21/chartex" xmlns:cx3="http://schemas.microsoft.com/office/drawing/2016/5/9/chartex" xmlns:cx4="http://schemas.microsoft.com/office/drawing/2016/5/10/chartex" xmlns:cx5="http://schemas.microsoft.com/office/drawing/2016/5/11/chartex" xmlns:cx6="http://schemas.microsoft.com/office/drawing/2016/5/12/chartex" xmlns:cx7="http://schemas.microsoft.com/office/drawing/2016/5/13/chartex" xmlns:cx8="http://schemas.microsoft.com/office/drawing/2016/5/14/chartex" xmlns:mc="http://schemas.openxmlformats.org/markup-compatibility/2006" xmlns:aink="http://schemas.microsoft.com/office/drawing/2016/ink" xmlns:am3d="http://schemas.microsoft.com/office/drawing/2017/model3d" xmlns:o="urn:schemas-microsoft-com:office:office" xmlns:oel="http://schemas.microsoft.com/office/2019/extlst" xmlns:r="http://schemas.openxmlformats.org/officeDocument/2006/relationships" xmlns:m="http://schemas.openxmlformats.org/officeDocument/2006/math" xmlns:v="urn:schemas-microsoft-com:vml" xmlns:wp14="http://schemas.microsoft.com/office/word/2010/wordprocessingDrawing" xmlns:wp="http://schemas.openxmlformats.org/drawingml/2006/wordprocessingDrawing" xmlns:w10="urn:schemas-microsoft-com:office:word" xmlns:w="http://schemas.openxmlformats.org/wordprocessingml/2006/main" xmlns:w14="http://schemas.microsoft.com/office/word/2010/wordml" xmlns:w15="http://schemas.microsoft.com/office/word/2012/wordml" xmlns:w16cex="http://schemas.microsoft.com/office/word/2018/wordml/cex" xmlns:w16cid="http://schemas.microsoft.com/office/word/2016/wordml/cid" xmlns:w16="http://schemas.microsoft.com/office/word/2018/wordml" xmlns:w16du="http://schemas.microsoft.com/office/word/2023/wordml/word16du" xmlns:w16sdtdh="http://schemas.microsoft.com/office/word/2020/wordml/sdtdatahash" xmlns:w16sdtfl="http://schemas.microsoft.com/office/word/2024/wordml/sdtformatlock" xmlns:w16se="http://schemas.microsoft.com/office/word/2015/wordml/symex" xmlns:wpg="http://schemas.microsoft.com/office/word/2010/wordprocessingGroup" xmlns:wpi="http://schemas.microsoft.com/office/word/2010/wordprocessingInk" xmlns:wne="http://schemas.microsoft.com/office/word/2006/wordml" xmlns:wps="http://schemas.microsoft.com/office/word/2010/wordprocessingShape" mc:Ignorable="w14 w15 w16se w16cid w16 w16cex w16sdtdh w16sdtfl w16du wp14">
+<w:numbering xmlns:wpc="http://schemas.microsoft.com/office/word/2010/wordprocessingCanvas" xmlns:mc="http://schemas.openxmlformats.org/markup-compatibility/2006" xmlns:o="urn:schemas-microsoft-com:office:office" xmlns:r="http://schemas.openxmlformats.org/officeDocument/2006/relationships" xmlns:m="http://schemas.openxmlformats.org/officeDocument/2006/math" xmlns:v="urn:schemas-microsoft-com:vml" xmlns:wp14="http://schemas.microsoft.com/office/word/2010/wordprocessingDrawing" xmlns:wp="http://schemas.openxmlformats.org/drawingml/2006/wordprocessingDrawing" xmlns:w10="urn:schemas-microsoft-com:office:word" xmlns:w="http://schemas.openxmlformats.org/wordprocessingml/2006/main" xmlns:w14="http://schemas.microsoft.com/office/word/2010/wordml" xmlns:w15="http://schemas.microsoft.com/office/word/2012/wordml" xmlns:wpg="http://schemas.microsoft.com/office/word/2010/wordprocessingGroup" xmlns:wpi="http://schemas.microsoft.com/office/word/2010/wordprocessingInk" xmlns:wne="http://schemas.microsoft.com/office/word/2006/wordml" xmlns:wps="http://schemas.microsoft.com/office/word/2010/wordprocessingShape" mc:Ignorable="w14 w15 wp14">
   <w:abstractNum w:abstractNumId="0" w15:restartNumberingAfterBreak="0">
     <w:nsid w:val="292D4DBF"/>
     <w:multiLevelType w:val="hybridMultilevel"/>
@@ -7151,7 +8872,7 @@
       </w:pPr>
     </w:lvl>
   </w:abstractNum>
-  <w:num w:numId="1" w16cid:durableId="1839035822">
+  <w:num w:numId="1">
     <w:abstractNumId w:val="0"/>
     <w:lvlOverride w:ilvl="0">
       <w:startOverride w:val="1"/>
@@ -7161,7 +8882,7 @@
 </file>
 
 <file path=word/styles.xml><?xml version="1.0" encoding="utf-8"?>
-<w:styles xmlns:mc="http://schemas.openxmlformats.org/markup-compatibility/2006" xmlns:r="http://schemas.openxmlformats.org/officeDocument/2006/relationships" xmlns:w="http://schemas.openxmlformats.org/wordprocessingml/2006/main" xmlns:w14="http://schemas.microsoft.com/office/word/2010/wordml" xmlns:w15="http://schemas.microsoft.com/office/word/2012/wordml" xmlns:w16cex="http://schemas.microsoft.com/office/word/2018/wordml/cex" xmlns:w16cid="http://schemas.microsoft.com/office/word/2016/wordml/cid" xmlns:w16="http://schemas.microsoft.com/office/word/2018/wordml" xmlns:w16du="http://schemas.microsoft.com/office/word/2023/wordml/word16du" xmlns:w16sdtdh="http://schemas.microsoft.com/office/word/2020/wordml/sdtdatahash" xmlns:w16sdtfl="http://schemas.microsoft.com/office/word/2024/wordml/sdtformatlock" xmlns:w16se="http://schemas.microsoft.com/office/word/2015/wordml/symex" mc:Ignorable="w14 w15 w16se w16cid w16 w16cex w16sdtdh w16sdtfl w16du">
+<w:styles xmlns:mc="http://schemas.openxmlformats.org/markup-compatibility/2006" xmlns:r="http://schemas.openxmlformats.org/officeDocument/2006/relationships" xmlns:w="http://schemas.openxmlformats.org/wordprocessingml/2006/main" xmlns:w14="http://schemas.microsoft.com/office/word/2010/wordml" xmlns:w15="http://schemas.microsoft.com/office/word/2012/wordml" mc:Ignorable="w14 w15">
   <w:docDefaults>
     <w:rPrDefault>
       <w:rPr>
@@ -7173,7 +8894,7 @@
     </w:rPrDefault>
     <w:pPrDefault/>
   </w:docDefaults>
-  <w:latentStyles w:defLockedState="0" w:defUIPriority="99" w:defSemiHidden="0" w:defUnhideWhenUsed="0" w:defQFormat="0" w:count="376">
+  <w:latentStyles w:defLockedState="0" w:defUIPriority="99" w:defSemiHidden="0" w:defUnhideWhenUsed="0" w:defQFormat="0" w:count="371">
     <w:lsdException w:name="Normal" w:uiPriority="0" w:qFormat="1"/>
     <w:lsdException w:name="heading 1" w:uiPriority="9" w:qFormat="1"/>
     <w:lsdException w:name="heading 2" w:semiHidden="1" w:uiPriority="9" w:unhideWhenUsed="1" w:qFormat="1"/>
@@ -7545,11 +9266,6 @@
     <w:lsdException w:name="List Table 5 Dark Accent 6" w:uiPriority="50"/>
     <w:lsdException w:name="List Table 6 Colorful Accent 6" w:uiPriority="51"/>
     <w:lsdException w:name="List Table 7 Colorful Accent 6" w:uiPriority="52"/>
-    <w:lsdException w:name="Mention" w:semiHidden="1" w:unhideWhenUsed="1"/>
-    <w:lsdException w:name="Smart Hyperlink" w:semiHidden="1" w:unhideWhenUsed="1"/>
-    <w:lsdException w:name="Hashtag" w:semiHidden="1" w:unhideWhenUsed="1"/>
-    <w:lsdException w:name="Unresolved Mention" w:semiHidden="1" w:unhideWhenUsed="1"/>
-    <w:lsdException w:name="Smart Link" w:semiHidden="1" w:unhideWhenUsed="1"/>
   </w:latentStyles>
   <w:style w:type="paragraph" w:default="1" w:styleId="Normal">
     <w:name w:val="Normal"/>
@@ -7763,7 +9479,7 @@
       <w:szCs w:val="20"/>
     </w:rPr>
   </w:style>
-  <w:style w:type="character" w:styleId="UnresolvedMention">
+  <w:style w:type="character" w:customStyle="1" w:styleId="UnresolvedMention">
     <w:name w:val="Unresolved Mention"/>
     <w:basedOn w:val="DefaultParagraphFont"/>
     <w:uiPriority w:val="99"/>
@@ -8078,7 +9794,7 @@
 </file>
 
 <file path=customXml/itemProps1.xml><?xml version="1.0" encoding="utf-8"?>
-<ds:datastoreItem xmlns:ds="http://schemas.openxmlformats.org/officeDocument/2006/customXml" ds:itemID="{B8D6F561-3781-4583-9766-AE69658B9F4E}">
+<ds:datastoreItem xmlns:ds="http://schemas.openxmlformats.org/officeDocument/2006/customXml" ds:itemID="{B37AB721-4BD8-485E-A2CF-BD6E4973B304}">
   <ds:schemaRefs>
     <ds:schemaRef ds:uri="http://schemas.openxmlformats.org/officeDocument/2006/bibliography"/>
   </ds:schemaRefs>

</xml_diff>

<commit_message>
fix: harden Wablas v1 message dispatch and delivery handling
- switch Wablas adapter to v1 form-encoded send-message flow
- add temporary group-target override for messaging tests
- improve Wablas response parsing for v1 success and failure cases
- handle provider/network failures without crashing chat flow
- prevent successful sends from being overwritten as dispatch_failed
- format receptionist outbound messages for WhatsApp-friendly delivery
</commit_message>
<xml_diff>
--- a/knowledge/data_karyawan.docx
+++ b/knowledge/data_karyawan.docx
@@ -6258,8 +6258,6 @@
               </w:rPr>
               <w:t>62</w:t>
             </w:r>
-            <w:bookmarkStart w:id="0" w:name="_GoBack"/>
-            <w:bookmarkEnd w:id="0"/>
             <w:r>
               <w:rPr>
                 <w:color w:val="333333"/>
@@ -6778,6 +6776,389 @@
                 <w:szCs w:val="16"/>
               </w:rPr>
               <w:t>jan</w:t>
+            </w:r>
+            <w:proofErr w:type="spellEnd"/>
+            <w:r>
+              <w:rPr>
+                <w:color w:val="333333"/>
+                <w:sz w:val="16"/>
+                <w:szCs w:val="16"/>
+              </w:rPr>
+              <w:t xml:space="preserve"> 2026</w:t>
+            </w:r>
+          </w:p>
+        </w:tc>
+      </w:tr>
+      <w:tr>
+        <w:tc>
+          <w:tcPr>
+            <w:tcW w:w="581" w:type="dxa"/>
+            <w:tcBorders>
+              <w:top w:val="single" w:sz="1" w:space="0" w:color="CCCCCC"/>
+              <w:left w:val="single" w:sz="1" w:space="0" w:color="CCCCCC"/>
+              <w:bottom w:val="single" w:sz="1" w:space="0" w:color="CCCCCC"/>
+              <w:right w:val="single" w:sz="1" w:space="0" w:color="CCCCCC"/>
+            </w:tcBorders>
+            <w:shd w:val="clear" w:color="auto" w:fill="FFFFFF"/>
+            <w:tcMar>
+              <w:top w:w="80" w:type="dxa"/>
+              <w:left w:w="120" w:type="dxa"/>
+              <w:bottom w:w="80" w:type="dxa"/>
+              <w:right w:w="120" w:type="dxa"/>
+            </w:tcMar>
+            <w:vAlign w:val="center"/>
+          </w:tcPr>
+          <w:p>
+            <w:pPr>
+              <w:jc w:val="center"/>
+              <w:rPr>
+                <w:color w:val="333333"/>
+                <w:sz w:val="18"/>
+                <w:szCs w:val="18"/>
+              </w:rPr>
+            </w:pPr>
+            <w:r>
+              <w:rPr>
+                <w:color w:val="333333"/>
+                <w:sz w:val="18"/>
+                <w:szCs w:val="18"/>
+              </w:rPr>
+              <w:t>020</w:t>
+            </w:r>
+          </w:p>
+        </w:tc>
+        <w:tc>
+          <w:tcPr>
+            <w:tcW w:w="1503" w:type="dxa"/>
+            <w:tcBorders>
+              <w:top w:val="single" w:sz="1" w:space="0" w:color="CCCCCC"/>
+              <w:left w:val="single" w:sz="1" w:space="0" w:color="CCCCCC"/>
+              <w:bottom w:val="single" w:sz="1" w:space="0" w:color="CCCCCC"/>
+              <w:right w:val="single" w:sz="1" w:space="0" w:color="CCCCCC"/>
+            </w:tcBorders>
+            <w:shd w:val="clear" w:color="auto" w:fill="FFFFFF"/>
+            <w:tcMar>
+              <w:top w:w="80" w:type="dxa"/>
+              <w:left w:w="120" w:type="dxa"/>
+              <w:bottom w:w="80" w:type="dxa"/>
+              <w:right w:w="120" w:type="dxa"/>
+            </w:tcMar>
+            <w:vAlign w:val="center"/>
+          </w:tcPr>
+          <w:p>
+            <w:pPr>
+              <w:rPr>
+                <w:b/>
+                <w:bCs/>
+                <w:color w:val="333333"/>
+                <w:sz w:val="18"/>
+                <w:szCs w:val="18"/>
+              </w:rPr>
+            </w:pPr>
+            <w:proofErr w:type="spellStart"/>
+            <w:r>
+              <w:rPr>
+                <w:b/>
+                <w:bCs/>
+                <w:color w:val="333333"/>
+                <w:sz w:val="18"/>
+                <w:szCs w:val="18"/>
+              </w:rPr>
+              <w:t>Zaky</w:t>
+            </w:r>
+            <w:proofErr w:type="spellEnd"/>
+            <w:r>
+              <w:rPr>
+                <w:b/>
+                <w:bCs/>
+                <w:color w:val="333333"/>
+                <w:sz w:val="18"/>
+                <w:szCs w:val="18"/>
+              </w:rPr>
+              <w:t xml:space="preserve"> </w:t>
+            </w:r>
+            <w:proofErr w:type="spellStart"/>
+            <w:r>
+              <w:rPr>
+                <w:b/>
+                <w:bCs/>
+                <w:color w:val="333333"/>
+                <w:sz w:val="18"/>
+                <w:szCs w:val="18"/>
+              </w:rPr>
+              <w:t>Arrashid</w:t>
+            </w:r>
+            <w:proofErr w:type="spellEnd"/>
+          </w:p>
+        </w:tc>
+        <w:tc>
+          <w:tcPr>
+            <w:tcW w:w="1559" w:type="dxa"/>
+            <w:tcBorders>
+              <w:top w:val="single" w:sz="1" w:space="0" w:color="CCCCCC"/>
+              <w:left w:val="single" w:sz="1" w:space="0" w:color="CCCCCC"/>
+              <w:bottom w:val="single" w:sz="1" w:space="0" w:color="CCCCCC"/>
+              <w:right w:val="single" w:sz="1" w:space="0" w:color="CCCCCC"/>
+            </w:tcBorders>
+            <w:shd w:val="clear" w:color="auto" w:fill="FFFFFF"/>
+            <w:tcMar>
+              <w:top w:w="80" w:type="dxa"/>
+              <w:left w:w="120" w:type="dxa"/>
+              <w:bottom w:w="80" w:type="dxa"/>
+              <w:right w:w="120" w:type="dxa"/>
+            </w:tcMar>
+            <w:vAlign w:val="center"/>
+          </w:tcPr>
+          <w:p>
+            <w:pPr>
+              <w:rPr>
+                <w:color w:val="333333"/>
+                <w:sz w:val="18"/>
+                <w:szCs w:val="18"/>
+              </w:rPr>
+            </w:pPr>
+            <w:r>
+              <w:rPr>
+                <w:color w:val="333333"/>
+                <w:sz w:val="18"/>
+                <w:szCs w:val="18"/>
+              </w:rPr>
+              <w:t>IT</w:t>
+            </w:r>
+          </w:p>
+        </w:tc>
+        <w:tc>
+          <w:tcPr>
+            <w:tcW w:w="1602" w:type="dxa"/>
+            <w:tcBorders>
+              <w:top w:val="single" w:sz="1" w:space="0" w:color="CCCCCC"/>
+              <w:left w:val="single" w:sz="1" w:space="0" w:color="CCCCCC"/>
+              <w:bottom w:val="single" w:sz="1" w:space="0" w:color="CCCCCC"/>
+              <w:right w:val="single" w:sz="1" w:space="0" w:color="CCCCCC"/>
+            </w:tcBorders>
+            <w:shd w:val="clear" w:color="auto" w:fill="FFFFFF"/>
+            <w:tcMar>
+              <w:top w:w="80" w:type="dxa"/>
+              <w:left w:w="120" w:type="dxa"/>
+              <w:bottom w:w="80" w:type="dxa"/>
+              <w:right w:w="120" w:type="dxa"/>
+            </w:tcMar>
+            <w:vAlign w:val="center"/>
+          </w:tcPr>
+          <w:p>
+            <w:pPr>
+              <w:rPr>
+                <w:color w:val="333333"/>
+                <w:sz w:val="18"/>
+                <w:szCs w:val="18"/>
+              </w:rPr>
+            </w:pPr>
+            <w:proofErr w:type="spellStart"/>
+            <w:r>
+              <w:rPr>
+                <w:color w:val="333333"/>
+                <w:sz w:val="18"/>
+                <w:szCs w:val="18"/>
+              </w:rPr>
+              <w:t>Subcont</w:t>
+            </w:r>
+            <w:proofErr w:type="spellEnd"/>
+          </w:p>
+        </w:tc>
+        <w:tc>
+          <w:tcPr>
+            <w:tcW w:w="2902" w:type="dxa"/>
+            <w:tcBorders>
+              <w:top w:val="single" w:sz="1" w:space="0" w:color="CCCCCC"/>
+              <w:left w:val="single" w:sz="1" w:space="0" w:color="CCCCCC"/>
+              <w:bottom w:val="single" w:sz="1" w:space="0" w:color="CCCCCC"/>
+              <w:right w:val="single" w:sz="1" w:space="0" w:color="CCCCCC"/>
+            </w:tcBorders>
+            <w:shd w:val="clear" w:color="auto" w:fill="FFFFFF"/>
+            <w:tcMar>
+              <w:top w:w="80" w:type="dxa"/>
+              <w:left w:w="120" w:type="dxa"/>
+              <w:bottom w:w="80" w:type="dxa"/>
+              <w:right w:w="120" w:type="dxa"/>
+            </w:tcMar>
+            <w:vAlign w:val="center"/>
+          </w:tcPr>
+          <w:p>
+            <w:pPr>
+              <w:rPr>
+                <w:rStyle w:val="Hyperlink"/>
+                <w:sz w:val="16"/>
+                <w:szCs w:val="16"/>
+              </w:rPr>
+            </w:pPr>
+            <w:r>
+              <w:rPr>
+                <w:rStyle w:val="Hyperlink"/>
+                <w:sz w:val="16"/>
+                <w:szCs w:val="16"/>
+              </w:rPr>
+              <w:t>Zaky.arrashid@perusahaan.com</w:t>
+            </w:r>
+          </w:p>
+        </w:tc>
+        <w:tc>
+          <w:tcPr>
+            <w:tcW w:w="1376" w:type="dxa"/>
+            <w:tcBorders>
+              <w:top w:val="single" w:sz="1" w:space="0" w:color="CCCCCC"/>
+              <w:left w:val="single" w:sz="1" w:space="0" w:color="CCCCCC"/>
+              <w:bottom w:val="single" w:sz="1" w:space="0" w:color="CCCCCC"/>
+              <w:right w:val="single" w:sz="1" w:space="0" w:color="CCCCCC"/>
+            </w:tcBorders>
+            <w:shd w:val="clear" w:color="auto" w:fill="FFFFFF"/>
+            <w:tcMar>
+              <w:top w:w="80" w:type="dxa"/>
+              <w:left w:w="120" w:type="dxa"/>
+              <w:bottom w:w="80" w:type="dxa"/>
+              <w:right w:w="120" w:type="dxa"/>
+            </w:tcMar>
+            <w:vAlign w:val="center"/>
+          </w:tcPr>
+          <w:p>
+            <w:pPr>
+              <w:rPr>
+                <w:color w:val="333333"/>
+                <w:sz w:val="16"/>
+                <w:szCs w:val="16"/>
+              </w:rPr>
+            </w:pPr>
+            <w:r>
+              <w:rPr>
+                <w:color w:val="333333"/>
+                <w:sz w:val="16"/>
+                <w:szCs w:val="16"/>
+              </w:rPr>
+              <w:t>+628974436868</w:t>
+            </w:r>
+          </w:p>
+        </w:tc>
+        <w:tc>
+          <w:tcPr>
+            <w:tcW w:w="1383" w:type="dxa"/>
+            <w:tcBorders>
+              <w:top w:val="single" w:sz="1" w:space="0" w:color="CCCCCC"/>
+              <w:left w:val="single" w:sz="1" w:space="0" w:color="CCCCCC"/>
+              <w:bottom w:val="single" w:sz="1" w:space="0" w:color="CCCCCC"/>
+              <w:right w:val="single" w:sz="1" w:space="0" w:color="CCCCCC"/>
+            </w:tcBorders>
+            <w:shd w:val="clear" w:color="auto" w:fill="FFFFFF"/>
+            <w:tcMar>
+              <w:top w:w="80" w:type="dxa"/>
+              <w:left w:w="120" w:type="dxa"/>
+              <w:bottom w:w="80" w:type="dxa"/>
+              <w:right w:w="120" w:type="dxa"/>
+            </w:tcMar>
+            <w:vAlign w:val="center"/>
+          </w:tcPr>
+          <w:p>
+            <w:pPr>
+              <w:rPr>
+                <w:color w:val="333333"/>
+                <w:sz w:val="18"/>
+                <w:szCs w:val="18"/>
+              </w:rPr>
+            </w:pPr>
+            <w:r>
+              <w:rPr>
+                <w:color w:val="333333"/>
+                <w:sz w:val="18"/>
+                <w:szCs w:val="18"/>
+              </w:rPr>
+              <w:t>Jakarta Utara</w:t>
+            </w:r>
+          </w:p>
+        </w:tc>
+        <w:tc>
+          <w:tcPr>
+            <w:tcW w:w="863" w:type="dxa"/>
+            <w:tcBorders>
+              <w:top w:val="single" w:sz="1" w:space="0" w:color="CCCCCC"/>
+              <w:left w:val="single" w:sz="1" w:space="0" w:color="CCCCCC"/>
+              <w:bottom w:val="single" w:sz="1" w:space="0" w:color="CCCCCC"/>
+              <w:right w:val="single" w:sz="1" w:space="0" w:color="CCCCCC"/>
+            </w:tcBorders>
+            <w:shd w:val="clear" w:color="auto" w:fill="D4EDDA"/>
+            <w:tcMar>
+              <w:top w:w="80" w:type="dxa"/>
+              <w:left w:w="120" w:type="dxa"/>
+              <w:bottom w:w="80" w:type="dxa"/>
+              <w:right w:w="120" w:type="dxa"/>
+            </w:tcMar>
+            <w:vAlign w:val="center"/>
+          </w:tcPr>
+          <w:p>
+            <w:pPr>
+              <w:jc w:val="center"/>
+              <w:rPr>
+                <w:b/>
+                <w:bCs/>
+                <w:color w:val="155724"/>
+                <w:sz w:val="16"/>
+                <w:szCs w:val="16"/>
+              </w:rPr>
+            </w:pPr>
+            <w:proofErr w:type="spellStart"/>
+            <w:r>
+              <w:rPr>
+                <w:b/>
+                <w:bCs/>
+                <w:color w:val="155724"/>
+                <w:sz w:val="16"/>
+                <w:szCs w:val="16"/>
+              </w:rPr>
+              <w:t>Aktif</w:t>
+            </w:r>
+            <w:proofErr w:type="spellEnd"/>
+          </w:p>
+        </w:tc>
+        <w:tc>
+          <w:tcPr>
+            <w:tcW w:w="1191" w:type="dxa"/>
+            <w:tcBorders>
+              <w:top w:val="single" w:sz="1" w:space="0" w:color="CCCCCC"/>
+              <w:left w:val="single" w:sz="1" w:space="0" w:color="CCCCCC"/>
+              <w:bottom w:val="single" w:sz="1" w:space="0" w:color="CCCCCC"/>
+              <w:right w:val="single" w:sz="1" w:space="0" w:color="CCCCCC"/>
+            </w:tcBorders>
+            <w:shd w:val="clear" w:color="auto" w:fill="FFFFFF"/>
+            <w:tcMar>
+              <w:top w:w="80" w:type="dxa"/>
+              <w:left w:w="120" w:type="dxa"/>
+              <w:bottom w:w="80" w:type="dxa"/>
+              <w:right w:w="120" w:type="dxa"/>
+            </w:tcMar>
+            <w:vAlign w:val="center"/>
+          </w:tcPr>
+          <w:p>
+            <w:pPr>
+              <w:jc w:val="center"/>
+              <w:rPr>
+                <w:color w:val="333333"/>
+                <w:sz w:val="16"/>
+                <w:szCs w:val="16"/>
+              </w:rPr>
+            </w:pPr>
+            <w:r>
+              <w:rPr>
+                <w:color w:val="333333"/>
+                <w:sz w:val="16"/>
+                <w:szCs w:val="16"/>
+              </w:rPr>
+              <w:t xml:space="preserve">10 </w:t>
+            </w:r>
+            <w:proofErr w:type="spellStart"/>
+            <w:r>
+              <w:rPr>
+                <w:color w:val="333333"/>
+                <w:sz w:val="16"/>
+                <w:szCs w:val="16"/>
+              </w:rPr>
+              <w:t>feb</w:t>
             </w:r>
             <w:proofErr w:type="spellEnd"/>
             <w:r>
@@ -6801,1046 +7182,8 @@
       <w:pPr>
         <w:pStyle w:val="Heading2"/>
       </w:pPr>
-      <w:proofErr w:type="spellStart"/>
-      <w:r>
-        <w:t>Ringkasan</w:t>
-      </w:r>
-      <w:proofErr w:type="spellEnd"/>
-      <w:r>
-        <w:t xml:space="preserve"> per </w:t>
-      </w:r>
-      <w:proofErr w:type="spellStart"/>
-      <w:r>
-        <w:t>Departemen</w:t>
-      </w:r>
-      <w:proofErr w:type="spellEnd"/>
-    </w:p>
-    <w:tbl>
-      <w:tblPr>
-        <w:tblW w:w="8960" w:type="dxa"/>
-        <w:tblBorders>
-          <w:top w:val="single" w:sz="4" w:space="0" w:color="auto"/>
-          <w:left w:val="single" w:sz="4" w:space="0" w:color="auto"/>
-          <w:bottom w:val="single" w:sz="4" w:space="0" w:color="auto"/>
-          <w:right w:val="single" w:sz="4" w:space="0" w:color="auto"/>
-          <w:insideH w:val="single" w:sz="4" w:space="0" w:color="auto"/>
-          <w:insideV w:val="single" w:sz="4" w:space="0" w:color="auto"/>
-        </w:tblBorders>
-        <w:tblCellMar>
-          <w:left w:w="10" w:type="dxa"/>
-          <w:right w:w="10" w:type="dxa"/>
-        </w:tblCellMar>
-        <w:tblLook w:val="0000" w:firstRow="0" w:lastRow="0" w:firstColumn="0" w:lastColumn="0" w:noHBand="0" w:noVBand="0"/>
-      </w:tblPr>
-      <w:tblGrid>
-        <w:gridCol w:w="5000"/>
-        <w:gridCol w:w="2000"/>
-        <w:gridCol w:w="1960"/>
-      </w:tblGrid>
-      <w:tr>
-        <w:trPr>
-          <w:tblHeader/>
-        </w:trPr>
-        <w:tc>
-          <w:tcPr>
-            <w:tcW w:w="5000" w:type="dxa"/>
-            <w:tcBorders>
-              <w:top w:val="single" w:sz="1" w:space="0" w:color="CCCCCC"/>
-              <w:left w:val="single" w:sz="1" w:space="0" w:color="CCCCCC"/>
-              <w:bottom w:val="single" w:sz="1" w:space="0" w:color="CCCCCC"/>
-              <w:right w:val="single" w:sz="1" w:space="0" w:color="CCCCCC"/>
-            </w:tcBorders>
-            <w:shd w:val="clear" w:color="auto" w:fill="2E86AB"/>
-            <w:tcMar>
-              <w:top w:w="100" w:type="dxa"/>
-              <w:left w:w="120" w:type="dxa"/>
-              <w:bottom w:w="100" w:type="dxa"/>
-              <w:right w:w="120" w:type="dxa"/>
-            </w:tcMar>
-            <w:vAlign w:val="center"/>
-          </w:tcPr>
-          <w:p>
-            <w:pPr>
-              <w:jc w:val="center"/>
-            </w:pPr>
-            <w:proofErr w:type="spellStart"/>
-            <w:r>
-              <w:rPr>
-                <w:b/>
-                <w:bCs/>
-                <w:color w:val="FFFFFF"/>
-                <w:sz w:val="18"/>
-                <w:szCs w:val="18"/>
-              </w:rPr>
-              <w:t>Departemen</w:t>
-            </w:r>
-            <w:proofErr w:type="spellEnd"/>
-          </w:p>
-        </w:tc>
-        <w:tc>
-          <w:tcPr>
-            <w:tcW w:w="2000" w:type="dxa"/>
-            <w:tcBorders>
-              <w:top w:val="single" w:sz="1" w:space="0" w:color="CCCCCC"/>
-              <w:left w:val="single" w:sz="1" w:space="0" w:color="CCCCCC"/>
-              <w:bottom w:val="single" w:sz="1" w:space="0" w:color="CCCCCC"/>
-              <w:right w:val="single" w:sz="1" w:space="0" w:color="CCCCCC"/>
-            </w:tcBorders>
-            <w:shd w:val="clear" w:color="auto" w:fill="2E86AB"/>
-            <w:tcMar>
-              <w:top w:w="100" w:type="dxa"/>
-              <w:left w:w="120" w:type="dxa"/>
-              <w:bottom w:w="100" w:type="dxa"/>
-              <w:right w:w="120" w:type="dxa"/>
-            </w:tcMar>
-            <w:vAlign w:val="center"/>
-          </w:tcPr>
-          <w:p>
-            <w:pPr>
-              <w:jc w:val="center"/>
-            </w:pPr>
-            <w:proofErr w:type="spellStart"/>
-            <w:r>
-              <w:rPr>
-                <w:b/>
-                <w:bCs/>
-                <w:color w:val="FFFFFF"/>
-                <w:sz w:val="18"/>
-                <w:szCs w:val="18"/>
-              </w:rPr>
-              <w:t>Jumlah</w:t>
-            </w:r>
-            <w:proofErr w:type="spellEnd"/>
-            <w:r>
-              <w:rPr>
-                <w:b/>
-                <w:bCs/>
-                <w:color w:val="FFFFFF"/>
-                <w:sz w:val="18"/>
-                <w:szCs w:val="18"/>
-              </w:rPr>
-              <w:t xml:space="preserve"> </w:t>
-            </w:r>
-            <w:proofErr w:type="spellStart"/>
-            <w:r>
-              <w:rPr>
-                <w:b/>
-                <w:bCs/>
-                <w:color w:val="FFFFFF"/>
-                <w:sz w:val="18"/>
-                <w:szCs w:val="18"/>
-              </w:rPr>
-              <w:t>Karyawan</w:t>
-            </w:r>
-            <w:proofErr w:type="spellEnd"/>
-          </w:p>
-        </w:tc>
-        <w:tc>
-          <w:tcPr>
-            <w:tcW w:w="1960" w:type="dxa"/>
-            <w:tcBorders>
-              <w:top w:val="single" w:sz="1" w:space="0" w:color="CCCCCC"/>
-              <w:left w:val="single" w:sz="1" w:space="0" w:color="CCCCCC"/>
-              <w:bottom w:val="single" w:sz="1" w:space="0" w:color="CCCCCC"/>
-              <w:right w:val="single" w:sz="1" w:space="0" w:color="CCCCCC"/>
-            </w:tcBorders>
-            <w:shd w:val="clear" w:color="auto" w:fill="2E86AB"/>
-            <w:tcMar>
-              <w:top w:w="100" w:type="dxa"/>
-              <w:left w:w="120" w:type="dxa"/>
-              <w:bottom w:w="100" w:type="dxa"/>
-              <w:right w:w="120" w:type="dxa"/>
-            </w:tcMar>
-            <w:vAlign w:val="center"/>
-          </w:tcPr>
-          <w:p>
-            <w:pPr>
-              <w:jc w:val="center"/>
-            </w:pPr>
-            <w:proofErr w:type="spellStart"/>
-            <w:r>
-              <w:rPr>
-                <w:b/>
-                <w:bCs/>
-                <w:color w:val="FFFFFF"/>
-                <w:sz w:val="18"/>
-                <w:szCs w:val="18"/>
-              </w:rPr>
-              <w:t>Persentase</w:t>
-            </w:r>
-            <w:proofErr w:type="spellEnd"/>
-          </w:p>
-        </w:tc>
-      </w:tr>
-      <w:tr>
-        <w:tc>
-          <w:tcPr>
-            <w:tcW w:w="5000" w:type="dxa"/>
-            <w:tcBorders>
-              <w:top w:val="single" w:sz="1" w:space="0" w:color="CCCCCC"/>
-              <w:left w:val="single" w:sz="1" w:space="0" w:color="CCCCCC"/>
-              <w:bottom w:val="single" w:sz="1" w:space="0" w:color="CCCCCC"/>
-              <w:right w:val="single" w:sz="1" w:space="0" w:color="CCCCCC"/>
-            </w:tcBorders>
-            <w:shd w:val="clear" w:color="auto" w:fill="F5F5F5"/>
-            <w:tcMar>
-              <w:top w:w="80" w:type="dxa"/>
-              <w:left w:w="120" w:type="dxa"/>
-              <w:bottom w:w="80" w:type="dxa"/>
-              <w:right w:w="120" w:type="dxa"/>
-            </w:tcMar>
-            <w:vAlign w:val="center"/>
-          </w:tcPr>
-          <w:p>
-            <w:proofErr w:type="spellStart"/>
-            <w:r>
-              <w:rPr>
-                <w:color w:val="333333"/>
-                <w:sz w:val="18"/>
-                <w:szCs w:val="18"/>
-              </w:rPr>
-              <w:t>Teknologi</w:t>
-            </w:r>
-            <w:proofErr w:type="spellEnd"/>
-            <w:r>
-              <w:rPr>
-                <w:color w:val="333333"/>
-                <w:sz w:val="18"/>
-                <w:szCs w:val="18"/>
-              </w:rPr>
-              <w:t xml:space="preserve"> </w:t>
-            </w:r>
-            <w:proofErr w:type="spellStart"/>
-            <w:r>
-              <w:rPr>
-                <w:color w:val="333333"/>
-                <w:sz w:val="18"/>
-                <w:szCs w:val="18"/>
-              </w:rPr>
-              <w:t>Informasi</w:t>
-            </w:r>
-            <w:proofErr w:type="spellEnd"/>
-          </w:p>
-        </w:tc>
-        <w:tc>
-          <w:tcPr>
-            <w:tcW w:w="2000" w:type="dxa"/>
-            <w:tcBorders>
-              <w:top w:val="single" w:sz="1" w:space="0" w:color="CCCCCC"/>
-              <w:left w:val="single" w:sz="1" w:space="0" w:color="CCCCCC"/>
-              <w:bottom w:val="single" w:sz="1" w:space="0" w:color="CCCCCC"/>
-              <w:right w:val="single" w:sz="1" w:space="0" w:color="CCCCCC"/>
-            </w:tcBorders>
-            <w:shd w:val="clear" w:color="auto" w:fill="F5F5F5"/>
-            <w:tcMar>
-              <w:top w:w="80" w:type="dxa"/>
-              <w:left w:w="120" w:type="dxa"/>
-              <w:bottom w:w="80" w:type="dxa"/>
-              <w:right w:w="120" w:type="dxa"/>
-            </w:tcMar>
-            <w:vAlign w:val="center"/>
-          </w:tcPr>
-          <w:p>
-            <w:pPr>
-              <w:jc w:val="center"/>
-            </w:pPr>
-            <w:r>
-              <w:t>6</w:t>
-            </w:r>
-          </w:p>
-        </w:tc>
-        <w:tc>
-          <w:tcPr>
-            <w:tcW w:w="1960" w:type="dxa"/>
-            <w:tcBorders>
-              <w:top w:val="single" w:sz="1" w:space="0" w:color="CCCCCC"/>
-              <w:left w:val="single" w:sz="1" w:space="0" w:color="CCCCCC"/>
-              <w:bottom w:val="single" w:sz="1" w:space="0" w:color="CCCCCC"/>
-              <w:right w:val="single" w:sz="1" w:space="0" w:color="CCCCCC"/>
-            </w:tcBorders>
-            <w:shd w:val="clear" w:color="auto" w:fill="F5F5F5"/>
-            <w:tcMar>
-              <w:top w:w="80" w:type="dxa"/>
-              <w:left w:w="120" w:type="dxa"/>
-              <w:bottom w:w="80" w:type="dxa"/>
-              <w:right w:w="120" w:type="dxa"/>
-            </w:tcMar>
-            <w:vAlign w:val="center"/>
-          </w:tcPr>
-          <w:p>
-            <w:pPr>
-              <w:jc w:val="center"/>
-            </w:pPr>
-            <w:r>
-              <w:rPr>
-                <w:color w:val="333333"/>
-                <w:sz w:val="18"/>
-                <w:szCs w:val="18"/>
-              </w:rPr>
-              <w:t>27%</w:t>
-            </w:r>
-          </w:p>
-        </w:tc>
-      </w:tr>
-      <w:tr>
-        <w:tc>
-          <w:tcPr>
-            <w:tcW w:w="5000" w:type="dxa"/>
-            <w:tcBorders>
-              <w:top w:val="single" w:sz="1" w:space="0" w:color="CCCCCC"/>
-              <w:left w:val="single" w:sz="1" w:space="0" w:color="CCCCCC"/>
-              <w:bottom w:val="single" w:sz="1" w:space="0" w:color="CCCCCC"/>
-              <w:right w:val="single" w:sz="1" w:space="0" w:color="CCCCCC"/>
-            </w:tcBorders>
-            <w:shd w:val="clear" w:color="auto" w:fill="FFFFFF"/>
-            <w:tcMar>
-              <w:top w:w="80" w:type="dxa"/>
-              <w:left w:w="120" w:type="dxa"/>
-              <w:bottom w:w="80" w:type="dxa"/>
-              <w:right w:w="120" w:type="dxa"/>
-            </w:tcMar>
-            <w:vAlign w:val="center"/>
-          </w:tcPr>
-          <w:p>
-            <w:proofErr w:type="spellStart"/>
-            <w:r>
-              <w:rPr>
-                <w:color w:val="333333"/>
-                <w:sz w:val="18"/>
-                <w:szCs w:val="18"/>
-              </w:rPr>
-              <w:t>Sumber</w:t>
-            </w:r>
-            <w:proofErr w:type="spellEnd"/>
-            <w:r>
-              <w:rPr>
-                <w:color w:val="333333"/>
-                <w:sz w:val="18"/>
-                <w:szCs w:val="18"/>
-              </w:rPr>
-              <w:t xml:space="preserve"> </w:t>
-            </w:r>
-            <w:proofErr w:type="spellStart"/>
-            <w:r>
-              <w:rPr>
-                <w:color w:val="333333"/>
-                <w:sz w:val="18"/>
-                <w:szCs w:val="18"/>
-              </w:rPr>
-              <w:t>Daya</w:t>
-            </w:r>
-            <w:proofErr w:type="spellEnd"/>
-            <w:r>
-              <w:rPr>
-                <w:color w:val="333333"/>
-                <w:sz w:val="18"/>
-                <w:szCs w:val="18"/>
-              </w:rPr>
-              <w:t xml:space="preserve"> </w:t>
-            </w:r>
-            <w:proofErr w:type="spellStart"/>
-            <w:r>
-              <w:rPr>
-                <w:color w:val="333333"/>
-                <w:sz w:val="18"/>
-                <w:szCs w:val="18"/>
-              </w:rPr>
-              <w:t>Manusia</w:t>
-            </w:r>
-            <w:proofErr w:type="spellEnd"/>
-          </w:p>
-        </w:tc>
-        <w:tc>
-          <w:tcPr>
-            <w:tcW w:w="2000" w:type="dxa"/>
-            <w:tcBorders>
-              <w:top w:val="single" w:sz="1" w:space="0" w:color="CCCCCC"/>
-              <w:left w:val="single" w:sz="1" w:space="0" w:color="CCCCCC"/>
-              <w:bottom w:val="single" w:sz="1" w:space="0" w:color="CCCCCC"/>
-              <w:right w:val="single" w:sz="1" w:space="0" w:color="CCCCCC"/>
-            </w:tcBorders>
-            <w:shd w:val="clear" w:color="auto" w:fill="FFFFFF"/>
-            <w:tcMar>
-              <w:top w:w="80" w:type="dxa"/>
-              <w:left w:w="120" w:type="dxa"/>
-              <w:bottom w:w="80" w:type="dxa"/>
-              <w:right w:w="120" w:type="dxa"/>
-            </w:tcMar>
-            <w:vAlign w:val="center"/>
-          </w:tcPr>
-          <w:p>
-            <w:pPr>
-              <w:jc w:val="center"/>
-            </w:pPr>
-            <w:r>
-              <w:rPr>
-                <w:b/>
-                <w:bCs/>
-                <w:color w:val="333333"/>
-                <w:sz w:val="18"/>
-                <w:szCs w:val="18"/>
-              </w:rPr>
-              <w:t>2</w:t>
-            </w:r>
-          </w:p>
-        </w:tc>
-        <w:tc>
-          <w:tcPr>
-            <w:tcW w:w="1960" w:type="dxa"/>
-            <w:tcBorders>
-              <w:top w:val="single" w:sz="1" w:space="0" w:color="CCCCCC"/>
-              <w:left w:val="single" w:sz="1" w:space="0" w:color="CCCCCC"/>
-              <w:bottom w:val="single" w:sz="1" w:space="0" w:color="CCCCCC"/>
-              <w:right w:val="single" w:sz="1" w:space="0" w:color="CCCCCC"/>
-            </w:tcBorders>
-            <w:shd w:val="clear" w:color="auto" w:fill="FFFFFF"/>
-            <w:tcMar>
-              <w:top w:w="80" w:type="dxa"/>
-              <w:left w:w="120" w:type="dxa"/>
-              <w:bottom w:w="80" w:type="dxa"/>
-              <w:right w:w="120" w:type="dxa"/>
-            </w:tcMar>
-            <w:vAlign w:val="center"/>
-          </w:tcPr>
-          <w:p>
-            <w:pPr>
-              <w:jc w:val="center"/>
-            </w:pPr>
-            <w:r>
-              <w:rPr>
-                <w:color w:val="333333"/>
-                <w:sz w:val="18"/>
-                <w:szCs w:val="18"/>
-              </w:rPr>
-              <w:t>13%</w:t>
-            </w:r>
-          </w:p>
-        </w:tc>
-      </w:tr>
-      <w:tr>
-        <w:tc>
-          <w:tcPr>
-            <w:tcW w:w="5000" w:type="dxa"/>
-            <w:tcBorders>
-              <w:top w:val="single" w:sz="1" w:space="0" w:color="CCCCCC"/>
-              <w:left w:val="single" w:sz="1" w:space="0" w:color="CCCCCC"/>
-              <w:bottom w:val="single" w:sz="1" w:space="0" w:color="CCCCCC"/>
-              <w:right w:val="single" w:sz="1" w:space="0" w:color="CCCCCC"/>
-            </w:tcBorders>
-            <w:shd w:val="clear" w:color="auto" w:fill="F5F5F5"/>
-            <w:tcMar>
-              <w:top w:w="80" w:type="dxa"/>
-              <w:left w:w="120" w:type="dxa"/>
-              <w:bottom w:w="80" w:type="dxa"/>
-              <w:right w:w="120" w:type="dxa"/>
-            </w:tcMar>
-            <w:vAlign w:val="center"/>
-          </w:tcPr>
-          <w:p>
-            <w:proofErr w:type="spellStart"/>
-            <w:r>
-              <w:rPr>
-                <w:color w:val="333333"/>
-                <w:sz w:val="18"/>
-                <w:szCs w:val="18"/>
-              </w:rPr>
-              <w:t>Keuangan</w:t>
-            </w:r>
-            <w:proofErr w:type="spellEnd"/>
-          </w:p>
-        </w:tc>
-        <w:tc>
-          <w:tcPr>
-            <w:tcW w:w="2000" w:type="dxa"/>
-            <w:tcBorders>
-              <w:top w:val="single" w:sz="1" w:space="0" w:color="CCCCCC"/>
-              <w:left w:val="single" w:sz="1" w:space="0" w:color="CCCCCC"/>
-              <w:bottom w:val="single" w:sz="1" w:space="0" w:color="CCCCCC"/>
-              <w:right w:val="single" w:sz="1" w:space="0" w:color="CCCCCC"/>
-            </w:tcBorders>
-            <w:shd w:val="clear" w:color="auto" w:fill="F5F5F5"/>
-            <w:tcMar>
-              <w:top w:w="80" w:type="dxa"/>
-              <w:left w:w="120" w:type="dxa"/>
-              <w:bottom w:w="80" w:type="dxa"/>
-              <w:right w:w="120" w:type="dxa"/>
-            </w:tcMar>
-            <w:vAlign w:val="center"/>
-          </w:tcPr>
-          <w:p>
-            <w:pPr>
-              <w:jc w:val="center"/>
-            </w:pPr>
-            <w:r>
-              <w:rPr>
-                <w:b/>
-                <w:bCs/>
-                <w:color w:val="333333"/>
-                <w:sz w:val="18"/>
-                <w:szCs w:val="18"/>
-              </w:rPr>
-              <w:t>2</w:t>
-            </w:r>
-          </w:p>
-        </w:tc>
-        <w:tc>
-          <w:tcPr>
-            <w:tcW w:w="1960" w:type="dxa"/>
-            <w:tcBorders>
-              <w:top w:val="single" w:sz="1" w:space="0" w:color="CCCCCC"/>
-              <w:left w:val="single" w:sz="1" w:space="0" w:color="CCCCCC"/>
-              <w:bottom w:val="single" w:sz="1" w:space="0" w:color="CCCCCC"/>
-              <w:right w:val="single" w:sz="1" w:space="0" w:color="CCCCCC"/>
-            </w:tcBorders>
-            <w:shd w:val="clear" w:color="auto" w:fill="F5F5F5"/>
-            <w:tcMar>
-              <w:top w:w="80" w:type="dxa"/>
-              <w:left w:w="120" w:type="dxa"/>
-              <w:bottom w:w="80" w:type="dxa"/>
-              <w:right w:w="120" w:type="dxa"/>
-            </w:tcMar>
-            <w:vAlign w:val="center"/>
-          </w:tcPr>
-          <w:p>
-            <w:pPr>
-              <w:jc w:val="center"/>
-            </w:pPr>
-            <w:r>
-              <w:rPr>
-                <w:color w:val="333333"/>
-                <w:sz w:val="18"/>
-                <w:szCs w:val="18"/>
-              </w:rPr>
-              <w:t>13%</w:t>
-            </w:r>
-          </w:p>
-        </w:tc>
-      </w:tr>
-      <w:tr>
-        <w:tc>
-          <w:tcPr>
-            <w:tcW w:w="5000" w:type="dxa"/>
-            <w:tcBorders>
-              <w:top w:val="single" w:sz="1" w:space="0" w:color="CCCCCC"/>
-              <w:left w:val="single" w:sz="1" w:space="0" w:color="CCCCCC"/>
-              <w:bottom w:val="single" w:sz="1" w:space="0" w:color="CCCCCC"/>
-              <w:right w:val="single" w:sz="1" w:space="0" w:color="CCCCCC"/>
-            </w:tcBorders>
-            <w:shd w:val="clear" w:color="auto" w:fill="FFFFFF"/>
-            <w:tcMar>
-              <w:top w:w="80" w:type="dxa"/>
-              <w:left w:w="120" w:type="dxa"/>
-              <w:bottom w:w="80" w:type="dxa"/>
-              <w:right w:w="120" w:type="dxa"/>
-            </w:tcMar>
-            <w:vAlign w:val="center"/>
-          </w:tcPr>
-          <w:p>
-            <w:proofErr w:type="spellStart"/>
-            <w:r>
-              <w:rPr>
-                <w:color w:val="333333"/>
-                <w:sz w:val="18"/>
-                <w:szCs w:val="18"/>
-              </w:rPr>
-              <w:t>Pemasaran</w:t>
-            </w:r>
-            <w:proofErr w:type="spellEnd"/>
-          </w:p>
-        </w:tc>
-        <w:tc>
-          <w:tcPr>
-            <w:tcW w:w="2000" w:type="dxa"/>
-            <w:tcBorders>
-              <w:top w:val="single" w:sz="1" w:space="0" w:color="CCCCCC"/>
-              <w:left w:val="single" w:sz="1" w:space="0" w:color="CCCCCC"/>
-              <w:bottom w:val="single" w:sz="1" w:space="0" w:color="CCCCCC"/>
-              <w:right w:val="single" w:sz="1" w:space="0" w:color="CCCCCC"/>
-            </w:tcBorders>
-            <w:shd w:val="clear" w:color="auto" w:fill="FFFFFF"/>
-            <w:tcMar>
-              <w:top w:w="80" w:type="dxa"/>
-              <w:left w:w="120" w:type="dxa"/>
-              <w:bottom w:w="80" w:type="dxa"/>
-              <w:right w:w="120" w:type="dxa"/>
-            </w:tcMar>
-            <w:vAlign w:val="center"/>
-          </w:tcPr>
-          <w:p>
-            <w:pPr>
-              <w:jc w:val="center"/>
-            </w:pPr>
-            <w:r>
-              <w:rPr>
-                <w:b/>
-                <w:bCs/>
-                <w:color w:val="333333"/>
-                <w:sz w:val="18"/>
-                <w:szCs w:val="18"/>
-              </w:rPr>
-              <w:t>2</w:t>
-            </w:r>
-          </w:p>
-        </w:tc>
-        <w:tc>
-          <w:tcPr>
-            <w:tcW w:w="1960" w:type="dxa"/>
-            <w:tcBorders>
-              <w:top w:val="single" w:sz="1" w:space="0" w:color="CCCCCC"/>
-              <w:left w:val="single" w:sz="1" w:space="0" w:color="CCCCCC"/>
-              <w:bottom w:val="single" w:sz="1" w:space="0" w:color="CCCCCC"/>
-              <w:right w:val="single" w:sz="1" w:space="0" w:color="CCCCCC"/>
-            </w:tcBorders>
-            <w:shd w:val="clear" w:color="auto" w:fill="FFFFFF"/>
-            <w:tcMar>
-              <w:top w:w="80" w:type="dxa"/>
-              <w:left w:w="120" w:type="dxa"/>
-              <w:bottom w:w="80" w:type="dxa"/>
-              <w:right w:w="120" w:type="dxa"/>
-            </w:tcMar>
-            <w:vAlign w:val="center"/>
-          </w:tcPr>
-          <w:p>
-            <w:pPr>
-              <w:jc w:val="center"/>
-            </w:pPr>
-            <w:r>
-              <w:rPr>
-                <w:color w:val="333333"/>
-                <w:sz w:val="18"/>
-                <w:szCs w:val="18"/>
-              </w:rPr>
-              <w:t>13%</w:t>
-            </w:r>
-          </w:p>
-        </w:tc>
-      </w:tr>
-      <w:tr>
-        <w:tc>
-          <w:tcPr>
-            <w:tcW w:w="5000" w:type="dxa"/>
-            <w:tcBorders>
-              <w:top w:val="single" w:sz="1" w:space="0" w:color="CCCCCC"/>
-              <w:left w:val="single" w:sz="1" w:space="0" w:color="CCCCCC"/>
-              <w:bottom w:val="single" w:sz="1" w:space="0" w:color="CCCCCC"/>
-              <w:right w:val="single" w:sz="1" w:space="0" w:color="CCCCCC"/>
-            </w:tcBorders>
-            <w:shd w:val="clear" w:color="auto" w:fill="F5F5F5"/>
-            <w:tcMar>
-              <w:top w:w="80" w:type="dxa"/>
-              <w:left w:w="120" w:type="dxa"/>
-              <w:bottom w:w="80" w:type="dxa"/>
-              <w:right w:w="120" w:type="dxa"/>
-            </w:tcMar>
-            <w:vAlign w:val="center"/>
-          </w:tcPr>
-          <w:p>
-            <w:proofErr w:type="spellStart"/>
-            <w:r>
-              <w:rPr>
-                <w:color w:val="333333"/>
-                <w:sz w:val="18"/>
-                <w:szCs w:val="18"/>
-              </w:rPr>
-              <w:t>Operasional</w:t>
-            </w:r>
-            <w:proofErr w:type="spellEnd"/>
-          </w:p>
-        </w:tc>
-        <w:tc>
-          <w:tcPr>
-            <w:tcW w:w="2000" w:type="dxa"/>
-            <w:tcBorders>
-              <w:top w:val="single" w:sz="1" w:space="0" w:color="CCCCCC"/>
-              <w:left w:val="single" w:sz="1" w:space="0" w:color="CCCCCC"/>
-              <w:bottom w:val="single" w:sz="1" w:space="0" w:color="CCCCCC"/>
-              <w:right w:val="single" w:sz="1" w:space="0" w:color="CCCCCC"/>
-            </w:tcBorders>
-            <w:shd w:val="clear" w:color="auto" w:fill="F5F5F5"/>
-            <w:tcMar>
-              <w:top w:w="80" w:type="dxa"/>
-              <w:left w:w="120" w:type="dxa"/>
-              <w:bottom w:w="80" w:type="dxa"/>
-              <w:right w:w="120" w:type="dxa"/>
-            </w:tcMar>
-            <w:vAlign w:val="center"/>
-          </w:tcPr>
-          <w:p>
-            <w:pPr>
-              <w:jc w:val="center"/>
-            </w:pPr>
-            <w:r>
-              <w:rPr>
-                <w:b/>
-                <w:bCs/>
-                <w:color w:val="333333"/>
-                <w:sz w:val="18"/>
-                <w:szCs w:val="18"/>
-              </w:rPr>
-              <w:t>2</w:t>
-            </w:r>
-          </w:p>
-        </w:tc>
-        <w:tc>
-          <w:tcPr>
-            <w:tcW w:w="1960" w:type="dxa"/>
-            <w:tcBorders>
-              <w:top w:val="single" w:sz="1" w:space="0" w:color="CCCCCC"/>
-              <w:left w:val="single" w:sz="1" w:space="0" w:color="CCCCCC"/>
-              <w:bottom w:val="single" w:sz="1" w:space="0" w:color="CCCCCC"/>
-              <w:right w:val="single" w:sz="1" w:space="0" w:color="CCCCCC"/>
-            </w:tcBorders>
-            <w:shd w:val="clear" w:color="auto" w:fill="F5F5F5"/>
-            <w:tcMar>
-              <w:top w:w="80" w:type="dxa"/>
-              <w:left w:w="120" w:type="dxa"/>
-              <w:bottom w:w="80" w:type="dxa"/>
-              <w:right w:w="120" w:type="dxa"/>
-            </w:tcMar>
-            <w:vAlign w:val="center"/>
-          </w:tcPr>
-          <w:p>
-            <w:pPr>
-              <w:jc w:val="center"/>
-            </w:pPr>
-            <w:r>
-              <w:rPr>
-                <w:color w:val="333333"/>
-                <w:sz w:val="18"/>
-                <w:szCs w:val="18"/>
-              </w:rPr>
-              <w:t>13%</w:t>
-            </w:r>
-          </w:p>
-        </w:tc>
-      </w:tr>
-      <w:tr>
-        <w:tc>
-          <w:tcPr>
-            <w:tcW w:w="5000" w:type="dxa"/>
-            <w:tcBorders>
-              <w:top w:val="single" w:sz="1" w:space="0" w:color="CCCCCC"/>
-              <w:left w:val="single" w:sz="1" w:space="0" w:color="CCCCCC"/>
-              <w:bottom w:val="single" w:sz="1" w:space="0" w:color="CCCCCC"/>
-              <w:right w:val="single" w:sz="1" w:space="0" w:color="CCCCCC"/>
-            </w:tcBorders>
-            <w:shd w:val="clear" w:color="auto" w:fill="FFFFFF"/>
-            <w:tcMar>
-              <w:top w:w="80" w:type="dxa"/>
-              <w:left w:w="120" w:type="dxa"/>
-              <w:bottom w:w="80" w:type="dxa"/>
-              <w:right w:w="120" w:type="dxa"/>
-            </w:tcMar>
-            <w:vAlign w:val="center"/>
-          </w:tcPr>
-          <w:p>
-            <w:proofErr w:type="spellStart"/>
-            <w:r>
-              <w:rPr>
-                <w:color w:val="333333"/>
-                <w:sz w:val="18"/>
-                <w:szCs w:val="18"/>
-              </w:rPr>
-              <w:t>Penjualan</w:t>
-            </w:r>
-            <w:proofErr w:type="spellEnd"/>
-          </w:p>
-        </w:tc>
-        <w:tc>
-          <w:tcPr>
-            <w:tcW w:w="2000" w:type="dxa"/>
-            <w:tcBorders>
-              <w:top w:val="single" w:sz="1" w:space="0" w:color="CCCCCC"/>
-              <w:left w:val="single" w:sz="1" w:space="0" w:color="CCCCCC"/>
-              <w:bottom w:val="single" w:sz="1" w:space="0" w:color="CCCCCC"/>
-              <w:right w:val="single" w:sz="1" w:space="0" w:color="CCCCCC"/>
-            </w:tcBorders>
-            <w:shd w:val="clear" w:color="auto" w:fill="FFFFFF"/>
-            <w:tcMar>
-              <w:top w:w="80" w:type="dxa"/>
-              <w:left w:w="120" w:type="dxa"/>
-              <w:bottom w:w="80" w:type="dxa"/>
-              <w:right w:w="120" w:type="dxa"/>
-            </w:tcMar>
-            <w:vAlign w:val="center"/>
-          </w:tcPr>
-          <w:p>
-            <w:pPr>
-              <w:jc w:val="center"/>
-            </w:pPr>
-            <w:r>
-              <w:rPr>
-                <w:b/>
-                <w:bCs/>
-                <w:color w:val="333333"/>
-                <w:sz w:val="18"/>
-                <w:szCs w:val="18"/>
-              </w:rPr>
-              <w:t>2</w:t>
-            </w:r>
-          </w:p>
-        </w:tc>
-        <w:tc>
-          <w:tcPr>
-            <w:tcW w:w="1960" w:type="dxa"/>
-            <w:tcBorders>
-              <w:top w:val="single" w:sz="1" w:space="0" w:color="CCCCCC"/>
-              <w:left w:val="single" w:sz="1" w:space="0" w:color="CCCCCC"/>
-              <w:bottom w:val="single" w:sz="1" w:space="0" w:color="CCCCCC"/>
-              <w:right w:val="single" w:sz="1" w:space="0" w:color="CCCCCC"/>
-            </w:tcBorders>
-            <w:shd w:val="clear" w:color="auto" w:fill="FFFFFF"/>
-            <w:tcMar>
-              <w:top w:w="80" w:type="dxa"/>
-              <w:left w:w="120" w:type="dxa"/>
-              <w:bottom w:w="80" w:type="dxa"/>
-              <w:right w:w="120" w:type="dxa"/>
-            </w:tcMar>
-            <w:vAlign w:val="center"/>
-          </w:tcPr>
-          <w:p>
-            <w:pPr>
-              <w:jc w:val="center"/>
-            </w:pPr>
-            <w:r>
-              <w:rPr>
-                <w:color w:val="333333"/>
-                <w:sz w:val="18"/>
-                <w:szCs w:val="18"/>
-              </w:rPr>
-              <w:t>13%</w:t>
-            </w:r>
-          </w:p>
-        </w:tc>
-      </w:tr>
-      <w:tr>
-        <w:tc>
-          <w:tcPr>
-            <w:tcW w:w="5000" w:type="dxa"/>
-            <w:tcBorders>
-              <w:top w:val="single" w:sz="1" w:space="0" w:color="CCCCCC"/>
-              <w:left w:val="single" w:sz="1" w:space="0" w:color="CCCCCC"/>
-              <w:bottom w:val="single" w:sz="1" w:space="0" w:color="CCCCCC"/>
-              <w:right w:val="single" w:sz="1" w:space="0" w:color="CCCCCC"/>
-            </w:tcBorders>
-            <w:shd w:val="clear" w:color="auto" w:fill="F5F5F5"/>
-            <w:tcMar>
-              <w:top w:w="80" w:type="dxa"/>
-              <w:left w:w="120" w:type="dxa"/>
-              <w:bottom w:w="80" w:type="dxa"/>
-              <w:right w:w="120" w:type="dxa"/>
-            </w:tcMar>
-            <w:vAlign w:val="center"/>
-          </w:tcPr>
-          <w:p>
-            <w:proofErr w:type="spellStart"/>
-            <w:r>
-              <w:rPr>
-                <w:color w:val="333333"/>
-                <w:sz w:val="18"/>
-                <w:szCs w:val="18"/>
-              </w:rPr>
-              <w:t>Hukum</w:t>
-            </w:r>
-            <w:proofErr w:type="spellEnd"/>
-            <w:r>
-              <w:rPr>
-                <w:color w:val="333333"/>
-                <w:sz w:val="18"/>
-                <w:szCs w:val="18"/>
-              </w:rPr>
-              <w:t xml:space="preserve"> &amp; </w:t>
-            </w:r>
-            <w:proofErr w:type="spellStart"/>
-            <w:r>
-              <w:rPr>
-                <w:color w:val="333333"/>
-                <w:sz w:val="18"/>
-                <w:szCs w:val="18"/>
-              </w:rPr>
-              <w:t>Kepatuhan</w:t>
-            </w:r>
-            <w:proofErr w:type="spellEnd"/>
-          </w:p>
-        </w:tc>
-        <w:tc>
-          <w:tcPr>
-            <w:tcW w:w="2000" w:type="dxa"/>
-            <w:tcBorders>
-              <w:top w:val="single" w:sz="1" w:space="0" w:color="CCCCCC"/>
-              <w:left w:val="single" w:sz="1" w:space="0" w:color="CCCCCC"/>
-              <w:bottom w:val="single" w:sz="1" w:space="0" w:color="CCCCCC"/>
-              <w:right w:val="single" w:sz="1" w:space="0" w:color="CCCCCC"/>
-            </w:tcBorders>
-            <w:shd w:val="clear" w:color="auto" w:fill="F5F5F5"/>
-            <w:tcMar>
-              <w:top w:w="80" w:type="dxa"/>
-              <w:left w:w="120" w:type="dxa"/>
-              <w:bottom w:w="80" w:type="dxa"/>
-              <w:right w:w="120" w:type="dxa"/>
-            </w:tcMar>
-            <w:vAlign w:val="center"/>
-          </w:tcPr>
-          <w:p>
-            <w:pPr>
-              <w:jc w:val="center"/>
-            </w:pPr>
-            <w:r>
-              <w:rPr>
-                <w:b/>
-                <w:bCs/>
-                <w:color w:val="333333"/>
-                <w:sz w:val="18"/>
-                <w:szCs w:val="18"/>
-              </w:rPr>
-              <w:t>1</w:t>
-            </w:r>
-          </w:p>
-        </w:tc>
-        <w:tc>
-          <w:tcPr>
-            <w:tcW w:w="1960" w:type="dxa"/>
-            <w:tcBorders>
-              <w:top w:val="single" w:sz="1" w:space="0" w:color="CCCCCC"/>
-              <w:left w:val="single" w:sz="1" w:space="0" w:color="CCCCCC"/>
-              <w:bottom w:val="single" w:sz="1" w:space="0" w:color="CCCCCC"/>
-              <w:right w:val="single" w:sz="1" w:space="0" w:color="CCCCCC"/>
-            </w:tcBorders>
-            <w:shd w:val="clear" w:color="auto" w:fill="F5F5F5"/>
-            <w:tcMar>
-              <w:top w:w="80" w:type="dxa"/>
-              <w:left w:w="120" w:type="dxa"/>
-              <w:bottom w:w="80" w:type="dxa"/>
-              <w:right w:w="120" w:type="dxa"/>
-            </w:tcMar>
-            <w:vAlign w:val="center"/>
-          </w:tcPr>
-          <w:p>
-            <w:pPr>
-              <w:jc w:val="center"/>
-            </w:pPr>
-            <w:r>
-              <w:rPr>
-                <w:color w:val="333333"/>
-                <w:sz w:val="18"/>
-                <w:szCs w:val="18"/>
-              </w:rPr>
-              <w:t>7%</w:t>
-            </w:r>
-          </w:p>
-        </w:tc>
-      </w:tr>
-      <w:tr>
-        <w:tc>
-          <w:tcPr>
-            <w:tcW w:w="5000" w:type="dxa"/>
-            <w:tcBorders>
-              <w:top w:val="single" w:sz="1" w:space="0" w:color="CCCCCC"/>
-              <w:left w:val="single" w:sz="1" w:space="0" w:color="CCCCCC"/>
-              <w:bottom w:val="single" w:sz="1" w:space="0" w:color="CCCCCC"/>
-              <w:right w:val="single" w:sz="1" w:space="0" w:color="CCCCCC"/>
-            </w:tcBorders>
-            <w:shd w:val="clear" w:color="auto" w:fill="2E86AB"/>
-            <w:tcMar>
-              <w:top w:w="80" w:type="dxa"/>
-              <w:left w:w="120" w:type="dxa"/>
-              <w:bottom w:w="80" w:type="dxa"/>
-              <w:right w:w="120" w:type="dxa"/>
-            </w:tcMar>
-            <w:vAlign w:val="center"/>
-          </w:tcPr>
-          <w:p>
-            <w:r>
-              <w:rPr>
-                <w:b/>
-                <w:bCs/>
-                <w:color w:val="FFFFFF"/>
-                <w:sz w:val="18"/>
-                <w:szCs w:val="18"/>
-              </w:rPr>
-              <w:t>TOTAL</w:t>
-            </w:r>
-          </w:p>
-        </w:tc>
-        <w:tc>
-          <w:tcPr>
-            <w:tcW w:w="2000" w:type="dxa"/>
-            <w:tcBorders>
-              <w:top w:val="single" w:sz="1" w:space="0" w:color="CCCCCC"/>
-              <w:left w:val="single" w:sz="1" w:space="0" w:color="CCCCCC"/>
-              <w:bottom w:val="single" w:sz="1" w:space="0" w:color="CCCCCC"/>
-              <w:right w:val="single" w:sz="1" w:space="0" w:color="CCCCCC"/>
-            </w:tcBorders>
-            <w:shd w:val="clear" w:color="auto" w:fill="2E86AB"/>
-            <w:tcMar>
-              <w:top w:w="80" w:type="dxa"/>
-              <w:left w:w="120" w:type="dxa"/>
-              <w:bottom w:w="80" w:type="dxa"/>
-              <w:right w:w="120" w:type="dxa"/>
-            </w:tcMar>
-            <w:vAlign w:val="center"/>
-          </w:tcPr>
-          <w:p>
-            <w:pPr>
-              <w:jc w:val="center"/>
-            </w:pPr>
-            <w:r>
-              <w:rPr>
-                <w:b/>
-                <w:bCs/>
-                <w:color w:val="FFFFFF"/>
-                <w:sz w:val="18"/>
-                <w:szCs w:val="18"/>
-              </w:rPr>
-              <w:t>15</w:t>
-            </w:r>
-          </w:p>
-        </w:tc>
-        <w:tc>
-          <w:tcPr>
-            <w:tcW w:w="1960" w:type="dxa"/>
-            <w:tcBorders>
-              <w:top w:val="single" w:sz="1" w:space="0" w:color="CCCCCC"/>
-              <w:left w:val="single" w:sz="1" w:space="0" w:color="CCCCCC"/>
-              <w:bottom w:val="single" w:sz="1" w:space="0" w:color="CCCCCC"/>
-              <w:right w:val="single" w:sz="1" w:space="0" w:color="CCCCCC"/>
-            </w:tcBorders>
-            <w:shd w:val="clear" w:color="auto" w:fill="2E86AB"/>
-            <w:tcMar>
-              <w:top w:w="80" w:type="dxa"/>
-              <w:left w:w="120" w:type="dxa"/>
-              <w:bottom w:w="80" w:type="dxa"/>
-              <w:right w:w="120" w:type="dxa"/>
-            </w:tcMar>
-            <w:vAlign w:val="center"/>
-          </w:tcPr>
-          <w:p>
-            <w:pPr>
-              <w:jc w:val="center"/>
-            </w:pPr>
-            <w:r>
-              <w:rPr>
-                <w:b/>
-                <w:bCs/>
-                <w:color w:val="FFFFFF"/>
-                <w:sz w:val="18"/>
-                <w:szCs w:val="18"/>
-              </w:rPr>
-              <w:t>100%</w:t>
-            </w:r>
-          </w:p>
-        </w:tc>
-      </w:tr>
-    </w:tbl>
-    <w:p>
-      <w:pPr>
-        <w:spacing w:after="400"/>
-      </w:pPr>
-    </w:p>
-    <w:p>
-      <w:pPr>
-        <w:pStyle w:val="Heading2"/>
-      </w:pPr>
+      <w:bookmarkStart w:id="0" w:name="_GoBack"/>
+      <w:bookmarkEnd w:id="0"/>
       <w:proofErr w:type="spellStart"/>
       <w:r>
         <w:t>Catatan</w:t>
@@ -7857,7 +7200,6 @@
           <w:sz w:val="20"/>
           <w:szCs w:val="20"/>
         </w:rPr>
-        <w:lastRenderedPageBreak/>
         <w:t xml:space="preserve">1.  </w:t>
       </w:r>
       <w:proofErr w:type="spellStart"/>
@@ -9794,7 +9136,7 @@
 </file>
 
 <file path=customXml/itemProps1.xml><?xml version="1.0" encoding="utf-8"?>
-<ds:datastoreItem xmlns:ds="http://schemas.openxmlformats.org/officeDocument/2006/customXml" ds:itemID="{B37AB721-4BD8-485E-A2CF-BD6E4973B304}">
+<ds:datastoreItem xmlns:ds="http://schemas.openxmlformats.org/officeDocument/2006/customXml" ds:itemID="{CA3A1D98-DE36-4D03-A09F-C92510F49539}">
   <ds:schemaRefs>
     <ds:schemaRef ds:uri="http://schemas.openxmlformats.org/officeDocument/2006/bibliography"/>
   </ds:schemaRefs>

</xml_diff>

<commit_message>
refactor: reorganize app modules by feature
- Move chat, contact, knowledge, storage, and AI code into clearer feature folders
- Replace legacy api/rag/lib module paths with new readable structure
- Split contact flow into flow, states, commands, and responses
- Move Twilio sync utility from tools to scripts
- Update imports, README, and rebuild script for the new architecture
</commit_message>
<xml_diff>
--- a/knowledge/data_karyawan.docx
+++ b/knowledge/data_karyawan.docx
@@ -7,6 +7,8 @@
         <w:spacing w:before="200" w:after="60"/>
         <w:jc w:val="center"/>
       </w:pPr>
+      <w:bookmarkStart w:id="0" w:name="_GoBack"/>
+      <w:bookmarkEnd w:id="0"/>
       <w:r>
         <w:rPr>
           <w:b/>
@@ -51,80 +53,16 @@
           <w:sz w:val="20"/>
           <w:szCs w:val="20"/>
         </w:rPr>
-        <w:t xml:space="preserve">Per 15 April </w:t>
-      </w:r>
-      <w:proofErr w:type="gramStart"/>
-      <w:r>
-        <w:rPr>
-          <w:color w:val="888888"/>
-          <w:sz w:val="20"/>
-          <w:szCs w:val="20"/>
-        </w:rPr>
-        <w:t>2025  •</w:t>
-      </w:r>
-      <w:proofErr w:type="gramEnd"/>
-      <w:r>
-        <w:rPr>
-          <w:color w:val="888888"/>
-          <w:sz w:val="20"/>
-          <w:szCs w:val="20"/>
-        </w:rPr>
-        <w:t xml:space="preserve">  Total </w:t>
-      </w:r>
-      <w:proofErr w:type="spellStart"/>
-      <w:r>
-        <w:rPr>
-          <w:color w:val="888888"/>
-          <w:sz w:val="20"/>
-          <w:szCs w:val="20"/>
-        </w:rPr>
-        <w:t>Karyawan</w:t>
-      </w:r>
-      <w:proofErr w:type="spellEnd"/>
-      <w:r>
-        <w:rPr>
-          <w:color w:val="888888"/>
-          <w:sz w:val="20"/>
-          <w:szCs w:val="20"/>
-        </w:rPr>
-        <w:t xml:space="preserve">: 15  •  </w:t>
-      </w:r>
-      <w:proofErr w:type="spellStart"/>
-      <w:r>
-        <w:rPr>
-          <w:color w:val="888888"/>
-          <w:sz w:val="20"/>
-          <w:szCs w:val="20"/>
-        </w:rPr>
-        <w:t>Divisi</w:t>
-      </w:r>
-      <w:proofErr w:type="spellEnd"/>
-      <w:r>
-        <w:rPr>
-          <w:color w:val="888888"/>
-          <w:sz w:val="20"/>
-          <w:szCs w:val="20"/>
-        </w:rPr>
-        <w:t>: 6</w:t>
+        <w:t>Per 15 April 2025  •  Total Karyawan: 15  •  Divisi: 6</w:t>
       </w:r>
     </w:p>
     <w:p>
       <w:pPr>
         <w:pStyle w:val="Heading2"/>
       </w:pPr>
-      <w:proofErr w:type="spellStart"/>
       <w:r>
-        <w:t>Daftar</w:t>
+        <w:t>Daftar Karyawan</w:t>
       </w:r>
-      <w:proofErr w:type="spellEnd"/>
-      <w:r>
-        <w:t xml:space="preserve"> </w:t>
-      </w:r>
-      <w:proofErr w:type="spellStart"/>
-      <w:r>
-        <w:t>Karyawan</w:t>
-      </w:r>
-      <w:proofErr w:type="spellEnd"/>
     </w:p>
     <w:tbl>
       <w:tblPr>
@@ -222,9 +160,32 @@
                 <w:sz w:val="18"/>
                 <w:szCs w:val="18"/>
               </w:rPr>
-              <w:t xml:space="preserve">Nama </w:t>
-            </w:r>
-            <w:proofErr w:type="spellStart"/>
+              <w:t>Nama Lengkap</w:t>
+            </w:r>
+          </w:p>
+        </w:tc>
+        <w:tc>
+          <w:tcPr>
+            <w:tcW w:w="1559" w:type="dxa"/>
+            <w:tcBorders>
+              <w:top w:val="single" w:sz="1" w:space="0" w:color="CCCCCC"/>
+              <w:left w:val="single" w:sz="1" w:space="0" w:color="CCCCCC"/>
+              <w:bottom w:val="single" w:sz="1" w:space="0" w:color="CCCCCC"/>
+              <w:right w:val="single" w:sz="1" w:space="0" w:color="CCCCCC"/>
+            </w:tcBorders>
+            <w:shd w:val="clear" w:color="auto" w:fill="2E86AB"/>
+            <w:tcMar>
+              <w:top w:w="100" w:type="dxa"/>
+              <w:left w:w="120" w:type="dxa"/>
+              <w:bottom w:w="100" w:type="dxa"/>
+              <w:right w:w="120" w:type="dxa"/>
+            </w:tcMar>
+            <w:vAlign w:val="center"/>
+          </w:tcPr>
+          <w:p>
+            <w:pPr>
+              <w:jc w:val="center"/>
+            </w:pPr>
             <w:r>
               <w:rPr>
                 <w:b/>
@@ -233,14 +194,13 @@
                 <w:sz w:val="18"/>
                 <w:szCs w:val="18"/>
               </w:rPr>
-              <w:t>Lengkap</w:t>
-            </w:r>
-            <w:proofErr w:type="spellEnd"/>
-          </w:p>
-        </w:tc>
-        <w:tc>
-          <w:tcPr>
-            <w:tcW w:w="1559" w:type="dxa"/>
+              <w:t>Departemen</w:t>
+            </w:r>
+          </w:p>
+        </w:tc>
+        <w:tc>
+          <w:tcPr>
+            <w:tcW w:w="1602" w:type="dxa"/>
             <w:tcBorders>
               <w:top w:val="single" w:sz="1" w:space="0" w:color="CCCCCC"/>
               <w:left w:val="single" w:sz="1" w:space="0" w:color="CCCCCC"/>
@@ -260,7 +220,6 @@
             <w:pPr>
               <w:jc w:val="center"/>
             </w:pPr>
-            <w:proofErr w:type="spellStart"/>
             <w:r>
               <w:rPr>
                 <w:b/>
@@ -269,14 +228,13 @@
                 <w:sz w:val="18"/>
                 <w:szCs w:val="18"/>
               </w:rPr>
-              <w:t>Departemen</w:t>
-            </w:r>
-            <w:proofErr w:type="spellEnd"/>
-          </w:p>
-        </w:tc>
-        <w:tc>
-          <w:tcPr>
-            <w:tcW w:w="1602" w:type="dxa"/>
+              <w:t>Jabatan</w:t>
+            </w:r>
+          </w:p>
+        </w:tc>
+        <w:tc>
+          <w:tcPr>
+            <w:tcW w:w="2902" w:type="dxa"/>
             <w:tcBorders>
               <w:top w:val="single" w:sz="1" w:space="0" w:color="CCCCCC"/>
               <w:left w:val="single" w:sz="1" w:space="0" w:color="CCCCCC"/>
@@ -296,7 +254,6 @@
             <w:pPr>
               <w:jc w:val="center"/>
             </w:pPr>
-            <w:proofErr w:type="spellStart"/>
             <w:r>
               <w:rPr>
                 <w:b/>
@@ -305,14 +262,13 @@
                 <w:sz w:val="18"/>
                 <w:szCs w:val="18"/>
               </w:rPr>
-              <w:t>Jabatan</w:t>
-            </w:r>
-            <w:proofErr w:type="spellEnd"/>
-          </w:p>
-        </w:tc>
-        <w:tc>
-          <w:tcPr>
-            <w:tcW w:w="2902" w:type="dxa"/>
+              <w:t>Email</w:t>
+            </w:r>
+          </w:p>
+        </w:tc>
+        <w:tc>
+          <w:tcPr>
+            <w:tcW w:w="1376" w:type="dxa"/>
             <w:tcBorders>
               <w:top w:val="single" w:sz="1" w:space="0" w:color="CCCCCC"/>
               <w:left w:val="single" w:sz="1" w:space="0" w:color="CCCCCC"/>
@@ -340,13 +296,13 @@
                 <w:sz w:val="18"/>
                 <w:szCs w:val="18"/>
               </w:rPr>
-              <w:t>Email</w:t>
-            </w:r>
-          </w:p>
-        </w:tc>
-        <w:tc>
-          <w:tcPr>
-            <w:tcW w:w="1376" w:type="dxa"/>
+              <w:t>No. Telepon</w:t>
+            </w:r>
+          </w:p>
+        </w:tc>
+        <w:tc>
+          <w:tcPr>
+            <w:tcW w:w="1383" w:type="dxa"/>
             <w:tcBorders>
               <w:top w:val="single" w:sz="1" w:space="0" w:color="CCCCCC"/>
               <w:left w:val="single" w:sz="1" w:space="0" w:color="CCCCCC"/>
@@ -374,9 +330,32 @@
                 <w:sz w:val="18"/>
                 <w:szCs w:val="18"/>
               </w:rPr>
-              <w:t xml:space="preserve">No. </w:t>
-            </w:r>
-            <w:proofErr w:type="spellStart"/>
+              <w:t>Lokasi</w:t>
+            </w:r>
+          </w:p>
+        </w:tc>
+        <w:tc>
+          <w:tcPr>
+            <w:tcW w:w="863" w:type="dxa"/>
+            <w:tcBorders>
+              <w:top w:val="single" w:sz="1" w:space="0" w:color="CCCCCC"/>
+              <w:left w:val="single" w:sz="1" w:space="0" w:color="CCCCCC"/>
+              <w:bottom w:val="single" w:sz="1" w:space="0" w:color="CCCCCC"/>
+              <w:right w:val="single" w:sz="1" w:space="0" w:color="CCCCCC"/>
+            </w:tcBorders>
+            <w:shd w:val="clear" w:color="auto" w:fill="2E86AB"/>
+            <w:tcMar>
+              <w:top w:w="100" w:type="dxa"/>
+              <w:left w:w="120" w:type="dxa"/>
+              <w:bottom w:w="100" w:type="dxa"/>
+              <w:right w:w="120" w:type="dxa"/>
+            </w:tcMar>
+            <w:vAlign w:val="center"/>
+          </w:tcPr>
+          <w:p>
+            <w:pPr>
+              <w:jc w:val="center"/>
+            </w:pPr>
             <w:r>
               <w:rPr>
                 <w:b/>
@@ -385,14 +364,13 @@
                 <w:sz w:val="18"/>
                 <w:szCs w:val="18"/>
               </w:rPr>
-              <w:t>Telepon</w:t>
-            </w:r>
-            <w:proofErr w:type="spellEnd"/>
-          </w:p>
-        </w:tc>
-        <w:tc>
-          <w:tcPr>
-            <w:tcW w:w="1383" w:type="dxa"/>
+              <w:t>Status</w:t>
+            </w:r>
+          </w:p>
+        </w:tc>
+        <w:tc>
+          <w:tcPr>
+            <w:tcW w:w="1191" w:type="dxa"/>
             <w:tcBorders>
               <w:top w:val="single" w:sz="1" w:space="0" w:color="CCCCCC"/>
               <w:left w:val="single" w:sz="1" w:space="0" w:color="CCCCCC"/>
@@ -412,7 +390,6 @@
             <w:pPr>
               <w:jc w:val="center"/>
             </w:pPr>
-            <w:proofErr w:type="spellStart"/>
             <w:r>
               <w:rPr>
                 <w:b/>
@@ -421,25 +398,26 @@
                 <w:sz w:val="18"/>
                 <w:szCs w:val="18"/>
               </w:rPr>
-              <w:t>Lokasi</w:t>
-            </w:r>
-            <w:proofErr w:type="spellEnd"/>
-          </w:p>
-        </w:tc>
-        <w:tc>
-          <w:tcPr>
-            <w:tcW w:w="863" w:type="dxa"/>
-            <w:tcBorders>
-              <w:top w:val="single" w:sz="1" w:space="0" w:color="CCCCCC"/>
-              <w:left w:val="single" w:sz="1" w:space="0" w:color="CCCCCC"/>
-              <w:bottom w:val="single" w:sz="1" w:space="0" w:color="CCCCCC"/>
-              <w:right w:val="single" w:sz="1" w:space="0" w:color="CCCCCC"/>
-            </w:tcBorders>
-            <w:shd w:val="clear" w:color="auto" w:fill="2E86AB"/>
-            <w:tcMar>
-              <w:top w:w="100" w:type="dxa"/>
-              <w:left w:w="120" w:type="dxa"/>
-              <w:bottom w:w="100" w:type="dxa"/>
+              <w:t>Tgl. Bergabung</w:t>
+            </w:r>
+          </w:p>
+        </w:tc>
+      </w:tr>
+      <w:tr>
+        <w:tc>
+          <w:tcPr>
+            <w:tcW w:w="581" w:type="dxa"/>
+            <w:tcBorders>
+              <w:top w:val="single" w:sz="1" w:space="0" w:color="CCCCCC"/>
+              <w:left w:val="single" w:sz="1" w:space="0" w:color="CCCCCC"/>
+              <w:bottom w:val="single" w:sz="1" w:space="0" w:color="CCCCCC"/>
+              <w:right w:val="single" w:sz="1" w:space="0" w:color="CCCCCC"/>
+            </w:tcBorders>
+            <w:shd w:val="clear" w:color="auto" w:fill="FFFFFF"/>
+            <w:tcMar>
+              <w:top w:w="80" w:type="dxa"/>
+              <w:left w:w="120" w:type="dxa"/>
+              <w:bottom w:w="80" w:type="dxa"/>
               <w:right w:w="120" w:type="dxa"/>
             </w:tcMar>
             <w:vAlign w:val="center"/>
@@ -448,32 +426,206 @@
             <w:pPr>
               <w:jc w:val="center"/>
             </w:pPr>
+            <w:r>
+              <w:rPr>
+                <w:color w:val="333333"/>
+                <w:sz w:val="18"/>
+                <w:szCs w:val="18"/>
+              </w:rPr>
+              <w:t>001</w:t>
+            </w:r>
+          </w:p>
+        </w:tc>
+        <w:tc>
+          <w:tcPr>
+            <w:tcW w:w="1503" w:type="dxa"/>
+            <w:tcBorders>
+              <w:top w:val="single" w:sz="1" w:space="0" w:color="CCCCCC"/>
+              <w:left w:val="single" w:sz="1" w:space="0" w:color="CCCCCC"/>
+              <w:bottom w:val="single" w:sz="1" w:space="0" w:color="CCCCCC"/>
+              <w:right w:val="single" w:sz="1" w:space="0" w:color="CCCCCC"/>
+            </w:tcBorders>
+            <w:shd w:val="clear" w:color="auto" w:fill="FFFFFF"/>
+            <w:tcMar>
+              <w:top w:w="80" w:type="dxa"/>
+              <w:left w:w="120" w:type="dxa"/>
+              <w:bottom w:w="80" w:type="dxa"/>
+              <w:right w:w="120" w:type="dxa"/>
+            </w:tcMar>
+            <w:vAlign w:val="center"/>
+          </w:tcPr>
+          <w:p>
             <w:r>
               <w:rPr>
                 <w:b/>
                 <w:bCs/>
-                <w:color w:val="FFFFFF"/>
-                <w:sz w:val="18"/>
-                <w:szCs w:val="18"/>
-              </w:rPr>
-              <w:t>Status</w:t>
-            </w:r>
-          </w:p>
-        </w:tc>
-        <w:tc>
-          <w:tcPr>
-            <w:tcW w:w="1191" w:type="dxa"/>
-            <w:tcBorders>
-              <w:top w:val="single" w:sz="1" w:space="0" w:color="CCCCCC"/>
-              <w:left w:val="single" w:sz="1" w:space="0" w:color="CCCCCC"/>
-              <w:bottom w:val="single" w:sz="1" w:space="0" w:color="CCCCCC"/>
-              <w:right w:val="single" w:sz="1" w:space="0" w:color="CCCCCC"/>
-            </w:tcBorders>
-            <w:shd w:val="clear" w:color="auto" w:fill="2E86AB"/>
-            <w:tcMar>
-              <w:top w:w="100" w:type="dxa"/>
-              <w:left w:w="120" w:type="dxa"/>
-              <w:bottom w:w="100" w:type="dxa"/>
+                <w:color w:val="333333"/>
+                <w:sz w:val="18"/>
+                <w:szCs w:val="18"/>
+              </w:rPr>
+              <w:t>Budi Santoso</w:t>
+            </w:r>
+          </w:p>
+        </w:tc>
+        <w:tc>
+          <w:tcPr>
+            <w:tcW w:w="1559" w:type="dxa"/>
+            <w:tcBorders>
+              <w:top w:val="single" w:sz="1" w:space="0" w:color="CCCCCC"/>
+              <w:left w:val="single" w:sz="1" w:space="0" w:color="CCCCCC"/>
+              <w:bottom w:val="single" w:sz="1" w:space="0" w:color="CCCCCC"/>
+              <w:right w:val="single" w:sz="1" w:space="0" w:color="CCCCCC"/>
+            </w:tcBorders>
+            <w:shd w:val="clear" w:color="auto" w:fill="FFFFFF"/>
+            <w:tcMar>
+              <w:top w:w="80" w:type="dxa"/>
+              <w:left w:w="120" w:type="dxa"/>
+              <w:bottom w:w="80" w:type="dxa"/>
+              <w:right w:w="120" w:type="dxa"/>
+            </w:tcMar>
+            <w:vAlign w:val="center"/>
+          </w:tcPr>
+          <w:p>
+            <w:r>
+              <w:rPr>
+                <w:color w:val="333333"/>
+                <w:sz w:val="18"/>
+                <w:szCs w:val="18"/>
+              </w:rPr>
+              <w:t>Teknologi Informasi</w:t>
+            </w:r>
+          </w:p>
+        </w:tc>
+        <w:tc>
+          <w:tcPr>
+            <w:tcW w:w="1602" w:type="dxa"/>
+            <w:tcBorders>
+              <w:top w:val="single" w:sz="1" w:space="0" w:color="CCCCCC"/>
+              <w:left w:val="single" w:sz="1" w:space="0" w:color="CCCCCC"/>
+              <w:bottom w:val="single" w:sz="1" w:space="0" w:color="CCCCCC"/>
+              <w:right w:val="single" w:sz="1" w:space="0" w:color="CCCCCC"/>
+            </w:tcBorders>
+            <w:shd w:val="clear" w:color="auto" w:fill="FFFFFF"/>
+            <w:tcMar>
+              <w:top w:w="80" w:type="dxa"/>
+              <w:left w:w="120" w:type="dxa"/>
+              <w:bottom w:w="80" w:type="dxa"/>
+              <w:right w:w="120" w:type="dxa"/>
+            </w:tcMar>
+            <w:vAlign w:val="center"/>
+          </w:tcPr>
+          <w:p>
+            <w:r>
+              <w:rPr>
+                <w:color w:val="333333"/>
+                <w:sz w:val="18"/>
+                <w:szCs w:val="18"/>
+              </w:rPr>
+              <w:t>Senior Software Engineer</w:t>
+            </w:r>
+          </w:p>
+        </w:tc>
+        <w:tc>
+          <w:tcPr>
+            <w:tcW w:w="2902" w:type="dxa"/>
+            <w:tcBorders>
+              <w:top w:val="single" w:sz="1" w:space="0" w:color="CCCCCC"/>
+              <w:left w:val="single" w:sz="1" w:space="0" w:color="CCCCCC"/>
+              <w:bottom w:val="single" w:sz="1" w:space="0" w:color="CCCCCC"/>
+              <w:right w:val="single" w:sz="1" w:space="0" w:color="CCCCCC"/>
+            </w:tcBorders>
+            <w:shd w:val="clear" w:color="auto" w:fill="FFFFFF"/>
+            <w:tcMar>
+              <w:top w:w="80" w:type="dxa"/>
+              <w:left w:w="120" w:type="dxa"/>
+              <w:bottom w:w="80" w:type="dxa"/>
+              <w:right w:w="120" w:type="dxa"/>
+            </w:tcMar>
+            <w:vAlign w:val="center"/>
+          </w:tcPr>
+          <w:p>
+            <w:r>
+              <w:rPr>
+                <w:color w:val="333333"/>
+                <w:sz w:val="16"/>
+                <w:szCs w:val="16"/>
+              </w:rPr>
+              <w:t>budi.santoso@perusahaan.co.id</w:t>
+            </w:r>
+          </w:p>
+        </w:tc>
+        <w:tc>
+          <w:tcPr>
+            <w:tcW w:w="1376" w:type="dxa"/>
+            <w:tcBorders>
+              <w:top w:val="single" w:sz="1" w:space="0" w:color="CCCCCC"/>
+              <w:left w:val="single" w:sz="1" w:space="0" w:color="CCCCCC"/>
+              <w:bottom w:val="single" w:sz="1" w:space="0" w:color="CCCCCC"/>
+              <w:right w:val="single" w:sz="1" w:space="0" w:color="CCCCCC"/>
+            </w:tcBorders>
+            <w:shd w:val="clear" w:color="auto" w:fill="FFFFFF"/>
+            <w:tcMar>
+              <w:top w:w="80" w:type="dxa"/>
+              <w:left w:w="120" w:type="dxa"/>
+              <w:bottom w:w="80" w:type="dxa"/>
+              <w:right w:w="120" w:type="dxa"/>
+            </w:tcMar>
+            <w:vAlign w:val="center"/>
+          </w:tcPr>
+          <w:p>
+            <w:r>
+              <w:rPr>
+                <w:color w:val="333333"/>
+                <w:sz w:val="16"/>
+                <w:szCs w:val="16"/>
+              </w:rPr>
+              <w:t>+62 812-3456-7890</w:t>
+            </w:r>
+          </w:p>
+        </w:tc>
+        <w:tc>
+          <w:tcPr>
+            <w:tcW w:w="1383" w:type="dxa"/>
+            <w:tcBorders>
+              <w:top w:val="single" w:sz="1" w:space="0" w:color="CCCCCC"/>
+              <w:left w:val="single" w:sz="1" w:space="0" w:color="CCCCCC"/>
+              <w:bottom w:val="single" w:sz="1" w:space="0" w:color="CCCCCC"/>
+              <w:right w:val="single" w:sz="1" w:space="0" w:color="CCCCCC"/>
+            </w:tcBorders>
+            <w:shd w:val="clear" w:color="auto" w:fill="FFFFFF"/>
+            <w:tcMar>
+              <w:top w:w="80" w:type="dxa"/>
+              <w:left w:w="120" w:type="dxa"/>
+              <w:bottom w:w="80" w:type="dxa"/>
+              <w:right w:w="120" w:type="dxa"/>
+            </w:tcMar>
+            <w:vAlign w:val="center"/>
+          </w:tcPr>
+          <w:p>
+            <w:r>
+              <w:rPr>
+                <w:color w:val="333333"/>
+                <w:sz w:val="18"/>
+                <w:szCs w:val="18"/>
+              </w:rPr>
+              <w:t>Jakarta Selatan</w:t>
+            </w:r>
+          </w:p>
+        </w:tc>
+        <w:tc>
+          <w:tcPr>
+            <w:tcW w:w="863" w:type="dxa"/>
+            <w:tcBorders>
+              <w:top w:val="single" w:sz="1" w:space="0" w:color="CCCCCC"/>
+              <w:left w:val="single" w:sz="1" w:space="0" w:color="CCCCCC"/>
+              <w:bottom w:val="single" w:sz="1" w:space="0" w:color="CCCCCC"/>
+              <w:right w:val="single" w:sz="1" w:space="0" w:color="CCCCCC"/>
+            </w:tcBorders>
+            <w:shd w:val="clear" w:color="auto" w:fill="D4EDDA"/>
+            <w:tcMar>
+              <w:top w:w="80" w:type="dxa"/>
+              <w:left w:w="120" w:type="dxa"/>
+              <w:bottom w:w="80" w:type="dxa"/>
               <w:right w:w="120" w:type="dxa"/>
             </w:tcMar>
             <w:vAlign w:val="center"/>
@@ -482,307 +634,6 @@
             <w:pPr>
               <w:jc w:val="center"/>
             </w:pPr>
-            <w:proofErr w:type="spellStart"/>
-            <w:r>
-              <w:rPr>
-                <w:b/>
-                <w:bCs/>
-                <w:color w:val="FFFFFF"/>
-                <w:sz w:val="18"/>
-                <w:szCs w:val="18"/>
-              </w:rPr>
-              <w:t>Tgl</w:t>
-            </w:r>
-            <w:proofErr w:type="spellEnd"/>
-            <w:r>
-              <w:rPr>
-                <w:b/>
-                <w:bCs/>
-                <w:color w:val="FFFFFF"/>
-                <w:sz w:val="18"/>
-                <w:szCs w:val="18"/>
-              </w:rPr>
-              <w:t xml:space="preserve">. </w:t>
-            </w:r>
-            <w:proofErr w:type="spellStart"/>
-            <w:r>
-              <w:rPr>
-                <w:b/>
-                <w:bCs/>
-                <w:color w:val="FFFFFF"/>
-                <w:sz w:val="18"/>
-                <w:szCs w:val="18"/>
-              </w:rPr>
-              <w:t>Bergabung</w:t>
-            </w:r>
-            <w:proofErr w:type="spellEnd"/>
-          </w:p>
-        </w:tc>
-      </w:tr>
-      <w:tr>
-        <w:tc>
-          <w:tcPr>
-            <w:tcW w:w="581" w:type="dxa"/>
-            <w:tcBorders>
-              <w:top w:val="single" w:sz="1" w:space="0" w:color="CCCCCC"/>
-              <w:left w:val="single" w:sz="1" w:space="0" w:color="CCCCCC"/>
-              <w:bottom w:val="single" w:sz="1" w:space="0" w:color="CCCCCC"/>
-              <w:right w:val="single" w:sz="1" w:space="0" w:color="CCCCCC"/>
-            </w:tcBorders>
-            <w:shd w:val="clear" w:color="auto" w:fill="FFFFFF"/>
-            <w:tcMar>
-              <w:top w:w="80" w:type="dxa"/>
-              <w:left w:w="120" w:type="dxa"/>
-              <w:bottom w:w="80" w:type="dxa"/>
-              <w:right w:w="120" w:type="dxa"/>
-            </w:tcMar>
-            <w:vAlign w:val="center"/>
-          </w:tcPr>
-          <w:p>
-            <w:pPr>
-              <w:jc w:val="center"/>
-            </w:pPr>
-            <w:r>
-              <w:rPr>
-                <w:color w:val="333333"/>
-                <w:sz w:val="18"/>
-                <w:szCs w:val="18"/>
-              </w:rPr>
-              <w:t>001</w:t>
-            </w:r>
-          </w:p>
-        </w:tc>
-        <w:tc>
-          <w:tcPr>
-            <w:tcW w:w="1503" w:type="dxa"/>
-            <w:tcBorders>
-              <w:top w:val="single" w:sz="1" w:space="0" w:color="CCCCCC"/>
-              <w:left w:val="single" w:sz="1" w:space="0" w:color="CCCCCC"/>
-              <w:bottom w:val="single" w:sz="1" w:space="0" w:color="CCCCCC"/>
-              <w:right w:val="single" w:sz="1" w:space="0" w:color="CCCCCC"/>
-            </w:tcBorders>
-            <w:shd w:val="clear" w:color="auto" w:fill="FFFFFF"/>
-            <w:tcMar>
-              <w:top w:w="80" w:type="dxa"/>
-              <w:left w:w="120" w:type="dxa"/>
-              <w:bottom w:w="80" w:type="dxa"/>
-              <w:right w:w="120" w:type="dxa"/>
-            </w:tcMar>
-            <w:vAlign w:val="center"/>
-          </w:tcPr>
-          <w:p>
-            <w:r>
-              <w:rPr>
-                <w:b/>
-                <w:bCs/>
-                <w:color w:val="333333"/>
-                <w:sz w:val="18"/>
-                <w:szCs w:val="18"/>
-              </w:rPr>
-              <w:t xml:space="preserve">Budi </w:t>
-            </w:r>
-            <w:proofErr w:type="spellStart"/>
-            <w:r>
-              <w:rPr>
-                <w:b/>
-                <w:bCs/>
-                <w:color w:val="333333"/>
-                <w:sz w:val="18"/>
-                <w:szCs w:val="18"/>
-              </w:rPr>
-              <w:t>Santoso</w:t>
-            </w:r>
-            <w:proofErr w:type="spellEnd"/>
-          </w:p>
-        </w:tc>
-        <w:tc>
-          <w:tcPr>
-            <w:tcW w:w="1559" w:type="dxa"/>
-            <w:tcBorders>
-              <w:top w:val="single" w:sz="1" w:space="0" w:color="CCCCCC"/>
-              <w:left w:val="single" w:sz="1" w:space="0" w:color="CCCCCC"/>
-              <w:bottom w:val="single" w:sz="1" w:space="0" w:color="CCCCCC"/>
-              <w:right w:val="single" w:sz="1" w:space="0" w:color="CCCCCC"/>
-            </w:tcBorders>
-            <w:shd w:val="clear" w:color="auto" w:fill="FFFFFF"/>
-            <w:tcMar>
-              <w:top w:w="80" w:type="dxa"/>
-              <w:left w:w="120" w:type="dxa"/>
-              <w:bottom w:w="80" w:type="dxa"/>
-              <w:right w:w="120" w:type="dxa"/>
-            </w:tcMar>
-            <w:vAlign w:val="center"/>
-          </w:tcPr>
-          <w:p>
-            <w:proofErr w:type="spellStart"/>
-            <w:r>
-              <w:rPr>
-                <w:color w:val="333333"/>
-                <w:sz w:val="18"/>
-                <w:szCs w:val="18"/>
-              </w:rPr>
-              <w:t>Teknologi</w:t>
-            </w:r>
-            <w:proofErr w:type="spellEnd"/>
-            <w:r>
-              <w:rPr>
-                <w:color w:val="333333"/>
-                <w:sz w:val="18"/>
-                <w:szCs w:val="18"/>
-              </w:rPr>
-              <w:t xml:space="preserve"> </w:t>
-            </w:r>
-            <w:proofErr w:type="spellStart"/>
-            <w:r>
-              <w:rPr>
-                <w:color w:val="333333"/>
-                <w:sz w:val="18"/>
-                <w:szCs w:val="18"/>
-              </w:rPr>
-              <w:t>Informasi</w:t>
-            </w:r>
-            <w:proofErr w:type="spellEnd"/>
-          </w:p>
-        </w:tc>
-        <w:tc>
-          <w:tcPr>
-            <w:tcW w:w="1602" w:type="dxa"/>
-            <w:tcBorders>
-              <w:top w:val="single" w:sz="1" w:space="0" w:color="CCCCCC"/>
-              <w:left w:val="single" w:sz="1" w:space="0" w:color="CCCCCC"/>
-              <w:bottom w:val="single" w:sz="1" w:space="0" w:color="CCCCCC"/>
-              <w:right w:val="single" w:sz="1" w:space="0" w:color="CCCCCC"/>
-            </w:tcBorders>
-            <w:shd w:val="clear" w:color="auto" w:fill="FFFFFF"/>
-            <w:tcMar>
-              <w:top w:w="80" w:type="dxa"/>
-              <w:left w:w="120" w:type="dxa"/>
-              <w:bottom w:w="80" w:type="dxa"/>
-              <w:right w:w="120" w:type="dxa"/>
-            </w:tcMar>
-            <w:vAlign w:val="center"/>
-          </w:tcPr>
-          <w:p>
-            <w:r>
-              <w:rPr>
-                <w:color w:val="333333"/>
-                <w:sz w:val="18"/>
-                <w:szCs w:val="18"/>
-              </w:rPr>
-              <w:t>Senior Software Engineer</w:t>
-            </w:r>
-          </w:p>
-        </w:tc>
-        <w:tc>
-          <w:tcPr>
-            <w:tcW w:w="2902" w:type="dxa"/>
-            <w:tcBorders>
-              <w:top w:val="single" w:sz="1" w:space="0" w:color="CCCCCC"/>
-              <w:left w:val="single" w:sz="1" w:space="0" w:color="CCCCCC"/>
-              <w:bottom w:val="single" w:sz="1" w:space="0" w:color="CCCCCC"/>
-              <w:right w:val="single" w:sz="1" w:space="0" w:color="CCCCCC"/>
-            </w:tcBorders>
-            <w:shd w:val="clear" w:color="auto" w:fill="FFFFFF"/>
-            <w:tcMar>
-              <w:top w:w="80" w:type="dxa"/>
-              <w:left w:w="120" w:type="dxa"/>
-              <w:bottom w:w="80" w:type="dxa"/>
-              <w:right w:w="120" w:type="dxa"/>
-            </w:tcMar>
-            <w:vAlign w:val="center"/>
-          </w:tcPr>
-          <w:p>
-            <w:r>
-              <w:rPr>
-                <w:color w:val="333333"/>
-                <w:sz w:val="16"/>
-                <w:szCs w:val="16"/>
-              </w:rPr>
-              <w:t>budi.santoso@perusahaan.co.id</w:t>
-            </w:r>
-          </w:p>
-        </w:tc>
-        <w:tc>
-          <w:tcPr>
-            <w:tcW w:w="1376" w:type="dxa"/>
-            <w:tcBorders>
-              <w:top w:val="single" w:sz="1" w:space="0" w:color="CCCCCC"/>
-              <w:left w:val="single" w:sz="1" w:space="0" w:color="CCCCCC"/>
-              <w:bottom w:val="single" w:sz="1" w:space="0" w:color="CCCCCC"/>
-              <w:right w:val="single" w:sz="1" w:space="0" w:color="CCCCCC"/>
-            </w:tcBorders>
-            <w:shd w:val="clear" w:color="auto" w:fill="FFFFFF"/>
-            <w:tcMar>
-              <w:top w:w="80" w:type="dxa"/>
-              <w:left w:w="120" w:type="dxa"/>
-              <w:bottom w:w="80" w:type="dxa"/>
-              <w:right w:w="120" w:type="dxa"/>
-            </w:tcMar>
-            <w:vAlign w:val="center"/>
-          </w:tcPr>
-          <w:p>
-            <w:r>
-              <w:rPr>
-                <w:color w:val="333333"/>
-                <w:sz w:val="16"/>
-                <w:szCs w:val="16"/>
-              </w:rPr>
-              <w:t>+62 812-3456-7890</w:t>
-            </w:r>
-          </w:p>
-        </w:tc>
-        <w:tc>
-          <w:tcPr>
-            <w:tcW w:w="1383" w:type="dxa"/>
-            <w:tcBorders>
-              <w:top w:val="single" w:sz="1" w:space="0" w:color="CCCCCC"/>
-              <w:left w:val="single" w:sz="1" w:space="0" w:color="CCCCCC"/>
-              <w:bottom w:val="single" w:sz="1" w:space="0" w:color="CCCCCC"/>
-              <w:right w:val="single" w:sz="1" w:space="0" w:color="CCCCCC"/>
-            </w:tcBorders>
-            <w:shd w:val="clear" w:color="auto" w:fill="FFFFFF"/>
-            <w:tcMar>
-              <w:top w:w="80" w:type="dxa"/>
-              <w:left w:w="120" w:type="dxa"/>
-              <w:bottom w:w="80" w:type="dxa"/>
-              <w:right w:w="120" w:type="dxa"/>
-            </w:tcMar>
-            <w:vAlign w:val="center"/>
-          </w:tcPr>
-          <w:p>
-            <w:r>
-              <w:rPr>
-                <w:color w:val="333333"/>
-                <w:sz w:val="18"/>
-                <w:szCs w:val="18"/>
-              </w:rPr>
-              <w:t>Jakarta Selatan</w:t>
-            </w:r>
-          </w:p>
-        </w:tc>
-        <w:tc>
-          <w:tcPr>
-            <w:tcW w:w="863" w:type="dxa"/>
-            <w:tcBorders>
-              <w:top w:val="single" w:sz="1" w:space="0" w:color="CCCCCC"/>
-              <w:left w:val="single" w:sz="1" w:space="0" w:color="CCCCCC"/>
-              <w:bottom w:val="single" w:sz="1" w:space="0" w:color="CCCCCC"/>
-              <w:right w:val="single" w:sz="1" w:space="0" w:color="CCCCCC"/>
-            </w:tcBorders>
-            <w:shd w:val="clear" w:color="auto" w:fill="D4EDDA"/>
-            <w:tcMar>
-              <w:top w:w="80" w:type="dxa"/>
-              <w:left w:w="120" w:type="dxa"/>
-              <w:bottom w:w="80" w:type="dxa"/>
-              <w:right w:w="120" w:type="dxa"/>
-            </w:tcMar>
-            <w:vAlign w:val="center"/>
-          </w:tcPr>
-          <w:p>
-            <w:pPr>
-              <w:jc w:val="center"/>
-            </w:pPr>
-            <w:proofErr w:type="spellStart"/>
             <w:r>
               <w:rPr>
                 <w:b/>
@@ -793,7 +644,6 @@
               </w:rPr>
               <w:t>Aktif</w:t>
             </w:r>
-            <w:proofErr w:type="spellEnd"/>
           </w:p>
         </w:tc>
         <w:tc>
@@ -881,7 +731,6 @@
             <w:vAlign w:val="center"/>
           </w:tcPr>
           <w:p>
-            <w:proofErr w:type="spellStart"/>
             <w:r>
               <w:rPr>
                 <w:b/>
@@ -890,31 +739,8 @@
                 <w:sz w:val="18"/>
                 <w:szCs w:val="18"/>
               </w:rPr>
-              <w:t>Siti</w:t>
-            </w:r>
-            <w:proofErr w:type="spellEnd"/>
-            <w:r>
-              <w:rPr>
-                <w:b/>
-                <w:bCs/>
-                <w:color w:val="333333"/>
-                <w:sz w:val="18"/>
-                <w:szCs w:val="18"/>
-              </w:rPr>
-              <w:t xml:space="preserve"> </w:t>
-            </w:r>
-            <w:proofErr w:type="spellStart"/>
-            <w:r>
-              <w:rPr>
-                <w:b/>
-                <w:bCs/>
-                <w:color w:val="333333"/>
-                <w:sz w:val="18"/>
-                <w:szCs w:val="18"/>
-              </w:rPr>
-              <w:t>Rahayu</w:t>
-            </w:r>
-            <w:proofErr w:type="spellEnd"/>
+              <w:t>Siti Rahayu</w:t>
+            </w:r>
           </w:p>
         </w:tc>
         <w:tc>
@@ -936,52 +762,14 @@
             <w:vAlign w:val="center"/>
           </w:tcPr>
           <w:p>
-            <w:proofErr w:type="spellStart"/>
-            <w:r>
-              <w:rPr>
-                <w:color w:val="333333"/>
-                <w:sz w:val="18"/>
-                <w:szCs w:val="18"/>
-              </w:rPr>
-              <w:t>Sumber</w:t>
-            </w:r>
-            <w:proofErr w:type="spellEnd"/>
-            <w:r>
-              <w:rPr>
-                <w:color w:val="333333"/>
-                <w:sz w:val="18"/>
-                <w:szCs w:val="18"/>
-              </w:rPr>
-              <w:t xml:space="preserve"> </w:t>
-            </w:r>
-            <w:proofErr w:type="spellStart"/>
-            <w:r>
-              <w:rPr>
-                <w:color w:val="333333"/>
-                <w:sz w:val="18"/>
-                <w:szCs w:val="18"/>
-              </w:rPr>
-              <w:t>Daya</w:t>
-            </w:r>
-            <w:proofErr w:type="spellEnd"/>
-            <w:r>
-              <w:rPr>
-                <w:color w:val="333333"/>
-                <w:sz w:val="18"/>
-                <w:szCs w:val="18"/>
-              </w:rPr>
-              <w:t xml:space="preserve"> </w:t>
-            </w:r>
-            <w:proofErr w:type="spellStart"/>
-            <w:r>
-              <w:rPr>
-                <w:color w:val="333333"/>
-                <w:sz w:val="18"/>
-                <w:szCs w:val="18"/>
-              </w:rPr>
-              <w:t>Manusia</w:t>
-            </w:r>
-            <w:proofErr w:type="spellEnd"/>
+            <w:r>
+              <w:rPr>
+                <w:color w:val="333333"/>
+                <w:sz w:val="18"/>
+                <w:szCs w:val="18"/>
+              </w:rPr>
+              <w:t>Sumber Daya Manusia</w:t>
+            </w:r>
           </w:p>
         </w:tc>
         <w:tc>
@@ -1096,18 +884,8 @@
                 <w:sz w:val="18"/>
                 <w:szCs w:val="18"/>
               </w:rPr>
-              <w:t xml:space="preserve">Jakarta </w:t>
-            </w:r>
-            <w:proofErr w:type="spellStart"/>
-            <w:r>
-              <w:rPr>
-                <w:color w:val="333333"/>
-                <w:sz w:val="18"/>
-                <w:szCs w:val="18"/>
-              </w:rPr>
-              <w:t>Pusat</w:t>
-            </w:r>
-            <w:proofErr w:type="spellEnd"/>
+              <w:t>Jakarta Pusat</w:t>
+            </w:r>
           </w:p>
         </w:tc>
         <w:tc>
@@ -1132,7 +910,6 @@
             <w:pPr>
               <w:jc w:val="center"/>
             </w:pPr>
-            <w:proofErr w:type="spellStart"/>
             <w:r>
               <w:rPr>
                 <w:b/>
@@ -1143,7 +920,6 @@
               </w:rPr>
               <w:t>Aktif</w:t>
             </w:r>
-            <w:proofErr w:type="spellEnd"/>
           </w:p>
         </w:tc>
         <w:tc>
@@ -1231,7 +1007,6 @@
             <w:vAlign w:val="center"/>
           </w:tcPr>
           <w:p>
-            <w:proofErr w:type="spellStart"/>
             <w:r>
               <w:rPr>
                 <w:b/>
@@ -1240,31 +1015,8 @@
                 <w:sz w:val="18"/>
                 <w:szCs w:val="18"/>
               </w:rPr>
-              <w:t>Agus</w:t>
-            </w:r>
-            <w:proofErr w:type="spellEnd"/>
-            <w:r>
-              <w:rPr>
-                <w:b/>
-                <w:bCs/>
-                <w:color w:val="333333"/>
-                <w:sz w:val="18"/>
-                <w:szCs w:val="18"/>
-              </w:rPr>
-              <w:t xml:space="preserve"> </w:t>
-            </w:r>
-            <w:proofErr w:type="spellStart"/>
-            <w:r>
-              <w:rPr>
-                <w:b/>
-                <w:bCs/>
-                <w:color w:val="333333"/>
-                <w:sz w:val="18"/>
-                <w:szCs w:val="18"/>
-              </w:rPr>
-              <w:t>Prasetyo</w:t>
-            </w:r>
-            <w:proofErr w:type="spellEnd"/>
+              <w:t>Agus Prasetyo</w:t>
+            </w:r>
           </w:p>
         </w:tc>
         <w:tc>
@@ -1286,7 +1038,6 @@
             <w:vAlign w:val="center"/>
           </w:tcPr>
           <w:p>
-            <w:proofErr w:type="spellStart"/>
             <w:r>
               <w:rPr>
                 <w:color w:val="333333"/>
@@ -1295,7 +1046,6 @@
               </w:rPr>
               <w:t>Keuangan</w:t>
             </w:r>
-            <w:proofErr w:type="spellEnd"/>
           </w:p>
         </w:tc>
         <w:tc>
@@ -1436,7 +1186,6 @@
             <w:pPr>
               <w:jc w:val="center"/>
             </w:pPr>
-            <w:proofErr w:type="spellStart"/>
             <w:r>
               <w:rPr>
                 <w:b/>
@@ -1447,7 +1196,6 @@
               </w:rPr>
               <w:t>Aktif</w:t>
             </w:r>
-            <w:proofErr w:type="spellEnd"/>
           </w:p>
         </w:tc>
         <w:tc>
@@ -1535,7 +1283,6 @@
             <w:vAlign w:val="center"/>
           </w:tcPr>
           <w:p>
-            <w:proofErr w:type="spellStart"/>
             <w:r>
               <w:rPr>
                 <w:b/>
@@ -1544,31 +1291,8 @@
                 <w:sz w:val="18"/>
                 <w:szCs w:val="18"/>
               </w:rPr>
-              <w:t>Dewi</w:t>
-            </w:r>
-            <w:proofErr w:type="spellEnd"/>
-            <w:r>
-              <w:rPr>
-                <w:b/>
-                <w:bCs/>
-                <w:color w:val="333333"/>
-                <w:sz w:val="18"/>
-                <w:szCs w:val="18"/>
-              </w:rPr>
-              <w:t xml:space="preserve"> </w:t>
-            </w:r>
-            <w:proofErr w:type="spellStart"/>
-            <w:r>
-              <w:rPr>
-                <w:b/>
-                <w:bCs/>
-                <w:color w:val="333333"/>
-                <w:sz w:val="18"/>
-                <w:szCs w:val="18"/>
-              </w:rPr>
-              <w:t>Anggraini</w:t>
-            </w:r>
-            <w:proofErr w:type="spellEnd"/>
+              <w:t>Dewi Anggraini</w:t>
+            </w:r>
           </w:p>
         </w:tc>
         <w:tc>
@@ -1590,7 +1314,6 @@
             <w:vAlign w:val="center"/>
           </w:tcPr>
           <w:p>
-            <w:proofErr w:type="spellStart"/>
             <w:r>
               <w:rPr>
                 <w:color w:val="333333"/>
@@ -1599,7 +1322,6 @@
               </w:rPr>
               <w:t>Pemasaran</w:t>
             </w:r>
-            <w:proofErr w:type="spellEnd"/>
           </w:p>
         </w:tc>
         <w:tc>
@@ -1740,7 +1462,6 @@
             <w:pPr>
               <w:jc w:val="center"/>
             </w:pPr>
-            <w:proofErr w:type="spellStart"/>
             <w:r>
               <w:rPr>
                 <w:b/>
@@ -1751,7 +1472,6 @@
               </w:rPr>
               <w:t>Aktif</w:t>
             </w:r>
-            <w:proofErr w:type="spellEnd"/>
           </w:p>
         </w:tc>
         <w:tc>
@@ -1839,7 +1559,6 @@
             <w:vAlign w:val="center"/>
           </w:tcPr>
           <w:p>
-            <w:proofErr w:type="spellStart"/>
             <w:r>
               <w:rPr>
                 <w:b/>
@@ -1848,31 +1567,8 @@
                 <w:sz w:val="18"/>
                 <w:szCs w:val="18"/>
               </w:rPr>
-              <w:t>Rizky</w:t>
-            </w:r>
-            <w:proofErr w:type="spellEnd"/>
-            <w:r>
-              <w:rPr>
-                <w:b/>
-                <w:bCs/>
-                <w:color w:val="333333"/>
-                <w:sz w:val="18"/>
-                <w:szCs w:val="18"/>
-              </w:rPr>
-              <w:t xml:space="preserve"> </w:t>
-            </w:r>
-            <w:proofErr w:type="spellStart"/>
-            <w:r>
-              <w:rPr>
-                <w:b/>
-                <w:bCs/>
-                <w:color w:val="333333"/>
-                <w:sz w:val="18"/>
-                <w:szCs w:val="18"/>
-              </w:rPr>
-              <w:t>Firmansyah</w:t>
-            </w:r>
-            <w:proofErr w:type="spellEnd"/>
+              <w:t>Rizky Firmansyah</w:t>
+            </w:r>
           </w:p>
         </w:tc>
         <w:tc>
@@ -1894,34 +1590,14 @@
             <w:vAlign w:val="center"/>
           </w:tcPr>
           <w:p>
-            <w:proofErr w:type="spellStart"/>
-            <w:r>
-              <w:rPr>
-                <w:color w:val="333333"/>
-                <w:sz w:val="18"/>
-                <w:szCs w:val="18"/>
-              </w:rPr>
-              <w:t>Teknologi</w:t>
-            </w:r>
-            <w:proofErr w:type="spellEnd"/>
-            <w:r>
-              <w:rPr>
-                <w:color w:val="333333"/>
-                <w:sz w:val="18"/>
-                <w:szCs w:val="18"/>
-              </w:rPr>
-              <w:t xml:space="preserve"> </w:t>
-            </w:r>
-            <w:proofErr w:type="spellStart"/>
-            <w:r>
-              <w:rPr>
-                <w:color w:val="333333"/>
-                <w:sz w:val="18"/>
-                <w:szCs w:val="18"/>
-              </w:rPr>
-              <w:t>Informasi</w:t>
-            </w:r>
-            <w:proofErr w:type="spellEnd"/>
+            <w:r>
+              <w:rPr>
+                <w:color w:val="333333"/>
+                <w:sz w:val="18"/>
+                <w:szCs w:val="18"/>
+              </w:rPr>
+              <w:t>Teknologi Informasi</w:t>
+            </w:r>
           </w:p>
         </w:tc>
         <w:tc>
@@ -2062,7 +1738,6 @@
             <w:pPr>
               <w:jc w:val="center"/>
             </w:pPr>
-            <w:proofErr w:type="spellStart"/>
             <w:r>
               <w:rPr>
                 <w:b/>
@@ -2073,7 +1748,6 @@
               </w:rPr>
               <w:t>Aktif</w:t>
             </w:r>
-            <w:proofErr w:type="spellEnd"/>
           </w:p>
         </w:tc>
         <w:tc>
@@ -2161,7 +1835,6 @@
             <w:vAlign w:val="center"/>
           </w:tcPr>
           <w:p>
-            <w:proofErr w:type="spellStart"/>
             <w:r>
               <w:rPr>
                 <w:b/>
@@ -2170,31 +1843,8 @@
                 <w:sz w:val="18"/>
                 <w:szCs w:val="18"/>
               </w:rPr>
-              <w:t>Nurul</w:t>
-            </w:r>
-            <w:proofErr w:type="spellEnd"/>
-            <w:r>
-              <w:rPr>
-                <w:b/>
-                <w:bCs/>
-                <w:color w:val="333333"/>
-                <w:sz w:val="18"/>
-                <w:szCs w:val="18"/>
-              </w:rPr>
-              <w:t xml:space="preserve"> </w:t>
-            </w:r>
-            <w:proofErr w:type="spellStart"/>
-            <w:r>
-              <w:rPr>
-                <w:b/>
-                <w:bCs/>
-                <w:color w:val="333333"/>
-                <w:sz w:val="18"/>
-                <w:szCs w:val="18"/>
-              </w:rPr>
-              <w:t>Hidayah</w:t>
-            </w:r>
-            <w:proofErr w:type="spellEnd"/>
+              <w:t>Nurul Hidayah</w:t>
+            </w:r>
           </w:p>
         </w:tc>
         <w:tc>
@@ -2216,7 +1866,6 @@
             <w:vAlign w:val="center"/>
           </w:tcPr>
           <w:p>
-            <w:proofErr w:type="spellStart"/>
             <w:r>
               <w:rPr>
                 <w:color w:val="333333"/>
@@ -2225,7 +1874,6 @@
               </w:rPr>
               <w:t>Operasional</w:t>
             </w:r>
-            <w:proofErr w:type="spellEnd"/>
           </w:p>
         </w:tc>
         <w:tc>
@@ -2366,7 +2014,6 @@
             <w:pPr>
               <w:jc w:val="center"/>
             </w:pPr>
-            <w:proofErr w:type="spellStart"/>
             <w:r>
               <w:rPr>
                 <w:b/>
@@ -2377,7 +2024,6 @@
               </w:rPr>
               <w:t>Aktif</w:t>
             </w:r>
-            <w:proofErr w:type="spellEnd"/>
           </w:p>
         </w:tc>
         <w:tc>
@@ -2473,20 +2119,8 @@
                 <w:sz w:val="18"/>
                 <w:szCs w:val="18"/>
               </w:rPr>
-              <w:t xml:space="preserve">Hendra </w:t>
-            </w:r>
-            <w:proofErr w:type="spellStart"/>
-            <w:r>
-              <w:rPr>
-                <w:b/>
-                <w:bCs/>
-                <w:color w:val="333333"/>
-                <w:sz w:val="18"/>
-                <w:szCs w:val="18"/>
-              </w:rPr>
-              <w:t>Kurniawan</w:t>
-            </w:r>
-            <w:proofErr w:type="spellEnd"/>
+              <w:t>Hendra Kurniawan</w:t>
+            </w:r>
           </w:p>
         </w:tc>
         <w:tc>
@@ -2508,7 +2142,6 @@
             <w:vAlign w:val="center"/>
           </w:tcPr>
           <w:p>
-            <w:proofErr w:type="spellStart"/>
             <w:r>
               <w:rPr>
                 <w:color w:val="333333"/>
@@ -2517,7 +2150,6 @@
               </w:rPr>
               <w:t>Penjualan</w:t>
             </w:r>
-            <w:proofErr w:type="spellEnd"/>
           </w:p>
         </w:tc>
         <w:tc>
@@ -2658,7 +2290,6 @@
             <w:pPr>
               <w:jc w:val="center"/>
             </w:pPr>
-            <w:proofErr w:type="spellStart"/>
             <w:r>
               <w:rPr>
                 <w:b/>
@@ -2669,7 +2300,6 @@
               </w:rPr>
               <w:t>Aktif</w:t>
             </w:r>
-            <w:proofErr w:type="spellEnd"/>
           </w:p>
         </w:tc>
         <w:tc>
@@ -2757,7 +2387,6 @@
             <w:vAlign w:val="center"/>
           </w:tcPr>
           <w:p>
-            <w:proofErr w:type="spellStart"/>
             <w:r>
               <w:rPr>
                 <w:b/>
@@ -2766,31 +2395,8 @@
                 <w:sz w:val="18"/>
                 <w:szCs w:val="18"/>
               </w:rPr>
-              <w:t>Fitri</w:t>
-            </w:r>
-            <w:proofErr w:type="spellEnd"/>
-            <w:r>
-              <w:rPr>
-                <w:b/>
-                <w:bCs/>
-                <w:color w:val="333333"/>
-                <w:sz w:val="18"/>
-                <w:szCs w:val="18"/>
-              </w:rPr>
-              <w:t xml:space="preserve"> </w:t>
-            </w:r>
-            <w:proofErr w:type="spellStart"/>
-            <w:r>
-              <w:rPr>
-                <w:b/>
-                <w:bCs/>
-                <w:color w:val="333333"/>
-                <w:sz w:val="18"/>
-                <w:szCs w:val="18"/>
-              </w:rPr>
-              <w:t>Wulandari</w:t>
-            </w:r>
-            <w:proofErr w:type="spellEnd"/>
+              <w:t>Fitri Wulandari</w:t>
+            </w:r>
           </w:p>
         </w:tc>
         <w:tc>
@@ -2812,7 +2418,6 @@
             <w:vAlign w:val="center"/>
           </w:tcPr>
           <w:p>
-            <w:proofErr w:type="spellStart"/>
             <w:r>
               <w:rPr>
                 <w:color w:val="333333"/>
@@ -2821,7 +2426,6 @@
               </w:rPr>
               <w:t>Pemasaran</w:t>
             </w:r>
-            <w:proofErr w:type="spellEnd"/>
           </w:p>
         </w:tc>
         <w:tc>
@@ -2936,18 +2540,8 @@
                 <w:sz w:val="18"/>
                 <w:szCs w:val="18"/>
               </w:rPr>
-              <w:t xml:space="preserve">Jakarta </w:t>
-            </w:r>
-            <w:proofErr w:type="spellStart"/>
-            <w:r>
-              <w:rPr>
-                <w:color w:val="333333"/>
-                <w:sz w:val="18"/>
-                <w:szCs w:val="18"/>
-              </w:rPr>
-              <w:t>Timur</w:t>
-            </w:r>
-            <w:proofErr w:type="spellEnd"/>
+              <w:t>Jakarta Timur</w:t>
+            </w:r>
           </w:p>
         </w:tc>
         <w:tc>
@@ -2972,7 +2566,6 @@
             <w:pPr>
               <w:jc w:val="center"/>
             </w:pPr>
-            <w:proofErr w:type="spellStart"/>
             <w:r>
               <w:rPr>
                 <w:b/>
@@ -2983,7 +2576,6 @@
               </w:rPr>
               <w:t>Cuti</w:t>
             </w:r>
-            <w:proofErr w:type="spellEnd"/>
           </w:p>
         </w:tc>
         <w:tc>
@@ -3079,20 +2671,8 @@
                 <w:sz w:val="18"/>
                 <w:szCs w:val="18"/>
               </w:rPr>
-              <w:t xml:space="preserve">Dimas </w:t>
-            </w:r>
-            <w:proofErr w:type="spellStart"/>
-            <w:r>
-              <w:rPr>
-                <w:b/>
-                <w:bCs/>
-                <w:color w:val="333333"/>
-                <w:sz w:val="18"/>
-                <w:szCs w:val="18"/>
-              </w:rPr>
-              <w:t>Ardiansyah</w:t>
-            </w:r>
-            <w:proofErr w:type="spellEnd"/>
+              <w:t>Dimas Ardiansyah</w:t>
+            </w:r>
           </w:p>
         </w:tc>
         <w:tc>
@@ -3114,7 +2694,6 @@
             <w:vAlign w:val="center"/>
           </w:tcPr>
           <w:p>
-            <w:proofErr w:type="spellStart"/>
             <w:r>
               <w:rPr>
                 <w:color w:val="333333"/>
@@ -3123,7 +2702,6 @@
               </w:rPr>
               <w:t>Keuangan</w:t>
             </w:r>
-            <w:proofErr w:type="spellEnd"/>
           </w:p>
         </w:tc>
         <w:tc>
@@ -3264,7 +2842,6 @@
             <w:pPr>
               <w:jc w:val="center"/>
             </w:pPr>
-            <w:proofErr w:type="spellStart"/>
             <w:r>
               <w:rPr>
                 <w:b/>
@@ -3275,7 +2852,6 @@
               </w:rPr>
               <w:t>Aktif</w:t>
             </w:r>
-            <w:proofErr w:type="spellEnd"/>
           </w:p>
         </w:tc>
         <w:tc>
@@ -3371,20 +2947,8 @@
                 <w:sz w:val="18"/>
                 <w:szCs w:val="18"/>
               </w:rPr>
-              <w:t xml:space="preserve">Rina </w:t>
-            </w:r>
-            <w:proofErr w:type="spellStart"/>
-            <w:r>
-              <w:rPr>
-                <w:b/>
-                <w:bCs/>
-                <w:color w:val="333333"/>
-                <w:sz w:val="18"/>
-                <w:szCs w:val="18"/>
-              </w:rPr>
-              <w:t>Kusumawati</w:t>
-            </w:r>
-            <w:proofErr w:type="spellEnd"/>
+              <w:t>Rina Kusumawati</w:t>
+            </w:r>
           </w:p>
         </w:tc>
         <w:tc>
@@ -3406,52 +2970,14 @@
             <w:vAlign w:val="center"/>
           </w:tcPr>
           <w:p>
-            <w:proofErr w:type="spellStart"/>
-            <w:r>
-              <w:rPr>
-                <w:color w:val="333333"/>
-                <w:sz w:val="18"/>
-                <w:szCs w:val="18"/>
-              </w:rPr>
-              <w:t>Sumber</w:t>
-            </w:r>
-            <w:proofErr w:type="spellEnd"/>
-            <w:r>
-              <w:rPr>
-                <w:color w:val="333333"/>
-                <w:sz w:val="18"/>
-                <w:szCs w:val="18"/>
-              </w:rPr>
-              <w:t xml:space="preserve"> </w:t>
-            </w:r>
-            <w:proofErr w:type="spellStart"/>
-            <w:r>
-              <w:rPr>
-                <w:color w:val="333333"/>
-                <w:sz w:val="18"/>
-                <w:szCs w:val="18"/>
-              </w:rPr>
-              <w:t>Daya</w:t>
-            </w:r>
-            <w:proofErr w:type="spellEnd"/>
-            <w:r>
-              <w:rPr>
-                <w:color w:val="333333"/>
-                <w:sz w:val="18"/>
-                <w:szCs w:val="18"/>
-              </w:rPr>
-              <w:t xml:space="preserve"> </w:t>
-            </w:r>
-            <w:proofErr w:type="spellStart"/>
-            <w:r>
-              <w:rPr>
-                <w:color w:val="333333"/>
-                <w:sz w:val="18"/>
-                <w:szCs w:val="18"/>
-              </w:rPr>
-              <w:t>Manusia</w:t>
-            </w:r>
-            <w:proofErr w:type="spellEnd"/>
+            <w:r>
+              <w:rPr>
+                <w:color w:val="333333"/>
+                <w:sz w:val="18"/>
+                <w:szCs w:val="18"/>
+              </w:rPr>
+              <w:t>Sumber Daya Manusia</w:t>
+            </w:r>
           </w:p>
         </w:tc>
         <w:tc>
@@ -3566,18 +3092,8 @@
                 <w:sz w:val="18"/>
                 <w:szCs w:val="18"/>
               </w:rPr>
-              <w:t xml:space="preserve">Jakarta </w:t>
-            </w:r>
-            <w:proofErr w:type="spellStart"/>
-            <w:r>
-              <w:rPr>
-                <w:color w:val="333333"/>
-                <w:sz w:val="18"/>
-                <w:szCs w:val="18"/>
-              </w:rPr>
-              <w:t>Pusat</w:t>
-            </w:r>
-            <w:proofErr w:type="spellEnd"/>
+              <w:t>Jakarta Pusat</w:t>
+            </w:r>
           </w:p>
         </w:tc>
         <w:tc>
@@ -3602,7 +3118,6 @@
             <w:pPr>
               <w:jc w:val="center"/>
             </w:pPr>
-            <w:proofErr w:type="spellStart"/>
             <w:r>
               <w:rPr>
                 <w:b/>
@@ -3613,7 +3128,6 @@
               </w:rPr>
               <w:t>Aktif</w:t>
             </w:r>
-            <w:proofErr w:type="spellEnd"/>
           </w:p>
         </w:tc>
         <w:tc>
@@ -3701,7 +3215,6 @@
             <w:vAlign w:val="center"/>
           </w:tcPr>
           <w:p>
-            <w:proofErr w:type="spellStart"/>
             <w:r>
               <w:rPr>
                 <w:b/>
@@ -3710,31 +3223,8 @@
                 <w:sz w:val="18"/>
                 <w:szCs w:val="18"/>
               </w:rPr>
-              <w:t>Fajar</w:t>
-            </w:r>
-            <w:proofErr w:type="spellEnd"/>
-            <w:r>
-              <w:rPr>
-                <w:b/>
-                <w:bCs/>
-                <w:color w:val="333333"/>
-                <w:sz w:val="18"/>
-                <w:szCs w:val="18"/>
-              </w:rPr>
-              <w:t xml:space="preserve"> </w:t>
-            </w:r>
-            <w:proofErr w:type="spellStart"/>
-            <w:r>
-              <w:rPr>
-                <w:b/>
-                <w:bCs/>
-                <w:color w:val="333333"/>
-                <w:sz w:val="18"/>
-                <w:szCs w:val="18"/>
-              </w:rPr>
-              <w:t>Hidayatullah</w:t>
-            </w:r>
-            <w:proofErr w:type="spellEnd"/>
+              <w:t>Fajar Hidayatullah</w:t>
+            </w:r>
           </w:p>
         </w:tc>
         <w:tc>
@@ -3756,34 +3246,14 @@
             <w:vAlign w:val="center"/>
           </w:tcPr>
           <w:p>
-            <w:proofErr w:type="spellStart"/>
-            <w:r>
-              <w:rPr>
-                <w:color w:val="333333"/>
-                <w:sz w:val="18"/>
-                <w:szCs w:val="18"/>
-              </w:rPr>
-              <w:t>Teknologi</w:t>
-            </w:r>
-            <w:proofErr w:type="spellEnd"/>
-            <w:r>
-              <w:rPr>
-                <w:color w:val="333333"/>
-                <w:sz w:val="18"/>
-                <w:szCs w:val="18"/>
-              </w:rPr>
-              <w:t xml:space="preserve"> </w:t>
-            </w:r>
-            <w:proofErr w:type="spellStart"/>
-            <w:r>
-              <w:rPr>
-                <w:color w:val="333333"/>
-                <w:sz w:val="18"/>
-                <w:szCs w:val="18"/>
-              </w:rPr>
-              <w:t>Informasi</w:t>
-            </w:r>
-            <w:proofErr w:type="spellEnd"/>
+            <w:r>
+              <w:rPr>
+                <w:color w:val="333333"/>
+                <w:sz w:val="18"/>
+                <w:szCs w:val="18"/>
+              </w:rPr>
+              <w:t>Teknologi Informasi</w:t>
+            </w:r>
           </w:p>
         </w:tc>
         <w:tc>
@@ -3924,7 +3394,6 @@
             <w:pPr>
               <w:jc w:val="center"/>
             </w:pPr>
-            <w:proofErr w:type="spellStart"/>
             <w:r>
               <w:rPr>
                 <w:b/>
@@ -3935,7 +3404,6 @@
               </w:rPr>
               <w:t>Aktif</w:t>
             </w:r>
-            <w:proofErr w:type="spellEnd"/>
           </w:p>
         </w:tc>
         <w:tc>
@@ -4031,20 +3499,8 @@
                 <w:sz w:val="18"/>
                 <w:szCs w:val="18"/>
               </w:rPr>
-              <w:t xml:space="preserve">Lestari </w:t>
-            </w:r>
-            <w:proofErr w:type="spellStart"/>
-            <w:r>
-              <w:rPr>
-                <w:b/>
-                <w:bCs/>
-                <w:color w:val="333333"/>
-                <w:sz w:val="18"/>
-                <w:szCs w:val="18"/>
-              </w:rPr>
-              <w:t>Ningrum</w:t>
-            </w:r>
-            <w:proofErr w:type="spellEnd"/>
+              <w:t>Lestari Ningrum</w:t>
+            </w:r>
           </w:p>
         </w:tc>
         <w:tc>
@@ -4066,7 +3522,6 @@
             <w:vAlign w:val="center"/>
           </w:tcPr>
           <w:p>
-            <w:proofErr w:type="spellStart"/>
             <w:r>
               <w:rPr>
                 <w:color w:val="333333"/>
@@ -4075,7 +3530,6 @@
               </w:rPr>
               <w:t>Operasional</w:t>
             </w:r>
-            <w:proofErr w:type="spellEnd"/>
           </w:p>
         </w:tc>
         <w:tc>
@@ -4216,7 +3670,6 @@
             <w:pPr>
               <w:jc w:val="center"/>
             </w:pPr>
-            <w:proofErr w:type="spellStart"/>
             <w:r>
               <w:rPr>
                 <w:b/>
@@ -4227,7 +3680,6 @@
               </w:rPr>
               <w:t>Aktif</w:t>
             </w:r>
-            <w:proofErr w:type="spellEnd"/>
           </w:p>
         </w:tc>
         <w:tc>
@@ -4316,7 +3768,6 @@
             <w:vAlign w:val="center"/>
           </w:tcPr>
           <w:p>
-            <w:proofErr w:type="spellStart"/>
             <w:r>
               <w:rPr>
                 <w:b/>
@@ -4325,31 +3776,8 @@
                 <w:sz w:val="18"/>
                 <w:szCs w:val="18"/>
               </w:rPr>
-              <w:t>Wahyu</w:t>
-            </w:r>
-            <w:proofErr w:type="spellEnd"/>
-            <w:r>
-              <w:rPr>
-                <w:b/>
-                <w:bCs/>
-                <w:color w:val="333333"/>
-                <w:sz w:val="18"/>
-                <w:szCs w:val="18"/>
-              </w:rPr>
-              <w:t xml:space="preserve"> </w:t>
-            </w:r>
-            <w:proofErr w:type="spellStart"/>
-            <w:r>
-              <w:rPr>
-                <w:b/>
-                <w:bCs/>
-                <w:color w:val="333333"/>
-                <w:sz w:val="18"/>
-                <w:szCs w:val="18"/>
-              </w:rPr>
-              <w:t>Setiawan</w:t>
-            </w:r>
-            <w:proofErr w:type="spellEnd"/>
+              <w:t>Wahyu Setiawan</w:t>
+            </w:r>
           </w:p>
         </w:tc>
         <w:tc>
@@ -4371,7 +3799,6 @@
             <w:vAlign w:val="center"/>
           </w:tcPr>
           <w:p>
-            <w:proofErr w:type="spellStart"/>
             <w:r>
               <w:rPr>
                 <w:color w:val="333333"/>
@@ -4380,7 +3807,6 @@
               </w:rPr>
               <w:t>Penjualan</w:t>
             </w:r>
-            <w:proofErr w:type="spellEnd"/>
           </w:p>
         </w:tc>
         <w:tc>
@@ -4521,7 +3947,6 @@
             <w:pPr>
               <w:jc w:val="center"/>
             </w:pPr>
-            <w:proofErr w:type="spellStart"/>
             <w:r>
               <w:rPr>
                 <w:b/>
@@ -4532,7 +3957,6 @@
               </w:rPr>
               <w:t>Aktif</w:t>
             </w:r>
-            <w:proofErr w:type="spellEnd"/>
           </w:p>
         </w:tc>
         <w:tc>
@@ -4651,34 +4075,14 @@
             <w:vAlign w:val="center"/>
           </w:tcPr>
           <w:p>
-            <w:proofErr w:type="spellStart"/>
-            <w:r>
-              <w:rPr>
-                <w:color w:val="333333"/>
-                <w:sz w:val="18"/>
-                <w:szCs w:val="18"/>
-              </w:rPr>
-              <w:t>Hukum</w:t>
-            </w:r>
-            <w:proofErr w:type="spellEnd"/>
-            <w:r>
-              <w:rPr>
-                <w:color w:val="333333"/>
-                <w:sz w:val="18"/>
-                <w:szCs w:val="18"/>
-              </w:rPr>
-              <w:t xml:space="preserve"> &amp; </w:t>
-            </w:r>
-            <w:proofErr w:type="spellStart"/>
-            <w:r>
-              <w:rPr>
-                <w:color w:val="333333"/>
-                <w:sz w:val="18"/>
-                <w:szCs w:val="18"/>
-              </w:rPr>
-              <w:t>Kepatuhan</w:t>
-            </w:r>
-            <w:proofErr w:type="spellEnd"/>
+            <w:r>
+              <w:rPr>
+                <w:color w:val="333333"/>
+                <w:sz w:val="18"/>
+                <w:szCs w:val="18"/>
+              </w:rPr>
+              <w:t>Hukum &amp; Kepatuhan</w:t>
+            </w:r>
           </w:p>
         </w:tc>
         <w:tc>
@@ -4819,7 +4223,6 @@
             <w:pPr>
               <w:jc w:val="center"/>
             </w:pPr>
-            <w:proofErr w:type="spellStart"/>
             <w:r>
               <w:rPr>
                 <w:b/>
@@ -4830,7 +4233,6 @@
               </w:rPr>
               <w:t>Aktif</w:t>
             </w:r>
-            <w:proofErr w:type="spellEnd"/>
           </w:p>
         </w:tc>
         <w:tc>
@@ -4926,20 +4328,8 @@
                 <w:sz w:val="18"/>
                 <w:szCs w:val="18"/>
               </w:rPr>
-              <w:t xml:space="preserve">Yoga </w:t>
-            </w:r>
-            <w:proofErr w:type="spellStart"/>
-            <w:r>
-              <w:rPr>
-                <w:b/>
-                <w:bCs/>
-                <w:color w:val="333333"/>
-                <w:sz w:val="18"/>
-                <w:szCs w:val="18"/>
-              </w:rPr>
-              <w:t>Pratama</w:t>
-            </w:r>
-            <w:proofErr w:type="spellEnd"/>
+              <w:t>Yoga Pratama</w:t>
+            </w:r>
           </w:p>
         </w:tc>
         <w:tc>
@@ -4961,34 +4351,14 @@
             <w:vAlign w:val="center"/>
           </w:tcPr>
           <w:p>
-            <w:proofErr w:type="spellStart"/>
-            <w:r>
-              <w:rPr>
-                <w:color w:val="333333"/>
-                <w:sz w:val="18"/>
-                <w:szCs w:val="18"/>
-              </w:rPr>
-              <w:t>Teknologi</w:t>
-            </w:r>
-            <w:proofErr w:type="spellEnd"/>
-            <w:r>
-              <w:rPr>
-                <w:color w:val="333333"/>
-                <w:sz w:val="18"/>
-                <w:szCs w:val="18"/>
-              </w:rPr>
-              <w:t xml:space="preserve"> </w:t>
-            </w:r>
-            <w:proofErr w:type="spellStart"/>
-            <w:r>
-              <w:rPr>
-                <w:color w:val="333333"/>
-                <w:sz w:val="18"/>
-                <w:szCs w:val="18"/>
-              </w:rPr>
-              <w:t>Informasi</w:t>
-            </w:r>
-            <w:proofErr w:type="spellEnd"/>
+            <w:r>
+              <w:rPr>
+                <w:color w:val="333333"/>
+                <w:sz w:val="18"/>
+                <w:szCs w:val="18"/>
+              </w:rPr>
+              <w:t>Teknologi Informasi</w:t>
+            </w:r>
           </w:p>
         </w:tc>
         <w:tc>
@@ -5129,7 +4499,6 @@
             <w:pPr>
               <w:jc w:val="center"/>
             </w:pPr>
-            <w:proofErr w:type="spellStart"/>
             <w:r>
               <w:rPr>
                 <w:b/>
@@ -5140,7 +4509,6 @@
               </w:rPr>
               <w:t>Aktif</w:t>
             </w:r>
-            <w:proofErr w:type="spellEnd"/>
           </w:p>
         </w:tc>
         <w:tc>
@@ -5242,7 +4610,6 @@
                 <w:szCs w:val="18"/>
               </w:rPr>
             </w:pPr>
-            <w:proofErr w:type="spellStart"/>
             <w:r>
               <w:rPr>
                 <w:b/>
@@ -5251,31 +4618,8 @@
                 <w:sz w:val="18"/>
                 <w:szCs w:val="18"/>
               </w:rPr>
-              <w:t>Ibnu</w:t>
-            </w:r>
-            <w:proofErr w:type="spellEnd"/>
-            <w:r>
-              <w:rPr>
-                <w:b/>
-                <w:bCs/>
-                <w:color w:val="333333"/>
-                <w:sz w:val="18"/>
-                <w:szCs w:val="18"/>
-              </w:rPr>
-              <w:t xml:space="preserve"> </w:t>
-            </w:r>
-            <w:proofErr w:type="spellStart"/>
-            <w:r>
-              <w:rPr>
-                <w:b/>
-                <w:bCs/>
-                <w:color w:val="333333"/>
-                <w:sz w:val="18"/>
-                <w:szCs w:val="18"/>
-              </w:rPr>
-              <w:t>Setiawan</w:t>
-            </w:r>
-            <w:proofErr w:type="spellEnd"/>
+              <w:t>Ibnu Setiawan</w:t>
+            </w:r>
           </w:p>
         </w:tc>
         <w:tc>
@@ -5304,34 +4648,14 @@
                 <w:szCs w:val="18"/>
               </w:rPr>
             </w:pPr>
-            <w:proofErr w:type="spellStart"/>
-            <w:r>
-              <w:rPr>
-                <w:color w:val="333333"/>
-                <w:sz w:val="18"/>
-                <w:szCs w:val="18"/>
-              </w:rPr>
-              <w:t>Teknologi</w:t>
-            </w:r>
-            <w:proofErr w:type="spellEnd"/>
-            <w:r>
-              <w:rPr>
-                <w:color w:val="333333"/>
-                <w:sz w:val="18"/>
-                <w:szCs w:val="18"/>
-              </w:rPr>
-              <w:t xml:space="preserve"> </w:t>
-            </w:r>
-            <w:proofErr w:type="spellStart"/>
-            <w:r>
-              <w:rPr>
-                <w:color w:val="333333"/>
-                <w:sz w:val="18"/>
-                <w:szCs w:val="18"/>
-              </w:rPr>
-              <w:t>Informasi</w:t>
-            </w:r>
-            <w:proofErr w:type="spellEnd"/>
+            <w:r>
+              <w:rPr>
+                <w:color w:val="333333"/>
+                <w:sz w:val="18"/>
+                <w:szCs w:val="18"/>
+              </w:rPr>
+              <w:t>Teknologi Informasi</w:t>
+            </w:r>
           </w:p>
         </w:tc>
         <w:tc>
@@ -5360,7 +4684,6 @@
                 <w:szCs w:val="18"/>
               </w:rPr>
             </w:pPr>
-            <w:proofErr w:type="spellStart"/>
             <w:r>
               <w:rPr>
                 <w:color w:val="333333"/>
@@ -5369,7 +4692,6 @@
               </w:rPr>
               <w:t>Magang</w:t>
             </w:r>
-            <w:proofErr w:type="spellEnd"/>
           </w:p>
         </w:tc>
         <w:tc>
@@ -5488,7 +4810,6 @@
                 <w:szCs w:val="18"/>
               </w:rPr>
             </w:pPr>
-            <w:proofErr w:type="spellStart"/>
             <w:r>
               <w:rPr>
                 <w:color w:val="333333"/>
@@ -5497,7 +4818,6 @@
               </w:rPr>
               <w:t>Portegal</w:t>
             </w:r>
-            <w:proofErr w:type="spellEnd"/>
           </w:p>
         </w:tc>
         <w:tc>
@@ -5529,7 +4849,6 @@
                 <w:szCs w:val="16"/>
               </w:rPr>
             </w:pPr>
-            <w:proofErr w:type="spellStart"/>
             <w:r>
               <w:rPr>
                 <w:b/>
@@ -5540,7 +4859,6 @@
               </w:rPr>
               <w:t>Aktif</w:t>
             </w:r>
-            <w:proofErr w:type="spellEnd"/>
           </w:p>
         </w:tc>
         <w:tc>
@@ -5576,25 +4894,7 @@
                 <w:sz w:val="16"/>
                 <w:szCs w:val="16"/>
               </w:rPr>
-              <w:t xml:space="preserve">20 </w:t>
-            </w:r>
-            <w:proofErr w:type="spellStart"/>
-            <w:r>
-              <w:rPr>
-                <w:color w:val="333333"/>
-                <w:sz w:val="16"/>
-                <w:szCs w:val="16"/>
-              </w:rPr>
-              <w:t>jan</w:t>
-            </w:r>
-            <w:proofErr w:type="spellEnd"/>
-            <w:r>
-              <w:rPr>
-                <w:color w:val="333333"/>
-                <w:sz w:val="16"/>
-                <w:szCs w:val="16"/>
-              </w:rPr>
-              <w:t xml:space="preserve"> 2026</w:t>
+              <w:t>20 jan 2026</w:t>
             </w:r>
           </w:p>
         </w:tc>
@@ -5703,34 +5003,14 @@
                 <w:szCs w:val="18"/>
               </w:rPr>
             </w:pPr>
-            <w:proofErr w:type="spellStart"/>
-            <w:r>
-              <w:rPr>
-                <w:color w:val="333333"/>
-                <w:sz w:val="18"/>
-                <w:szCs w:val="18"/>
-              </w:rPr>
-              <w:t>Teknologi</w:t>
-            </w:r>
-            <w:proofErr w:type="spellEnd"/>
-            <w:r>
-              <w:rPr>
-                <w:color w:val="333333"/>
-                <w:sz w:val="18"/>
-                <w:szCs w:val="18"/>
-              </w:rPr>
-              <w:t xml:space="preserve"> </w:t>
-            </w:r>
-            <w:proofErr w:type="spellStart"/>
-            <w:r>
-              <w:rPr>
-                <w:color w:val="333333"/>
-                <w:sz w:val="18"/>
-                <w:szCs w:val="18"/>
-              </w:rPr>
-              <w:t>Informasi</w:t>
-            </w:r>
-            <w:proofErr w:type="spellEnd"/>
+            <w:r>
+              <w:rPr>
+                <w:color w:val="333333"/>
+                <w:sz w:val="18"/>
+                <w:szCs w:val="18"/>
+              </w:rPr>
+              <w:t>Teknologi Informasi</w:t>
+            </w:r>
           </w:p>
         </w:tc>
         <w:tc>
@@ -5759,23 +5039,13 @@
                 <w:szCs w:val="18"/>
               </w:rPr>
             </w:pPr>
-            <w:proofErr w:type="spellStart"/>
-            <w:r>
-              <w:rPr>
-                <w:color w:val="333333"/>
-                <w:sz w:val="18"/>
-                <w:szCs w:val="18"/>
-              </w:rPr>
-              <w:t>Dosen</w:t>
-            </w:r>
-            <w:proofErr w:type="spellEnd"/>
-            <w:r>
-              <w:rPr>
-                <w:color w:val="333333"/>
-                <w:sz w:val="18"/>
-                <w:szCs w:val="18"/>
-              </w:rPr>
-              <w:t xml:space="preserve"> </w:t>
+            <w:r>
+              <w:rPr>
+                <w:color w:val="333333"/>
+                <w:sz w:val="18"/>
+                <w:szCs w:val="18"/>
+              </w:rPr>
+              <w:t xml:space="preserve">Dosen </w:t>
             </w:r>
           </w:p>
         </w:tc>
@@ -5926,7 +5196,6 @@
                 <w:szCs w:val="16"/>
               </w:rPr>
             </w:pPr>
-            <w:proofErr w:type="spellStart"/>
             <w:r>
               <w:rPr>
                 <w:b/>
@@ -5935,135 +5204,115 @@
                 <w:sz w:val="16"/>
                 <w:szCs w:val="16"/>
               </w:rPr>
-              <w:t>Aktif</w:t>
-            </w:r>
-            <w:proofErr w:type="spellEnd"/>
-            <w:r>
+              <w:t xml:space="preserve">Aktif </w:t>
+            </w:r>
+          </w:p>
+        </w:tc>
+        <w:tc>
+          <w:tcPr>
+            <w:tcW w:w="1191" w:type="dxa"/>
+            <w:tcBorders>
+              <w:top w:val="single" w:sz="1" w:space="0" w:color="CCCCCC"/>
+              <w:left w:val="single" w:sz="1" w:space="0" w:color="CCCCCC"/>
+              <w:bottom w:val="single" w:sz="1" w:space="0" w:color="CCCCCC"/>
+              <w:right w:val="single" w:sz="1" w:space="0" w:color="CCCCCC"/>
+            </w:tcBorders>
+            <w:shd w:val="clear" w:color="auto" w:fill="FFFFFF"/>
+            <w:tcMar>
+              <w:top w:w="80" w:type="dxa"/>
+              <w:left w:w="120" w:type="dxa"/>
+              <w:bottom w:w="80" w:type="dxa"/>
+              <w:right w:w="120" w:type="dxa"/>
+            </w:tcMar>
+            <w:vAlign w:val="center"/>
+          </w:tcPr>
+          <w:p>
+            <w:pPr>
+              <w:jc w:val="center"/>
+              <w:rPr>
+                <w:color w:val="333333"/>
+                <w:sz w:val="16"/>
+                <w:szCs w:val="16"/>
+              </w:rPr>
+            </w:pPr>
+            <w:r>
+              <w:rPr>
+                <w:color w:val="333333"/>
+                <w:sz w:val="16"/>
+                <w:szCs w:val="16"/>
+              </w:rPr>
+              <w:t>20 jan 2026</w:t>
+            </w:r>
+          </w:p>
+        </w:tc>
+      </w:tr>
+      <w:tr>
+        <w:tc>
+          <w:tcPr>
+            <w:tcW w:w="581" w:type="dxa"/>
+            <w:tcBorders>
+              <w:top w:val="single" w:sz="1" w:space="0" w:color="CCCCCC"/>
+              <w:left w:val="single" w:sz="1" w:space="0" w:color="CCCCCC"/>
+              <w:bottom w:val="single" w:sz="1" w:space="0" w:color="CCCCCC"/>
+              <w:right w:val="single" w:sz="1" w:space="0" w:color="CCCCCC"/>
+            </w:tcBorders>
+            <w:shd w:val="clear" w:color="auto" w:fill="FFFFFF"/>
+            <w:tcMar>
+              <w:top w:w="80" w:type="dxa"/>
+              <w:left w:w="120" w:type="dxa"/>
+              <w:bottom w:w="80" w:type="dxa"/>
+              <w:right w:w="120" w:type="dxa"/>
+            </w:tcMar>
+            <w:vAlign w:val="center"/>
+          </w:tcPr>
+          <w:p>
+            <w:pPr>
+              <w:jc w:val="center"/>
+              <w:rPr>
+                <w:color w:val="333333"/>
+                <w:sz w:val="18"/>
+                <w:szCs w:val="18"/>
+              </w:rPr>
+            </w:pPr>
+            <w:r>
+              <w:rPr>
+                <w:color w:val="333333"/>
+                <w:sz w:val="18"/>
+                <w:szCs w:val="18"/>
+              </w:rPr>
+              <w:t>018</w:t>
+            </w:r>
+          </w:p>
+        </w:tc>
+        <w:tc>
+          <w:tcPr>
+            <w:tcW w:w="1503" w:type="dxa"/>
+            <w:tcBorders>
+              <w:top w:val="single" w:sz="1" w:space="0" w:color="CCCCCC"/>
+              <w:left w:val="single" w:sz="1" w:space="0" w:color="CCCCCC"/>
+              <w:bottom w:val="single" w:sz="1" w:space="0" w:color="CCCCCC"/>
+              <w:right w:val="single" w:sz="1" w:space="0" w:color="CCCCCC"/>
+            </w:tcBorders>
+            <w:shd w:val="clear" w:color="auto" w:fill="FFFFFF"/>
+            <w:tcMar>
+              <w:top w:w="80" w:type="dxa"/>
+              <w:left w:w="120" w:type="dxa"/>
+              <w:bottom w:w="80" w:type="dxa"/>
+              <w:right w:w="120" w:type="dxa"/>
+            </w:tcMar>
+            <w:vAlign w:val="center"/>
+          </w:tcPr>
+          <w:p>
+            <w:pPr>
               <w:rPr>
                 <w:b/>
                 <w:bCs/>
-                <w:color w:val="155724"/>
-                <w:sz w:val="16"/>
-                <w:szCs w:val="16"/>
-              </w:rPr>
-              <w:t xml:space="preserve"> </w:t>
-            </w:r>
-          </w:p>
-        </w:tc>
-        <w:tc>
-          <w:tcPr>
-            <w:tcW w:w="1191" w:type="dxa"/>
-            <w:tcBorders>
-              <w:top w:val="single" w:sz="1" w:space="0" w:color="CCCCCC"/>
-              <w:left w:val="single" w:sz="1" w:space="0" w:color="CCCCCC"/>
-              <w:bottom w:val="single" w:sz="1" w:space="0" w:color="CCCCCC"/>
-              <w:right w:val="single" w:sz="1" w:space="0" w:color="CCCCCC"/>
-            </w:tcBorders>
-            <w:shd w:val="clear" w:color="auto" w:fill="FFFFFF"/>
-            <w:tcMar>
-              <w:top w:w="80" w:type="dxa"/>
-              <w:left w:w="120" w:type="dxa"/>
-              <w:bottom w:w="80" w:type="dxa"/>
-              <w:right w:w="120" w:type="dxa"/>
-            </w:tcMar>
-            <w:vAlign w:val="center"/>
-          </w:tcPr>
-          <w:p>
-            <w:pPr>
-              <w:jc w:val="center"/>
-              <w:rPr>
-                <w:color w:val="333333"/>
-                <w:sz w:val="16"/>
-                <w:szCs w:val="16"/>
-              </w:rPr>
-            </w:pPr>
-            <w:r>
-              <w:rPr>
-                <w:color w:val="333333"/>
-                <w:sz w:val="16"/>
-                <w:szCs w:val="16"/>
-              </w:rPr>
-              <w:t xml:space="preserve">20 </w:t>
-            </w:r>
-            <w:proofErr w:type="spellStart"/>
-            <w:r>
-              <w:rPr>
-                <w:color w:val="333333"/>
-                <w:sz w:val="16"/>
-                <w:szCs w:val="16"/>
-              </w:rPr>
-              <w:t>jan</w:t>
-            </w:r>
-            <w:proofErr w:type="spellEnd"/>
-            <w:r>
-              <w:rPr>
-                <w:color w:val="333333"/>
-                <w:sz w:val="16"/>
-                <w:szCs w:val="16"/>
-              </w:rPr>
-              <w:t xml:space="preserve"> 2026</w:t>
-            </w:r>
-          </w:p>
-        </w:tc>
-      </w:tr>
-      <w:tr>
-        <w:tc>
-          <w:tcPr>
-            <w:tcW w:w="581" w:type="dxa"/>
-            <w:tcBorders>
-              <w:top w:val="single" w:sz="1" w:space="0" w:color="CCCCCC"/>
-              <w:left w:val="single" w:sz="1" w:space="0" w:color="CCCCCC"/>
-              <w:bottom w:val="single" w:sz="1" w:space="0" w:color="CCCCCC"/>
-              <w:right w:val="single" w:sz="1" w:space="0" w:color="CCCCCC"/>
-            </w:tcBorders>
-            <w:shd w:val="clear" w:color="auto" w:fill="FFFFFF"/>
-            <w:tcMar>
-              <w:top w:w="80" w:type="dxa"/>
-              <w:left w:w="120" w:type="dxa"/>
-              <w:bottom w:w="80" w:type="dxa"/>
-              <w:right w:w="120" w:type="dxa"/>
-            </w:tcMar>
-            <w:vAlign w:val="center"/>
-          </w:tcPr>
-          <w:p>
-            <w:pPr>
-              <w:jc w:val="center"/>
-              <w:rPr>
-                <w:color w:val="333333"/>
-                <w:sz w:val="18"/>
-                <w:szCs w:val="18"/>
-              </w:rPr>
-            </w:pPr>
-            <w:r>
-              <w:rPr>
-                <w:color w:val="333333"/>
-                <w:sz w:val="18"/>
-                <w:szCs w:val="18"/>
-              </w:rPr>
-              <w:t>018</w:t>
-            </w:r>
-          </w:p>
-        </w:tc>
-        <w:tc>
-          <w:tcPr>
-            <w:tcW w:w="1503" w:type="dxa"/>
-            <w:tcBorders>
-              <w:top w:val="single" w:sz="1" w:space="0" w:color="CCCCCC"/>
-              <w:left w:val="single" w:sz="1" w:space="0" w:color="CCCCCC"/>
-              <w:bottom w:val="single" w:sz="1" w:space="0" w:color="CCCCCC"/>
-              <w:right w:val="single" w:sz="1" w:space="0" w:color="CCCCCC"/>
-            </w:tcBorders>
-            <w:shd w:val="clear" w:color="auto" w:fill="FFFFFF"/>
-            <w:tcMar>
-              <w:top w:w="80" w:type="dxa"/>
-              <w:left w:w="120" w:type="dxa"/>
-              <w:bottom w:w="80" w:type="dxa"/>
-              <w:right w:w="120" w:type="dxa"/>
-            </w:tcMar>
-            <w:vAlign w:val="center"/>
-          </w:tcPr>
-          <w:p>
-            <w:pPr>
+                <w:color w:val="333333"/>
+                <w:sz w:val="18"/>
+                <w:szCs w:val="18"/>
+              </w:rPr>
+            </w:pPr>
+            <w:r>
               <w:rPr>
                 <w:b/>
                 <w:bCs/>
@@ -6071,15 +5320,6 @@
                 <w:sz w:val="18"/>
                 <w:szCs w:val="18"/>
               </w:rPr>
-            </w:pPr>
-            <w:r>
-              <w:rPr>
-                <w:b/>
-                <w:bCs/>
-                <w:color w:val="333333"/>
-                <w:sz w:val="18"/>
-                <w:szCs w:val="18"/>
-              </w:rPr>
               <w:t>Farhan Abas</w:t>
             </w:r>
           </w:p>
@@ -6110,34 +5350,14 @@
                 <w:szCs w:val="18"/>
               </w:rPr>
             </w:pPr>
-            <w:proofErr w:type="spellStart"/>
-            <w:r>
-              <w:rPr>
-                <w:color w:val="333333"/>
-                <w:sz w:val="18"/>
-                <w:szCs w:val="18"/>
-              </w:rPr>
-              <w:t>Teknologi</w:t>
-            </w:r>
-            <w:proofErr w:type="spellEnd"/>
-            <w:r>
-              <w:rPr>
-                <w:color w:val="333333"/>
-                <w:sz w:val="18"/>
-                <w:szCs w:val="18"/>
-              </w:rPr>
-              <w:t xml:space="preserve"> </w:t>
-            </w:r>
-            <w:proofErr w:type="spellStart"/>
-            <w:r>
-              <w:rPr>
-                <w:color w:val="333333"/>
-                <w:sz w:val="18"/>
-                <w:szCs w:val="18"/>
-              </w:rPr>
-              <w:t>Informasi</w:t>
-            </w:r>
-            <w:proofErr w:type="spellEnd"/>
+            <w:r>
+              <w:rPr>
+                <w:color w:val="333333"/>
+                <w:sz w:val="18"/>
+                <w:szCs w:val="18"/>
+              </w:rPr>
+              <w:t>Teknologi Informasi</w:t>
+            </w:r>
           </w:p>
         </w:tc>
         <w:tc>
@@ -6166,7 +5386,6 @@
                 <w:szCs w:val="18"/>
               </w:rPr>
             </w:pPr>
-            <w:proofErr w:type="spellStart"/>
             <w:r>
               <w:rPr>
                 <w:color w:val="333333"/>
@@ -6175,7 +5394,6 @@
               </w:rPr>
               <w:t>Magang</w:t>
             </w:r>
-            <w:proofErr w:type="spellEnd"/>
           </w:p>
         </w:tc>
         <w:tc>
@@ -6333,7 +5551,6 @@
                 <w:szCs w:val="16"/>
               </w:rPr>
             </w:pPr>
-            <w:proofErr w:type="spellStart"/>
             <w:r>
               <w:rPr>
                 <w:b/>
@@ -6344,7 +5561,6 @@
               </w:rPr>
               <w:t>Aktif</w:t>
             </w:r>
-            <w:proofErr w:type="spellEnd"/>
           </w:p>
         </w:tc>
         <w:tc>
@@ -6380,25 +5596,7 @@
                 <w:sz w:val="16"/>
                 <w:szCs w:val="16"/>
               </w:rPr>
-              <w:t xml:space="preserve">19 </w:t>
-            </w:r>
-            <w:proofErr w:type="spellStart"/>
-            <w:r>
-              <w:rPr>
-                <w:color w:val="333333"/>
-                <w:sz w:val="16"/>
-                <w:szCs w:val="16"/>
-              </w:rPr>
-              <w:t>feb</w:t>
-            </w:r>
-            <w:proofErr w:type="spellEnd"/>
-            <w:r>
-              <w:rPr>
-                <w:color w:val="333333"/>
-                <w:sz w:val="16"/>
-                <w:szCs w:val="16"/>
-              </w:rPr>
-              <w:t xml:space="preserve"> 2026</w:t>
+              <w:t>19 feb 2026</w:t>
             </w:r>
           </w:p>
         </w:tc>
@@ -6469,7 +5667,6 @@
                 <w:szCs w:val="18"/>
               </w:rPr>
             </w:pPr>
-            <w:proofErr w:type="spellStart"/>
             <w:r>
               <w:rPr>
                 <w:b/>
@@ -6478,31 +5675,8 @@
                 <w:sz w:val="18"/>
                 <w:szCs w:val="18"/>
               </w:rPr>
-              <w:t>Ibnu</w:t>
-            </w:r>
-            <w:proofErr w:type="spellEnd"/>
-            <w:r>
-              <w:rPr>
-                <w:b/>
-                <w:bCs/>
-                <w:color w:val="333333"/>
-                <w:sz w:val="18"/>
-                <w:szCs w:val="18"/>
-              </w:rPr>
-              <w:t xml:space="preserve"> </w:t>
-            </w:r>
-            <w:proofErr w:type="spellStart"/>
-            <w:r>
-              <w:rPr>
-                <w:b/>
-                <w:bCs/>
-                <w:color w:val="333333"/>
-                <w:sz w:val="18"/>
-                <w:szCs w:val="18"/>
-              </w:rPr>
-              <w:t>Prasetyo</w:t>
-            </w:r>
-            <w:proofErr w:type="spellEnd"/>
+              <w:t>Ibnu Prasetyo</w:t>
+            </w:r>
           </w:p>
         </w:tc>
         <w:tc>
@@ -6678,7 +5852,6 @@
                 <w:szCs w:val="18"/>
               </w:rPr>
             </w:pPr>
-            <w:proofErr w:type="spellStart"/>
             <w:r>
               <w:rPr>
                 <w:color w:val="333333"/>
@@ -6687,7 +5860,6 @@
               </w:rPr>
               <w:t>Belanda</w:t>
             </w:r>
-            <w:proofErr w:type="spellEnd"/>
           </w:p>
         </w:tc>
         <w:tc>
@@ -6719,7 +5891,6 @@
                 <w:szCs w:val="16"/>
               </w:rPr>
             </w:pPr>
-            <w:proofErr w:type="spellStart"/>
             <w:r>
               <w:rPr>
                 <w:b/>
@@ -6730,7 +5901,6 @@
               </w:rPr>
               <w:t>Aktif</w:t>
             </w:r>
-            <w:proofErr w:type="spellEnd"/>
           </w:p>
         </w:tc>
         <w:tc>
@@ -6766,25 +5936,7 @@
                 <w:sz w:val="16"/>
                 <w:szCs w:val="16"/>
               </w:rPr>
-              <w:t xml:space="preserve">20 </w:t>
-            </w:r>
-            <w:proofErr w:type="spellStart"/>
-            <w:r>
-              <w:rPr>
-                <w:color w:val="333333"/>
-                <w:sz w:val="16"/>
-                <w:szCs w:val="16"/>
-              </w:rPr>
-              <w:t>jan</w:t>
-            </w:r>
-            <w:proofErr w:type="spellEnd"/>
-            <w:r>
-              <w:rPr>
-                <w:color w:val="333333"/>
-                <w:sz w:val="16"/>
-                <w:szCs w:val="16"/>
-              </w:rPr>
-              <w:t xml:space="preserve"> 2026</w:t>
+              <w:t>20 jan 2026</w:t>
             </w:r>
           </w:p>
         </w:tc>
@@ -6855,7 +6007,6 @@
                 <w:szCs w:val="18"/>
               </w:rPr>
             </w:pPr>
-            <w:proofErr w:type="spellStart"/>
             <w:r>
               <w:rPr>
                 <w:b/>
@@ -6864,31 +6015,8 @@
                 <w:sz w:val="18"/>
                 <w:szCs w:val="18"/>
               </w:rPr>
-              <w:t>Zaky</w:t>
-            </w:r>
-            <w:proofErr w:type="spellEnd"/>
-            <w:r>
-              <w:rPr>
-                <w:b/>
-                <w:bCs/>
-                <w:color w:val="333333"/>
-                <w:sz w:val="18"/>
-                <w:szCs w:val="18"/>
-              </w:rPr>
-              <w:t xml:space="preserve"> </w:t>
-            </w:r>
-            <w:proofErr w:type="spellStart"/>
-            <w:r>
-              <w:rPr>
-                <w:b/>
-                <w:bCs/>
-                <w:color w:val="333333"/>
-                <w:sz w:val="18"/>
-                <w:szCs w:val="18"/>
-              </w:rPr>
-              <w:t>Arrashid</w:t>
-            </w:r>
-            <w:proofErr w:type="spellEnd"/>
+              <w:t>Zaky Arrashid</w:t>
+            </w:r>
           </w:p>
         </w:tc>
         <w:tc>
@@ -6953,7 +6081,6 @@
                 <w:szCs w:val="18"/>
               </w:rPr>
             </w:pPr>
-            <w:proofErr w:type="spellStart"/>
             <w:r>
               <w:rPr>
                 <w:color w:val="333333"/>
@@ -6962,7 +6089,6 @@
               </w:rPr>
               <w:t>Subcont</w:t>
             </w:r>
-            <w:proofErr w:type="spellEnd"/>
           </w:p>
         </w:tc>
         <w:tc>
@@ -7102,7 +6228,6 @@
                 <w:szCs w:val="16"/>
               </w:rPr>
             </w:pPr>
-            <w:proofErr w:type="spellStart"/>
             <w:r>
               <w:rPr>
                 <w:b/>
@@ -7113,7 +6238,6 @@
               </w:rPr>
               <w:t>Aktif</w:t>
             </w:r>
-            <w:proofErr w:type="spellEnd"/>
           </w:p>
         </w:tc>
         <w:tc>
@@ -7149,25 +6273,352 @@
                 <w:sz w:val="16"/>
                 <w:szCs w:val="16"/>
               </w:rPr>
-              <w:t xml:space="preserve">10 </w:t>
-            </w:r>
-            <w:proofErr w:type="spellStart"/>
-            <w:r>
-              <w:rPr>
-                <w:color w:val="333333"/>
-                <w:sz w:val="16"/>
-                <w:szCs w:val="16"/>
-              </w:rPr>
-              <w:t>feb</w:t>
-            </w:r>
-            <w:proofErr w:type="spellEnd"/>
-            <w:r>
-              <w:rPr>
-                <w:color w:val="333333"/>
-                <w:sz w:val="16"/>
-                <w:szCs w:val="16"/>
-              </w:rPr>
-              <w:t xml:space="preserve"> 2026</w:t>
+              <w:t>10 feb 2026</w:t>
+            </w:r>
+          </w:p>
+        </w:tc>
+      </w:tr>
+      <w:tr>
+        <w:tc>
+          <w:tcPr>
+            <w:tcW w:w="581" w:type="dxa"/>
+            <w:tcBorders>
+              <w:top w:val="single" w:sz="1" w:space="0" w:color="CCCCCC"/>
+              <w:left w:val="single" w:sz="1" w:space="0" w:color="CCCCCC"/>
+              <w:bottom w:val="single" w:sz="1" w:space="0" w:color="CCCCCC"/>
+              <w:right w:val="single" w:sz="1" w:space="0" w:color="CCCCCC"/>
+            </w:tcBorders>
+            <w:shd w:val="clear" w:color="auto" w:fill="FFFFFF"/>
+            <w:tcMar>
+              <w:top w:w="80" w:type="dxa"/>
+              <w:left w:w="120" w:type="dxa"/>
+              <w:bottom w:w="80" w:type="dxa"/>
+              <w:right w:w="120" w:type="dxa"/>
+            </w:tcMar>
+            <w:vAlign w:val="center"/>
+          </w:tcPr>
+          <w:p>
+            <w:pPr>
+              <w:jc w:val="center"/>
+              <w:rPr>
+                <w:color w:val="333333"/>
+                <w:sz w:val="18"/>
+                <w:szCs w:val="18"/>
+              </w:rPr>
+            </w:pPr>
+            <w:r>
+              <w:rPr>
+                <w:color w:val="333333"/>
+                <w:sz w:val="18"/>
+                <w:szCs w:val="18"/>
+              </w:rPr>
+              <w:t>021</w:t>
+            </w:r>
+          </w:p>
+        </w:tc>
+        <w:tc>
+          <w:tcPr>
+            <w:tcW w:w="1503" w:type="dxa"/>
+            <w:tcBorders>
+              <w:top w:val="single" w:sz="1" w:space="0" w:color="CCCCCC"/>
+              <w:left w:val="single" w:sz="1" w:space="0" w:color="CCCCCC"/>
+              <w:bottom w:val="single" w:sz="1" w:space="0" w:color="CCCCCC"/>
+              <w:right w:val="single" w:sz="1" w:space="0" w:color="CCCCCC"/>
+            </w:tcBorders>
+            <w:shd w:val="clear" w:color="auto" w:fill="FFFFFF"/>
+            <w:tcMar>
+              <w:top w:w="80" w:type="dxa"/>
+              <w:left w:w="120" w:type="dxa"/>
+              <w:bottom w:w="80" w:type="dxa"/>
+              <w:right w:w="120" w:type="dxa"/>
+            </w:tcMar>
+            <w:vAlign w:val="center"/>
+          </w:tcPr>
+          <w:p>
+            <w:pPr>
+              <w:rPr>
+                <w:b/>
+                <w:bCs/>
+                <w:color w:val="333333"/>
+                <w:sz w:val="18"/>
+                <w:szCs w:val="18"/>
+              </w:rPr>
+            </w:pPr>
+            <w:r>
+              <w:rPr>
+                <w:b/>
+                <w:bCs/>
+                <w:color w:val="333333"/>
+                <w:sz w:val="18"/>
+                <w:szCs w:val="18"/>
+              </w:rPr>
+              <w:t>Eko Ramadhan</w:t>
+            </w:r>
+          </w:p>
+        </w:tc>
+        <w:tc>
+          <w:tcPr>
+            <w:tcW w:w="1559" w:type="dxa"/>
+            <w:tcBorders>
+              <w:top w:val="single" w:sz="1" w:space="0" w:color="CCCCCC"/>
+              <w:left w:val="single" w:sz="1" w:space="0" w:color="CCCCCC"/>
+              <w:bottom w:val="single" w:sz="1" w:space="0" w:color="CCCCCC"/>
+              <w:right w:val="single" w:sz="1" w:space="0" w:color="CCCCCC"/>
+            </w:tcBorders>
+            <w:shd w:val="clear" w:color="auto" w:fill="FFFFFF"/>
+            <w:tcMar>
+              <w:top w:w="80" w:type="dxa"/>
+              <w:left w:w="120" w:type="dxa"/>
+              <w:bottom w:w="80" w:type="dxa"/>
+              <w:right w:w="120" w:type="dxa"/>
+            </w:tcMar>
+            <w:vAlign w:val="center"/>
+          </w:tcPr>
+          <w:p>
+            <w:pPr>
+              <w:rPr>
+                <w:color w:val="333333"/>
+                <w:sz w:val="18"/>
+                <w:szCs w:val="18"/>
+              </w:rPr>
+            </w:pPr>
+            <w:r>
+              <w:rPr>
+                <w:color w:val="333333"/>
+                <w:sz w:val="18"/>
+                <w:szCs w:val="18"/>
+              </w:rPr>
+              <w:t xml:space="preserve">IT </w:t>
+            </w:r>
+          </w:p>
+        </w:tc>
+        <w:tc>
+          <w:tcPr>
+            <w:tcW w:w="1602" w:type="dxa"/>
+            <w:tcBorders>
+              <w:top w:val="single" w:sz="1" w:space="0" w:color="CCCCCC"/>
+              <w:left w:val="single" w:sz="1" w:space="0" w:color="CCCCCC"/>
+              <w:bottom w:val="single" w:sz="1" w:space="0" w:color="CCCCCC"/>
+              <w:right w:val="single" w:sz="1" w:space="0" w:color="CCCCCC"/>
+            </w:tcBorders>
+            <w:shd w:val="clear" w:color="auto" w:fill="FFFFFF"/>
+            <w:tcMar>
+              <w:top w:w="80" w:type="dxa"/>
+              <w:left w:w="120" w:type="dxa"/>
+              <w:bottom w:w="80" w:type="dxa"/>
+              <w:right w:w="120" w:type="dxa"/>
+            </w:tcMar>
+            <w:vAlign w:val="center"/>
+          </w:tcPr>
+          <w:p>
+            <w:pPr>
+              <w:rPr>
+                <w:color w:val="333333"/>
+                <w:sz w:val="18"/>
+                <w:szCs w:val="18"/>
+              </w:rPr>
+            </w:pPr>
+            <w:r>
+              <w:rPr>
+                <w:color w:val="333333"/>
+                <w:sz w:val="18"/>
+                <w:szCs w:val="18"/>
+              </w:rPr>
+              <w:t>Manager</w:t>
+            </w:r>
+          </w:p>
+        </w:tc>
+        <w:tc>
+          <w:tcPr>
+            <w:tcW w:w="2902" w:type="dxa"/>
+            <w:tcBorders>
+              <w:top w:val="single" w:sz="1" w:space="0" w:color="CCCCCC"/>
+              <w:left w:val="single" w:sz="1" w:space="0" w:color="CCCCCC"/>
+              <w:bottom w:val="single" w:sz="1" w:space="0" w:color="CCCCCC"/>
+              <w:right w:val="single" w:sz="1" w:space="0" w:color="CCCCCC"/>
+            </w:tcBorders>
+            <w:shd w:val="clear" w:color="auto" w:fill="FFFFFF"/>
+            <w:tcMar>
+              <w:top w:w="80" w:type="dxa"/>
+              <w:left w:w="120" w:type="dxa"/>
+              <w:bottom w:w="80" w:type="dxa"/>
+              <w:right w:w="120" w:type="dxa"/>
+            </w:tcMar>
+            <w:vAlign w:val="center"/>
+          </w:tcPr>
+          <w:p>
+            <w:pPr>
+              <w:rPr>
+                <w:rStyle w:val="Hyperlink"/>
+                <w:sz w:val="16"/>
+                <w:szCs w:val="16"/>
+              </w:rPr>
+            </w:pPr>
+            <w:r>
+              <w:rPr>
+                <w:rStyle w:val="Hyperlink"/>
+                <w:sz w:val="16"/>
+                <w:szCs w:val="16"/>
+              </w:rPr>
+              <w:t>eko@perusahaan.com</w:t>
+            </w:r>
+          </w:p>
+        </w:tc>
+        <w:tc>
+          <w:tcPr>
+            <w:tcW w:w="1376" w:type="dxa"/>
+            <w:tcBorders>
+              <w:top w:val="single" w:sz="1" w:space="0" w:color="CCCCCC"/>
+              <w:left w:val="single" w:sz="1" w:space="0" w:color="CCCCCC"/>
+              <w:bottom w:val="single" w:sz="1" w:space="0" w:color="CCCCCC"/>
+              <w:right w:val="single" w:sz="1" w:space="0" w:color="CCCCCC"/>
+            </w:tcBorders>
+            <w:shd w:val="clear" w:color="auto" w:fill="FFFFFF"/>
+            <w:tcMar>
+              <w:top w:w="80" w:type="dxa"/>
+              <w:left w:w="120" w:type="dxa"/>
+              <w:bottom w:w="80" w:type="dxa"/>
+              <w:right w:w="120" w:type="dxa"/>
+            </w:tcMar>
+            <w:vAlign w:val="center"/>
+          </w:tcPr>
+          <w:p>
+            <w:pPr>
+              <w:rPr>
+                <w:color w:val="333333"/>
+                <w:sz w:val="16"/>
+                <w:szCs w:val="16"/>
+              </w:rPr>
+            </w:pPr>
+            <w:r>
+              <w:rPr>
+                <w:color w:val="333333"/>
+                <w:sz w:val="16"/>
+                <w:szCs w:val="16"/>
+              </w:rPr>
+              <w:t>+6285697777292</w:t>
+            </w:r>
+          </w:p>
+        </w:tc>
+        <w:tc>
+          <w:tcPr>
+            <w:tcW w:w="1383" w:type="dxa"/>
+            <w:tcBorders>
+              <w:top w:val="single" w:sz="1" w:space="0" w:color="CCCCCC"/>
+              <w:left w:val="single" w:sz="1" w:space="0" w:color="CCCCCC"/>
+              <w:bottom w:val="single" w:sz="1" w:space="0" w:color="CCCCCC"/>
+              <w:right w:val="single" w:sz="1" w:space="0" w:color="CCCCCC"/>
+            </w:tcBorders>
+            <w:shd w:val="clear" w:color="auto" w:fill="FFFFFF"/>
+            <w:tcMar>
+              <w:top w:w="80" w:type="dxa"/>
+              <w:left w:w="120" w:type="dxa"/>
+              <w:bottom w:w="80" w:type="dxa"/>
+              <w:right w:w="120" w:type="dxa"/>
+            </w:tcMar>
+            <w:vAlign w:val="center"/>
+          </w:tcPr>
+          <w:p>
+            <w:pPr>
+              <w:rPr>
+                <w:color w:val="333333"/>
+                <w:sz w:val="18"/>
+                <w:szCs w:val="18"/>
+              </w:rPr>
+            </w:pPr>
+            <w:r>
+              <w:rPr>
+                <w:color w:val="333333"/>
+                <w:sz w:val="18"/>
+                <w:szCs w:val="18"/>
+              </w:rPr>
+              <w:t>Jakarta</w:t>
+            </w:r>
+          </w:p>
+        </w:tc>
+        <w:tc>
+          <w:tcPr>
+            <w:tcW w:w="863" w:type="dxa"/>
+            <w:tcBorders>
+              <w:top w:val="single" w:sz="1" w:space="0" w:color="CCCCCC"/>
+              <w:left w:val="single" w:sz="1" w:space="0" w:color="CCCCCC"/>
+              <w:bottom w:val="single" w:sz="1" w:space="0" w:color="CCCCCC"/>
+              <w:right w:val="single" w:sz="1" w:space="0" w:color="CCCCCC"/>
+            </w:tcBorders>
+            <w:shd w:val="clear" w:color="auto" w:fill="D4EDDA"/>
+            <w:tcMar>
+              <w:top w:w="80" w:type="dxa"/>
+              <w:left w:w="120" w:type="dxa"/>
+              <w:bottom w:w="80" w:type="dxa"/>
+              <w:right w:w="120" w:type="dxa"/>
+            </w:tcMar>
+            <w:vAlign w:val="center"/>
+          </w:tcPr>
+          <w:p>
+            <w:pPr>
+              <w:jc w:val="center"/>
+              <w:rPr>
+                <w:b/>
+                <w:bCs/>
+                <w:color w:val="155724"/>
+                <w:sz w:val="16"/>
+                <w:szCs w:val="16"/>
+              </w:rPr>
+            </w:pPr>
+            <w:r>
+              <w:rPr>
+                <w:b/>
+                <w:bCs/>
+                <w:color w:val="155724"/>
+                <w:sz w:val="16"/>
+                <w:szCs w:val="16"/>
+              </w:rPr>
+              <w:t>Aktif</w:t>
+            </w:r>
+          </w:p>
+        </w:tc>
+        <w:tc>
+          <w:tcPr>
+            <w:tcW w:w="1191" w:type="dxa"/>
+            <w:tcBorders>
+              <w:top w:val="single" w:sz="1" w:space="0" w:color="CCCCCC"/>
+              <w:left w:val="single" w:sz="1" w:space="0" w:color="CCCCCC"/>
+              <w:bottom w:val="single" w:sz="1" w:space="0" w:color="CCCCCC"/>
+              <w:right w:val="single" w:sz="1" w:space="0" w:color="CCCCCC"/>
+            </w:tcBorders>
+            <w:shd w:val="clear" w:color="auto" w:fill="FFFFFF"/>
+            <w:tcMar>
+              <w:top w:w="80" w:type="dxa"/>
+              <w:left w:w="120" w:type="dxa"/>
+              <w:bottom w:w="80" w:type="dxa"/>
+              <w:right w:w="120" w:type="dxa"/>
+            </w:tcMar>
+            <w:vAlign w:val="center"/>
+          </w:tcPr>
+          <w:p>
+            <w:pPr>
+              <w:jc w:val="center"/>
+              <w:rPr>
+                <w:color w:val="333333"/>
+                <w:sz w:val="16"/>
+                <w:szCs w:val="16"/>
+              </w:rPr>
+            </w:pPr>
+            <w:r>
+              <w:rPr>
+                <w:color w:val="333333"/>
+                <w:sz w:val="16"/>
+                <w:szCs w:val="16"/>
+              </w:rPr>
+              <w:t>1</w:t>
+            </w:r>
+            <w:r>
+              <w:rPr>
+                <w:color w:val="333333"/>
+                <w:sz w:val="16"/>
+                <w:szCs w:val="16"/>
+              </w:rPr>
+              <w:t xml:space="preserve"> feb 2026</w:t>
             </w:r>
           </w:p>
         </w:tc>
@@ -7182,187 +6633,8 @@
       <w:pPr>
         <w:pStyle w:val="Heading2"/>
       </w:pPr>
-      <w:bookmarkStart w:id="0" w:name="_GoBack"/>
-      <w:bookmarkEnd w:id="0"/>
-      <w:proofErr w:type="spellStart"/>
       <w:r>
         <w:t>Catatan</w:t>
-      </w:r>
-      <w:proofErr w:type="spellEnd"/>
-    </w:p>
-    <w:p>
-      <w:pPr>
-        <w:spacing w:after="120"/>
-      </w:pPr>
-      <w:r>
-        <w:rPr>
-          <w:color w:val="444444"/>
-          <w:sz w:val="20"/>
-          <w:szCs w:val="20"/>
-        </w:rPr>
-        <w:t xml:space="preserve">1.  </w:t>
-      </w:r>
-      <w:proofErr w:type="spellStart"/>
-      <w:r>
-        <w:rPr>
-          <w:color w:val="444444"/>
-          <w:sz w:val="20"/>
-          <w:szCs w:val="20"/>
-        </w:rPr>
-        <w:t>Dokumen</w:t>
-      </w:r>
-      <w:proofErr w:type="spellEnd"/>
-      <w:r>
-        <w:rPr>
-          <w:color w:val="444444"/>
-          <w:sz w:val="20"/>
-          <w:szCs w:val="20"/>
-        </w:rPr>
-        <w:t xml:space="preserve"> </w:t>
-      </w:r>
-      <w:proofErr w:type="spellStart"/>
-      <w:r>
-        <w:rPr>
-          <w:color w:val="444444"/>
-          <w:sz w:val="20"/>
-          <w:szCs w:val="20"/>
-        </w:rPr>
-        <w:t>ini</w:t>
-      </w:r>
-      <w:proofErr w:type="spellEnd"/>
-      <w:r>
-        <w:rPr>
-          <w:color w:val="444444"/>
-          <w:sz w:val="20"/>
-          <w:szCs w:val="20"/>
-        </w:rPr>
-        <w:t xml:space="preserve"> </w:t>
-      </w:r>
-      <w:proofErr w:type="spellStart"/>
-      <w:r>
-        <w:rPr>
-          <w:color w:val="444444"/>
-          <w:sz w:val="20"/>
-          <w:szCs w:val="20"/>
-        </w:rPr>
-        <w:t>bersifat</w:t>
-      </w:r>
-      <w:proofErr w:type="spellEnd"/>
-      <w:r>
-        <w:rPr>
-          <w:color w:val="444444"/>
-          <w:sz w:val="20"/>
-          <w:szCs w:val="20"/>
-        </w:rPr>
-        <w:t xml:space="preserve"> </w:t>
-      </w:r>
-      <w:proofErr w:type="spellStart"/>
-      <w:r>
-        <w:rPr>
-          <w:color w:val="444444"/>
-          <w:sz w:val="20"/>
-          <w:szCs w:val="20"/>
-        </w:rPr>
-        <w:t>rahasia</w:t>
-      </w:r>
-      <w:proofErr w:type="spellEnd"/>
-      <w:r>
-        <w:rPr>
-          <w:color w:val="444444"/>
-          <w:sz w:val="20"/>
-          <w:szCs w:val="20"/>
-        </w:rPr>
-        <w:t xml:space="preserve"> </w:t>
-      </w:r>
-      <w:proofErr w:type="spellStart"/>
-      <w:r>
-        <w:rPr>
-          <w:color w:val="444444"/>
-          <w:sz w:val="20"/>
-          <w:szCs w:val="20"/>
-        </w:rPr>
-        <w:t>dan</w:t>
-      </w:r>
-      <w:proofErr w:type="spellEnd"/>
-      <w:r>
-        <w:rPr>
-          <w:color w:val="444444"/>
-          <w:sz w:val="20"/>
-          <w:szCs w:val="20"/>
-        </w:rPr>
-        <w:t xml:space="preserve"> </w:t>
-      </w:r>
-      <w:proofErr w:type="spellStart"/>
-      <w:r>
-        <w:rPr>
-          <w:color w:val="444444"/>
-          <w:sz w:val="20"/>
-          <w:szCs w:val="20"/>
-        </w:rPr>
-        <w:t>hanya</w:t>
-      </w:r>
-      <w:proofErr w:type="spellEnd"/>
-      <w:r>
-        <w:rPr>
-          <w:color w:val="444444"/>
-          <w:sz w:val="20"/>
-          <w:szCs w:val="20"/>
-        </w:rPr>
-        <w:t xml:space="preserve"> </w:t>
-      </w:r>
-      <w:proofErr w:type="spellStart"/>
-      <w:r>
-        <w:rPr>
-          <w:color w:val="444444"/>
-          <w:sz w:val="20"/>
-          <w:szCs w:val="20"/>
-        </w:rPr>
-        <w:t>untuk</w:t>
-      </w:r>
-      <w:proofErr w:type="spellEnd"/>
-      <w:r>
-        <w:rPr>
-          <w:color w:val="444444"/>
-          <w:sz w:val="20"/>
-          <w:szCs w:val="20"/>
-        </w:rPr>
-        <w:t xml:space="preserve"> </w:t>
-      </w:r>
-      <w:proofErr w:type="spellStart"/>
-      <w:r>
-        <w:rPr>
-          <w:color w:val="444444"/>
-          <w:sz w:val="20"/>
-          <w:szCs w:val="20"/>
-        </w:rPr>
-        <w:t>penggunaan</w:t>
-      </w:r>
-      <w:proofErr w:type="spellEnd"/>
-      <w:r>
-        <w:rPr>
-          <w:color w:val="444444"/>
-          <w:sz w:val="20"/>
-          <w:szCs w:val="20"/>
-        </w:rPr>
-        <w:t xml:space="preserve"> internal </w:t>
-      </w:r>
-      <w:proofErr w:type="spellStart"/>
-      <w:r>
-        <w:rPr>
-          <w:color w:val="444444"/>
-          <w:sz w:val="20"/>
-          <w:szCs w:val="20"/>
-        </w:rPr>
-        <w:t>perusahaan</w:t>
-      </w:r>
-      <w:proofErr w:type="spellEnd"/>
-      <w:r>
-        <w:rPr>
-          <w:color w:val="444444"/>
-          <w:sz w:val="20"/>
-          <w:szCs w:val="20"/>
-        </w:rPr>
-        <w:t>.</w:t>
       </w:r>
     </w:p>
     <w:p>
@@ -7375,169 +6647,7 @@
           <w:sz w:val="20"/>
           <w:szCs w:val="20"/>
         </w:rPr>
-        <w:t xml:space="preserve">2.  Data </w:t>
-      </w:r>
-      <w:proofErr w:type="spellStart"/>
-      <w:r>
-        <w:rPr>
-          <w:color w:val="444444"/>
-          <w:sz w:val="20"/>
-          <w:szCs w:val="20"/>
-        </w:rPr>
-        <w:t>karyawan</w:t>
-      </w:r>
-      <w:proofErr w:type="spellEnd"/>
-      <w:r>
-        <w:rPr>
-          <w:color w:val="444444"/>
-          <w:sz w:val="20"/>
-          <w:szCs w:val="20"/>
-        </w:rPr>
-        <w:t xml:space="preserve"> </w:t>
-      </w:r>
-      <w:proofErr w:type="spellStart"/>
-      <w:r>
-        <w:rPr>
-          <w:color w:val="444444"/>
-          <w:sz w:val="20"/>
-          <w:szCs w:val="20"/>
-        </w:rPr>
-        <w:t>diperbarui</w:t>
-      </w:r>
-      <w:proofErr w:type="spellEnd"/>
-      <w:r>
-        <w:rPr>
-          <w:color w:val="444444"/>
-          <w:sz w:val="20"/>
-          <w:szCs w:val="20"/>
-        </w:rPr>
-        <w:t xml:space="preserve"> </w:t>
-      </w:r>
-      <w:proofErr w:type="spellStart"/>
-      <w:r>
-        <w:rPr>
-          <w:color w:val="444444"/>
-          <w:sz w:val="20"/>
-          <w:szCs w:val="20"/>
-        </w:rPr>
-        <w:t>secara</w:t>
-      </w:r>
-      <w:proofErr w:type="spellEnd"/>
-      <w:r>
-        <w:rPr>
-          <w:color w:val="444444"/>
-          <w:sz w:val="20"/>
-          <w:szCs w:val="20"/>
-        </w:rPr>
-        <w:t xml:space="preserve"> </w:t>
-      </w:r>
-      <w:proofErr w:type="spellStart"/>
-      <w:r>
-        <w:rPr>
-          <w:color w:val="444444"/>
-          <w:sz w:val="20"/>
-          <w:szCs w:val="20"/>
-        </w:rPr>
-        <w:t>berkala</w:t>
-      </w:r>
-      <w:proofErr w:type="spellEnd"/>
-      <w:r>
-        <w:rPr>
-          <w:color w:val="444444"/>
-          <w:sz w:val="20"/>
-          <w:szCs w:val="20"/>
-        </w:rPr>
-        <w:t xml:space="preserve"> </w:t>
-      </w:r>
-      <w:proofErr w:type="spellStart"/>
-      <w:r>
-        <w:rPr>
-          <w:color w:val="444444"/>
-          <w:sz w:val="20"/>
-          <w:szCs w:val="20"/>
-        </w:rPr>
-        <w:t>oleh</w:t>
-      </w:r>
-      <w:proofErr w:type="spellEnd"/>
-      <w:r>
-        <w:rPr>
-          <w:color w:val="444444"/>
-          <w:sz w:val="20"/>
-          <w:szCs w:val="20"/>
-        </w:rPr>
-        <w:t xml:space="preserve"> </w:t>
-      </w:r>
-      <w:proofErr w:type="spellStart"/>
-      <w:r>
-        <w:rPr>
-          <w:color w:val="444444"/>
-          <w:sz w:val="20"/>
-          <w:szCs w:val="20"/>
-        </w:rPr>
-        <w:t>Divisi</w:t>
-      </w:r>
-      <w:proofErr w:type="spellEnd"/>
-      <w:r>
-        <w:rPr>
-          <w:color w:val="444444"/>
-          <w:sz w:val="20"/>
-          <w:szCs w:val="20"/>
-        </w:rPr>
-        <w:t xml:space="preserve"> </w:t>
-      </w:r>
-      <w:proofErr w:type="spellStart"/>
-      <w:r>
-        <w:rPr>
-          <w:color w:val="444444"/>
-          <w:sz w:val="20"/>
-          <w:szCs w:val="20"/>
-        </w:rPr>
-        <w:t>Sumber</w:t>
-      </w:r>
-      <w:proofErr w:type="spellEnd"/>
-      <w:r>
-        <w:rPr>
-          <w:color w:val="444444"/>
-          <w:sz w:val="20"/>
-          <w:szCs w:val="20"/>
-        </w:rPr>
-        <w:t xml:space="preserve"> </w:t>
-      </w:r>
-      <w:proofErr w:type="spellStart"/>
-      <w:r>
-        <w:rPr>
-          <w:color w:val="444444"/>
-          <w:sz w:val="20"/>
-          <w:szCs w:val="20"/>
-        </w:rPr>
-        <w:t>Daya</w:t>
-      </w:r>
-      <w:proofErr w:type="spellEnd"/>
-      <w:r>
-        <w:rPr>
-          <w:color w:val="444444"/>
-          <w:sz w:val="20"/>
-          <w:szCs w:val="20"/>
-        </w:rPr>
-        <w:t xml:space="preserve"> </w:t>
-      </w:r>
-      <w:proofErr w:type="spellStart"/>
-      <w:r>
-        <w:rPr>
-          <w:color w:val="444444"/>
-          <w:sz w:val="20"/>
-          <w:szCs w:val="20"/>
-        </w:rPr>
-        <w:t>Manusia</w:t>
-      </w:r>
-      <w:proofErr w:type="spellEnd"/>
-      <w:r>
-        <w:rPr>
-          <w:color w:val="444444"/>
-          <w:sz w:val="20"/>
-          <w:szCs w:val="20"/>
-        </w:rPr>
-        <w:t>.</w:t>
+        <w:t>1.  Dokumen ini bersifat rahasia dan hanya untuk penggunaan internal perusahaan.</w:t>
       </w:r>
     </w:p>
     <w:p>
@@ -7550,133 +6660,7 @@
           <w:sz w:val="20"/>
           <w:szCs w:val="20"/>
         </w:rPr>
-        <w:t>3.  Status "</w:t>
-      </w:r>
-      <w:proofErr w:type="spellStart"/>
-      <w:r>
-        <w:rPr>
-          <w:color w:val="444444"/>
-          <w:sz w:val="20"/>
-          <w:szCs w:val="20"/>
-        </w:rPr>
-        <w:t>Cuti</w:t>
-      </w:r>
-      <w:proofErr w:type="spellEnd"/>
-      <w:r>
-        <w:rPr>
-          <w:color w:val="444444"/>
-          <w:sz w:val="20"/>
-          <w:szCs w:val="20"/>
-        </w:rPr>
-        <w:t xml:space="preserve">" </w:t>
-      </w:r>
-      <w:proofErr w:type="spellStart"/>
-      <w:r>
-        <w:rPr>
-          <w:color w:val="444444"/>
-          <w:sz w:val="20"/>
-          <w:szCs w:val="20"/>
-        </w:rPr>
-        <w:t>menandakan</w:t>
-      </w:r>
-      <w:proofErr w:type="spellEnd"/>
-      <w:r>
-        <w:rPr>
-          <w:color w:val="444444"/>
-          <w:sz w:val="20"/>
-          <w:szCs w:val="20"/>
-        </w:rPr>
-        <w:t xml:space="preserve"> </w:t>
-      </w:r>
-      <w:proofErr w:type="spellStart"/>
-      <w:r>
-        <w:rPr>
-          <w:color w:val="444444"/>
-          <w:sz w:val="20"/>
-          <w:szCs w:val="20"/>
-        </w:rPr>
-        <w:t>karyawan</w:t>
-      </w:r>
-      <w:proofErr w:type="spellEnd"/>
-      <w:r>
-        <w:rPr>
-          <w:color w:val="444444"/>
-          <w:sz w:val="20"/>
-          <w:szCs w:val="20"/>
-        </w:rPr>
-        <w:t xml:space="preserve"> </w:t>
-      </w:r>
-      <w:proofErr w:type="spellStart"/>
-      <w:r>
-        <w:rPr>
-          <w:color w:val="444444"/>
-          <w:sz w:val="20"/>
-          <w:szCs w:val="20"/>
-        </w:rPr>
-        <w:t>sedang</w:t>
-      </w:r>
-      <w:proofErr w:type="spellEnd"/>
-      <w:r>
-        <w:rPr>
-          <w:color w:val="444444"/>
-          <w:sz w:val="20"/>
-          <w:szCs w:val="20"/>
-        </w:rPr>
-        <w:t xml:space="preserve"> </w:t>
-      </w:r>
-      <w:proofErr w:type="spellStart"/>
-      <w:r>
-        <w:rPr>
-          <w:color w:val="444444"/>
-          <w:sz w:val="20"/>
-          <w:szCs w:val="20"/>
-        </w:rPr>
-        <w:t>dalam</w:t>
-      </w:r>
-      <w:proofErr w:type="spellEnd"/>
-      <w:r>
-        <w:rPr>
-          <w:color w:val="444444"/>
-          <w:sz w:val="20"/>
-          <w:szCs w:val="20"/>
-        </w:rPr>
-        <w:t xml:space="preserve"> masa </w:t>
-      </w:r>
-      <w:proofErr w:type="spellStart"/>
-      <w:r>
-        <w:rPr>
-          <w:color w:val="444444"/>
-          <w:sz w:val="20"/>
-          <w:szCs w:val="20"/>
-        </w:rPr>
-        <w:t>cuti</w:t>
-      </w:r>
-      <w:proofErr w:type="spellEnd"/>
-      <w:r>
-        <w:rPr>
-          <w:color w:val="444444"/>
-          <w:sz w:val="20"/>
-          <w:szCs w:val="20"/>
-        </w:rPr>
-        <w:t xml:space="preserve"> </w:t>
-      </w:r>
-      <w:proofErr w:type="spellStart"/>
-      <w:r>
-        <w:rPr>
-          <w:color w:val="444444"/>
-          <w:sz w:val="20"/>
-          <w:szCs w:val="20"/>
-        </w:rPr>
-        <w:t>resmi</w:t>
-      </w:r>
-      <w:proofErr w:type="spellEnd"/>
-      <w:r>
-        <w:rPr>
-          <w:color w:val="444444"/>
-          <w:sz w:val="20"/>
-          <w:szCs w:val="20"/>
-        </w:rPr>
-        <w:t>.</w:t>
+        <w:t>2.  Data karyawan diperbarui secara berkala oleh Divisi Sumber Daya Manusia.</w:t>
       </w:r>
     </w:p>
     <w:p>
@@ -7689,115 +6673,20 @@
           <w:sz w:val="20"/>
           <w:szCs w:val="20"/>
         </w:rPr>
-        <w:t xml:space="preserve">4.  </w:t>
+        <w:t>3.  Status "Cuti" menandakan karyawan sedang dalam masa cuti resmi.</w:t>
       </w:r>
-      <w:proofErr w:type="spellStart"/>
+    </w:p>
+    <w:p>
+      <w:pPr>
+        <w:spacing w:after="120"/>
+      </w:pPr>
       <w:r>
         <w:rPr>
           <w:color w:val="444444"/>
           <w:sz w:val="20"/>
           <w:szCs w:val="20"/>
         </w:rPr>
-        <w:t>Untuk</w:t>
-      </w:r>
-      <w:proofErr w:type="spellEnd"/>
-      <w:r>
-        <w:rPr>
-          <w:color w:val="444444"/>
-          <w:sz w:val="20"/>
-          <w:szCs w:val="20"/>
-        </w:rPr>
-        <w:t xml:space="preserve"> </w:t>
-      </w:r>
-      <w:proofErr w:type="spellStart"/>
-      <w:r>
-        <w:rPr>
-          <w:color w:val="444444"/>
-          <w:sz w:val="20"/>
-          <w:szCs w:val="20"/>
-        </w:rPr>
-        <w:t>informasi</w:t>
-      </w:r>
-      <w:proofErr w:type="spellEnd"/>
-      <w:r>
-        <w:rPr>
-          <w:color w:val="444444"/>
-          <w:sz w:val="20"/>
-          <w:szCs w:val="20"/>
-        </w:rPr>
-        <w:t xml:space="preserve"> </w:t>
-      </w:r>
-      <w:proofErr w:type="spellStart"/>
-      <w:r>
-        <w:rPr>
-          <w:color w:val="444444"/>
-          <w:sz w:val="20"/>
-          <w:szCs w:val="20"/>
-        </w:rPr>
-        <w:t>lebih</w:t>
-      </w:r>
-      <w:proofErr w:type="spellEnd"/>
-      <w:r>
-        <w:rPr>
-          <w:color w:val="444444"/>
-          <w:sz w:val="20"/>
-          <w:szCs w:val="20"/>
-        </w:rPr>
-        <w:t xml:space="preserve"> </w:t>
-      </w:r>
-      <w:proofErr w:type="spellStart"/>
-      <w:r>
-        <w:rPr>
-          <w:color w:val="444444"/>
-          <w:sz w:val="20"/>
-          <w:szCs w:val="20"/>
-        </w:rPr>
-        <w:t>lanjut</w:t>
-      </w:r>
-      <w:proofErr w:type="spellEnd"/>
-      <w:r>
-        <w:rPr>
-          <w:color w:val="444444"/>
-          <w:sz w:val="20"/>
-          <w:szCs w:val="20"/>
-        </w:rPr>
-        <w:t xml:space="preserve">, </w:t>
-      </w:r>
-      <w:proofErr w:type="spellStart"/>
-      <w:r>
-        <w:rPr>
-          <w:color w:val="444444"/>
-          <w:sz w:val="20"/>
-          <w:szCs w:val="20"/>
-        </w:rPr>
-        <w:t>hubungi</w:t>
-      </w:r>
-      <w:proofErr w:type="spellEnd"/>
-      <w:r>
-        <w:rPr>
-          <w:color w:val="444444"/>
-          <w:sz w:val="20"/>
-          <w:szCs w:val="20"/>
-        </w:rPr>
-        <w:t xml:space="preserve"> </w:t>
-      </w:r>
-      <w:proofErr w:type="spellStart"/>
-      <w:r>
-        <w:rPr>
-          <w:color w:val="444444"/>
-          <w:sz w:val="20"/>
-          <w:szCs w:val="20"/>
-        </w:rPr>
-        <w:t>Departemen</w:t>
-      </w:r>
-      <w:proofErr w:type="spellEnd"/>
-      <w:r>
-        <w:rPr>
-          <w:color w:val="444444"/>
-          <w:sz w:val="20"/>
-          <w:szCs w:val="20"/>
-        </w:rPr>
-        <w:t xml:space="preserve"> SDM di: sdm@perusahaan.co.id</w:t>
+        <w:t>4.  Untuk informasi lebih lanjut, hubungi Departemen SDM di: sdm@perusahaan.co.id</w:t>
       </w:r>
     </w:p>
     <w:sectPr>
@@ -7849,115 +6738,7 @@
         <w:sz w:val="16"/>
         <w:szCs w:val="16"/>
       </w:rPr>
-      <w:t xml:space="preserve">© 2025 PT. </w:t>
-    </w:r>
-    <w:proofErr w:type="spellStart"/>
-    <w:r>
-      <w:rPr>
-        <w:color w:val="888888"/>
-        <w:sz w:val="16"/>
-        <w:szCs w:val="16"/>
-      </w:rPr>
-      <w:t>Maju</w:t>
-    </w:r>
-    <w:proofErr w:type="spellEnd"/>
-    <w:r>
-      <w:rPr>
-        <w:color w:val="888888"/>
-        <w:sz w:val="16"/>
-        <w:szCs w:val="16"/>
-      </w:rPr>
-      <w:t xml:space="preserve"> </w:t>
-    </w:r>
-    <w:proofErr w:type="spellStart"/>
-    <w:r>
-      <w:rPr>
-        <w:color w:val="888888"/>
-        <w:sz w:val="16"/>
-        <w:szCs w:val="16"/>
-      </w:rPr>
-      <w:t>Bersama</w:t>
-    </w:r>
-    <w:proofErr w:type="spellEnd"/>
-    <w:r>
-      <w:rPr>
-        <w:color w:val="888888"/>
-        <w:sz w:val="16"/>
-        <w:szCs w:val="16"/>
-      </w:rPr>
-      <w:t xml:space="preserve"> Indonesia. </w:t>
-    </w:r>
-    <w:proofErr w:type="spellStart"/>
-    <w:r>
-      <w:rPr>
-        <w:color w:val="888888"/>
-        <w:sz w:val="16"/>
-        <w:szCs w:val="16"/>
-      </w:rPr>
-      <w:t>Dokumen</w:t>
-    </w:r>
-    <w:proofErr w:type="spellEnd"/>
-    <w:r>
-      <w:rPr>
-        <w:color w:val="888888"/>
-        <w:sz w:val="16"/>
-        <w:szCs w:val="16"/>
-      </w:rPr>
-      <w:t xml:space="preserve"> </w:t>
-    </w:r>
-    <w:proofErr w:type="spellStart"/>
-    <w:r>
-      <w:rPr>
-        <w:color w:val="888888"/>
-        <w:sz w:val="16"/>
-        <w:szCs w:val="16"/>
-      </w:rPr>
-      <w:t>ini</w:t>
-    </w:r>
-    <w:proofErr w:type="spellEnd"/>
-    <w:r>
-      <w:rPr>
-        <w:color w:val="888888"/>
-        <w:sz w:val="16"/>
-        <w:szCs w:val="16"/>
-      </w:rPr>
-      <w:t xml:space="preserve"> </w:t>
-    </w:r>
-    <w:proofErr w:type="spellStart"/>
-    <w:r>
-      <w:rPr>
-        <w:color w:val="888888"/>
-        <w:sz w:val="16"/>
-        <w:szCs w:val="16"/>
-      </w:rPr>
-      <w:t>bersifat</w:t>
-    </w:r>
-    <w:proofErr w:type="spellEnd"/>
-    <w:r>
-      <w:rPr>
-        <w:color w:val="888888"/>
-        <w:sz w:val="16"/>
-        <w:szCs w:val="16"/>
-      </w:rPr>
-      <w:t xml:space="preserve"> </w:t>
-    </w:r>
-    <w:proofErr w:type="spellStart"/>
-    <w:r>
-      <w:rPr>
-        <w:color w:val="888888"/>
-        <w:sz w:val="16"/>
-        <w:szCs w:val="16"/>
-      </w:rPr>
-      <w:t>rahasia</w:t>
-    </w:r>
-    <w:proofErr w:type="spellEnd"/>
-    <w:r>
-      <w:rPr>
-        <w:color w:val="888888"/>
-        <w:sz w:val="16"/>
-        <w:szCs w:val="16"/>
-      </w:rPr>
-      <w:t>.</w:t>
+      <w:t>© 2025 PT. Maju Bersama Indonesia. Dokumen ini bersifat rahasia.</w:t>
     </w:r>
     <w:r>
       <w:rPr>
@@ -7966,24 +6747,7 @@
         <w:szCs w:val="16"/>
       </w:rPr>
       <w:tab/>
-    </w:r>
-    <w:proofErr w:type="spellStart"/>
-    <w:r>
-      <w:rPr>
-        <w:color w:val="888888"/>
-        <w:sz w:val="16"/>
-        <w:szCs w:val="16"/>
-      </w:rPr>
-      <w:t>Halaman</w:t>
-    </w:r>
-    <w:proofErr w:type="spellEnd"/>
-    <w:r>
-      <w:rPr>
-        <w:color w:val="888888"/>
-        <w:sz w:val="16"/>
-        <w:szCs w:val="16"/>
-      </w:rPr>
-      <w:t xml:space="preserve"> </w:t>
+      <w:t xml:space="preserve">Halaman </w:t>
     </w:r>
     <w:r>
       <w:rPr>
@@ -8074,54 +6838,8 @@
         <w:sz w:val="18"/>
         <w:szCs w:val="18"/>
       </w:rPr>
-      <w:t xml:space="preserve">   |   </w:t>
+      <w:t xml:space="preserve">   |   Dokumen Data Karyawan   |   Konfidensial</w:t>
     </w:r>
-    <w:proofErr w:type="spellStart"/>
-    <w:r>
-      <w:rPr>
-        <w:color w:val="888888"/>
-        <w:sz w:val="18"/>
-        <w:szCs w:val="18"/>
-      </w:rPr>
-      <w:t>Dokumen</w:t>
-    </w:r>
-    <w:proofErr w:type="spellEnd"/>
-    <w:r>
-      <w:rPr>
-        <w:color w:val="888888"/>
-        <w:sz w:val="18"/>
-        <w:szCs w:val="18"/>
-      </w:rPr>
-      <w:t xml:space="preserve"> Data </w:t>
-    </w:r>
-    <w:proofErr w:type="spellStart"/>
-    <w:r>
-      <w:rPr>
-        <w:color w:val="888888"/>
-        <w:sz w:val="18"/>
-        <w:szCs w:val="18"/>
-      </w:rPr>
-      <w:t>Karyawan</w:t>
-    </w:r>
-    <w:proofErr w:type="spellEnd"/>
-    <w:r>
-      <w:rPr>
-        <w:color w:val="888888"/>
-        <w:sz w:val="18"/>
-        <w:szCs w:val="18"/>
-      </w:rPr>
-      <w:t xml:space="preserve">   |   </w:t>
-    </w:r>
-    <w:proofErr w:type="spellStart"/>
-    <w:r>
-      <w:rPr>
-        <w:color w:val="888888"/>
-        <w:sz w:val="18"/>
-        <w:szCs w:val="18"/>
-      </w:rPr>
-      <w:t>Konfidensial</w:t>
-    </w:r>
-    <w:proofErr w:type="spellEnd"/>
   </w:p>
 </w:hdr>
 </file>
@@ -9136,7 +7854,7 @@
 </file>
 
 <file path=customXml/itemProps1.xml><?xml version="1.0" encoding="utf-8"?>
-<ds:datastoreItem xmlns:ds="http://schemas.openxmlformats.org/officeDocument/2006/customXml" ds:itemID="{CA3A1D98-DE36-4D03-A09F-C92510F49539}">
+<ds:datastoreItem xmlns:ds="http://schemas.openxmlformats.org/officeDocument/2006/customXml" ds:itemID="{F22E0B72-782E-497E-AE0D-F1D068B7B628}">
   <ds:schemaRefs>
     <ds:schemaRef ds:uri="http://schemas.openxmlformats.org/officeDocument/2006/bibliography"/>
   </ds:schemaRefs>

</xml_diff>